<commit_message>
Add the peer football field to the valuation section as Figure 33
Column-size version of the team's valuation summary (value implied by each peer's multiple vs DCF,
target and price), placed under the comparable multiples block, Spanish and English.

Co-Authored-By: Claude Opus 5.5 <noreply@anthropic.com>
Claude-Session: https://claude.ai/code/session_0188QZHBkA8n5QL7BtmFakQg
</commit_message>
<xml_diff>
--- a/informe/Mallplaza_Valuacion_EN.docx
+++ b/informe/Mallplaza_Valuacion_EN.docx
@@ -850,6 +850,90 @@
                 <w:szCs w:val="11"/>
               </w:rPr>
               <w:t xml:space="preserve">Source: Team analysis.</w:t>
+            </w:r>
+          </w:p>
+          <w:p>
+            <w:pPr>
+              <w:spacing w:after="30" w:before="120" w:line="228" w:lineRule="auto"/>
+            </w:pPr>
+            <w:r>
+              <w:rPr>
+                <w:rFonts w:ascii="Arial" w:cs="Arial" w:eastAsia="Arial" w:hAnsi="Arial"/>
+                <w:b/>
+                <w:bCs/>
+                <w:color w:val="14284B"/>
+                <w:sz w:val="14"/>
+                <w:szCs w:val="14"/>
+              </w:rPr>
+              <w:t xml:space="preserve">Figure 33: </w:t>
+            </w:r>
+            <w:r>
+              <w:rPr>
+                <w:rFonts w:ascii="Arial" w:cs="Arial" w:eastAsia="Arial" w:hAnsi="Arial"/>
+                <w:color w:val="14284B"/>
+                <w:sz w:val="14"/>
+                <w:szCs w:val="14"/>
+              </w:rPr>
+              <w:t xml:space="preserve">Value implied by each peer's multiple vs DCF and price (CLP per share)</w:t>
+            </w:r>
+          </w:p>
+          <w:p>
+            <w:pPr>
+              <w:spacing w:after="20" w:before="0"/>
+            </w:pPr>
+            <w:r>
+              <w:drawing>
+                <wp:inline distT="0" distB="0" distL="0" distR="0">
+                  <wp:extent cx="2257425" cy="1962150"/>
+                  <wp:effectExtent t="0" r="0" b="0" l="0"/>
+                  <wp:docPr id="1" name="" descr="" title=""/>
+                  <wp:cNvGraphicFramePr>
+                    <a:graphicFrameLocks xmlns:a="http://schemas.openxmlformats.org/drawingml/2006/main" noChangeAspect="1"/>
+                  </wp:cNvGraphicFramePr>
+                  <a:graphic xmlns:a="http://schemas.openxmlformats.org/drawingml/2006/main">
+                    <a:graphicData uri="http://schemas.openxmlformats.org/drawingml/2006/picture">
+                      <pic:pic xmlns:pic="http://schemas.openxmlformats.org/drawingml/2006/picture">
+                        <pic:nvPicPr>
+                          <pic:cNvPr id="0" name="" descr=""/>
+                          <pic:cNvPicPr>
+                            <a:picLocks noChangeAspect="1" noChangeArrowheads="1"/>
+                          </pic:cNvPicPr>
+                        </pic:nvPicPr>
+                        <pic:blipFill>
+                          <a:blip r:embed="rId17" cstate="none"/>
+                          <a:srcRect/>
+                          <a:stretch>
+                            <a:fillRect/>
+                          </a:stretch>
+                        </pic:blipFill>
+                        <pic:spPr bwMode="auto">
+                          <a:xfrm>
+                            <a:off x="0" y="0"/>
+                            <a:ext cx="2257425" cy="1962150"/>
+                          </a:xfrm>
+                          <a:prstGeom prst="rect">
+                            <a:avLst/>
+                          </a:prstGeom>
+                        </pic:spPr>
+                      </pic:pic>
+                    </a:graphicData>
+                  </a:graphic>
+                </wp:inline>
+              </w:drawing>
+            </w:r>
+          </w:p>
+          <w:p>
+            <w:pPr>
+              <w:spacing w:after="0" w:before="10" w:line="216" w:lineRule="auto"/>
+            </w:pPr>
+            <w:r>
+              <w:rPr>
+                <w:rFonts w:ascii="Arial" w:cs="Arial" w:eastAsia="Arial" w:hAnsi="Arial"/>
+                <w:color w:val="5F5F5F"/>
+                <w:sz w:val="11"/>
+                <w:szCs w:val="11"/>
+              </w:rPr>
+              <w:t xml:space="preserve">Target = 80% DCF + 20% EV/EBITDA LTM. P/E excluded (includes property revaluation). Peer set = companies with a WACC beta. Source: Bloomberg (prices at 30-Sep-26); Team analysis.</w:t>
             </w:r>
           </w:p>
         </w:tc>
@@ -8268,7 +8352,7 @@
                           </pic:cNvPicPr>
                         </pic:nvPicPr>
                         <pic:blipFill>
-                          <a:blip r:embed="rId17" cstate="none"/>
+                          <a:blip r:embed="rId18" cstate="none"/>
                           <a:srcRect/>
                           <a:stretch>
                             <a:fillRect/>

</xml_diff>

<commit_message>
Merge the team's valuation draft into the Valuation section with figure citations, synced to model v2
Co-Authored-By: Claude Opus 5.5 <noreply@anthropic.com>
Claude-Session: https://claude.ai/code/session_0188QZHBkA8n5QL7BtmFakQg
</commit_message>
<xml_diff>
--- a/informe/Mallplaza_Valuacion_EN.docx
+++ b/informe/Mallplaza_Valuacion_EN.docx
@@ -21,6 +21,22 @@
         <w:t xml:space="preserve">VALUATION</w:t>
       </w:r>
     </w:p>
+    <w:p>
+      <w:pPr>
+        <w:shd w:fill="EEF1F6" w:color="auto" w:val="clear"/>
+        <w:spacing w:after="80" w:line="228" w:lineRule="auto"/>
+        <w:jc w:val="both"/>
+      </w:pPr>
+      <w:r>
+        <w:rPr>
+          <w:rFonts w:ascii="Arial" w:cs="Arial" w:eastAsia="Arial" w:hAnsi="Arial"/>
+          <w:color w:val="1A1A1A"/>
+          <w:sz w:val="16"/>
+          <w:szCs w:val="16"/>
+        </w:rPr>
+        <w:t xml:space="preserve">We recommend SELL on Mallplaza with a target price of CLP 2,076 per share (80% DCF and 20% multiples), 41.6% below the CLP 3,555 close of 30-Sep-26. No method justifies the current price (Figure 27).</w:t>
+      </w:r>
+    </w:p>
     <w:tbl>
       <w:tblPr>
         <w:tblW w:type="dxa" w:w="10666"/>
@@ -75,20 +91,45 @@
                 <w:sz w:val="16"/>
                 <w:szCs w:val="16"/>
               </w:rPr>
-              <w:t xml:space="preserve">SUMMARY AND METHOD</w:t>
-            </w:r>
-          </w:p>
-          <w:p>
-            <w:pPr>
-              <w:spacing w:after="3913" w:before="0"/>
-            </w:pPr>
+              <w:t xml:space="preserve">SUMMARY AND WEIGHTING</w:t>
+            </w:r>
+          </w:p>
+          <w:p>
+            <w:pPr>
+              <w:spacing w:after="60" w:before="0" w:line="228" w:lineRule="auto"/>
+              <w:jc w:val="both"/>
+            </w:pPr>
+            <w:r>
+              <w:rPr>
+                <w:rFonts w:ascii="Arial" w:cs="Arial" w:eastAsia="Arial" w:hAnsi="Arial"/>
+                <w:color w:val="1A1A1A"/>
+                <w:sz w:val="16"/>
+                <w:szCs w:val="16"/>
+              </w:rPr>
+              <w:t xml:space="preserve">We give the DCF an 80% weight because Mallplaza runs retail infrastructure with highly predictable cash flows: 81.4% of LTM revenue is rent, and 93% of that is fixed rent (~76% of total revenue). The DCF best captures the intrinsic value of the business and its expansion plan.</w:t>
+            </w:r>
+          </w:p>
+          <w:p>
+            <w:pPr>
+              <w:spacing w:after="60" w:before="0" w:line="228" w:lineRule="auto"/>
+              <w:jc w:val="both"/>
+            </w:pPr>
+            <w:r>
+              <w:rPr>
+                <w:rFonts w:ascii="Arial" w:cs="Arial" w:eastAsia="Arial" w:hAnsi="Arial"/>
+                <w:color w:val="1A1A1A"/>
+                <w:sz w:val="16"/>
+                <w:szCs w:val="16"/>
+              </w:rPr>
+              <w:t xml:space="preserve">Multiples (20%) test the model against what the market pays for the industry today. We cap their weight for two reasons: (i) Chile has only two direct, liquid peers (Parque Arauco and Cencosud Shopping), which gives little statistical depth; and (ii) multiples reflect current sentiment but not Mallplaza's GLA expansion or financing path, which the DCF does capture.</w:t>
+            </w:r>
           </w:p>
           <w:p>
             <w:pPr>
               <w:pBdr>
                 <w:bottom w:val="single" w:color="E9004B" w:sz="8" w:space="1"/>
               </w:pBdr>
-              <w:spacing w:after="50" w:before="0"/>
+              <w:spacing w:after="50" w:before="90"/>
             </w:pPr>
             <w:r>
               <w:rPr>
@@ -99,20 +140,45 @@
                 <w:sz w:val="16"/>
                 <w:szCs w:val="16"/>
               </w:rPr>
-              <w:t xml:space="preserve">DCF: DISCOUNT RATE</w:t>
-            </w:r>
-          </w:p>
-          <w:p>
-            <w:pPr>
-              <w:spacing w:after="3913" w:before="0"/>
-            </w:pPr>
+              <w:t xml:space="preserve">DCF: MODEL STRUCTURE</w:t>
+            </w:r>
+          </w:p>
+          <w:p>
+            <w:pPr>
+              <w:spacing w:after="60" w:before="0" w:line="228" w:lineRule="auto"/>
+              <w:jc w:val="both"/>
+            </w:pPr>
+            <w:r>
+              <w:rPr>
+                <w:rFonts w:ascii="Arial" w:cs="Arial" w:eastAsia="Arial" w:hAnsi="Arial"/>
+                <w:color w:val="1A1A1A"/>
+                <w:sz w:val="16"/>
+                <w:szCs w:val="16"/>
+              </w:rPr>
+              <w:t xml:space="preserve">We value a two-stage free cash flow to the firm (FCFF) in nominal CLP, with a 30-Jun-26 valuation date and the mid-year convention. The explicit stage (2H26E–2031E) captures the near-term investment plan and the GLA expansion; the terminal stage (from 2032) is a Gordon perpetuity that accounts for 76% of enterprise value, consistent with long-lived assets (Appendix [B]).</w:t>
+            </w:r>
+          </w:p>
+          <w:p>
+            <w:pPr>
+              <w:spacing w:after="60" w:before="0" w:line="228" w:lineRule="auto"/>
+              <w:jc w:val="both"/>
+            </w:pPr>
+            <w:r>
+              <w:rPr>
+                <w:rFonts w:ascii="Arial" w:cs="Arial" w:eastAsia="Arial" w:hAnsi="Arial"/>
+                <w:color w:val="1A1A1A"/>
+                <w:sz w:val="16"/>
+                <w:szCs w:val="16"/>
+              </w:rPr>
+              <w:t xml:space="preserve">The explicit horizon includes the capex and revenue ramp-up of projects opening through 2032, adding 108,301 m² of mature GLA in the terminal year. That growth is funded with operating cash flow and more debt: net debt/EBITDA rises from 2.36x to 3.5x by 2031. From 2032 the model adds no net GLA and terminal capex covers maintenance only (5.5% of revenue), because expanding at a return below the real WACC would destroy value (see Terminal value).</w:t>
+            </w:r>
           </w:p>
           <w:p>
             <w:pPr>
               <w:pBdr>
                 <w:bottom w:val="single" w:color="E9004B" w:sz="8" w:space="1"/>
               </w:pBdr>
-              <w:spacing w:after="50" w:before="0"/>
+              <w:spacing w:after="50" w:before="90"/>
             </w:pPr>
             <w:r>
               <w:rPr>
@@ -123,13 +189,101 @@
                 <w:sz w:val="16"/>
                 <w:szCs w:val="16"/>
               </w:rPr>
-              <w:t xml:space="preserve">DCF: TERMINAL GROWTH</w:t>
-            </w:r>
-          </w:p>
-          <w:p>
-            <w:pPr>
-              <w:spacing w:after="3913" w:before="0"/>
-            </w:pPr>
+              <w:t xml:space="preserve">DCF: DISCOUNT RATE (WACC)</w:t>
+            </w:r>
+          </w:p>
+          <w:p>
+            <w:pPr>
+              <w:spacing w:after="60" w:before="0" w:line="228" w:lineRule="auto"/>
+              <w:jc w:val="both"/>
+            </w:pPr>
+            <w:r>
+              <w:rPr>
+                <w:rFonts w:ascii="Arial" w:cs="Arial" w:eastAsia="Arial" w:hAnsi="Arial"/>
+                <w:color w:val="1A1A1A"/>
+                <w:sz w:val="16"/>
+                <w:szCs w:val="16"/>
+              </w:rPr>
+              <w:t xml:space="preserve">The nominal CLP WACC changes by period as the capital structure converges to its target: 10.54% in 2H26E and 10.41% in the terminal period (7.32% and 7.20% in real terms). It follows a country-risk-adjusted CAPM (Damodaran approach); details are in Appendix [Z].</w:t>
+            </w:r>
+          </w:p>
+          <w:p>
+            <w:pPr>
+              <w:spacing w:after="60" w:before="0" w:line="228" w:lineRule="auto"/>
+              <w:jc w:val="both"/>
+            </w:pPr>
+            <w:r>
+              <w:rPr>
+                <w:rFonts w:ascii="Arial" w:cs="Arial" w:eastAsia="Arial" w:hAnsi="Arial"/>
+                <w:b/>
+                <w:bCs/>
+                <w:color w:val="14284B"/>
+                <w:sz w:val="16"/>
+                <w:szCs w:val="16"/>
+              </w:rPr>
+              <w:t xml:space="preserve">Cost of equity (Ke). </w:t>
+            </w:r>
+            <w:r>
+              <w:rPr>
+                <w:rFonts w:ascii="Arial" w:cs="Arial" w:eastAsia="Arial" w:hAnsi="Arial"/>
+                <w:color w:val="1A1A1A"/>
+                <w:sz w:val="16"/>
+                <w:szCs w:val="16"/>
+              </w:rPr>
+              <w:t xml:space="preserve">Since Rf, ERP and CRP are in dollars, Ke is first computed in USD: Rf 4.98% (10-year US Treasury) + beta 1.14 × ERP 4.14% (Damodaran implied premium) + CRP 1.41% = 11.10% in the terminal period. The beta comes from unlevering six regional peers with Hamada (median 0.94) and relevering it with Mallplaza's structure: 1.09 in 2H26E and 1.14 in the terminal period. The CRP weights sovereign risk by revenue (71.8% Chile, 17.7% Peru and 10.5% Colombia). USD Ke is converted to CLP with the expected inflation differential: 11.70% in 2H26E and 11.93% in the terminal period.</w:t>
+            </w:r>
+          </w:p>
+          <w:p>
+            <w:pPr>
+              <w:spacing w:after="60" w:before="0" w:line="228" w:lineRule="auto"/>
+              <w:jc w:val="both"/>
+            </w:pPr>
+            <w:r>
+              <w:rPr>
+                <w:rFonts w:ascii="Arial" w:cs="Arial" w:eastAsia="Arial" w:hAnsi="Arial"/>
+                <w:b/>
+                <w:bCs/>
+                <w:color w:val="14284B"/>
+                <w:sz w:val="16"/>
+                <w:szCs w:val="16"/>
+              </w:rPr>
+              <w:t xml:space="preserve">Cost of debt (Kd). </w:t>
+            </w:r>
+            <w:r>
+              <w:rPr>
+                <w:rFonts w:ascii="Arial" w:cs="Arial" w:eastAsia="Arial" w:hAnsi="Arial"/>
+                <w:color w:val="1A1A1A"/>
+                <w:sz w:val="16"/>
+                <w:szCs w:val="16"/>
+              </w:rPr>
+              <w:t xml:space="preserve">It starts from the coupon of the latest UF bond issue (3.6% real), converted to nominal with the Central Bank's 3.0% inflation target, plus 25 bp for each turn of net debt/EBITDA above 2.36x (team assumption). After tax (27%), it rises from 4.92% in 2H26E to 5.11% in the terminal period. At CLP 3,555, equity yields almost the same as this debt (Figure 28).</w:t>
+            </w:r>
+          </w:p>
+          <w:p>
+            <w:pPr>
+              <w:spacing w:after="60" w:before="0" w:line="228" w:lineRule="auto"/>
+              <w:jc w:val="both"/>
+            </w:pPr>
+            <w:r>
+              <w:rPr>
+                <w:rFonts w:ascii="Arial" w:cs="Arial" w:eastAsia="Arial" w:hAnsi="Arial"/>
+                <w:b/>
+                <w:bCs/>
+                <w:color w:val="14284B"/>
+                <w:sz w:val="16"/>
+                <w:szCs w:val="16"/>
+              </w:rPr>
+              <w:t xml:space="preserve">Capital structure. </w:t>
+            </w:r>
+            <w:r>
+              <w:rPr>
+                <w:rFonts w:ascii="Arial" w:cs="Arial" w:eastAsia="Arial" w:hAnsi="Arial"/>
+                <w:color w:val="1A1A1A"/>
+                <w:sz w:val="16"/>
+                <w:szCs w:val="16"/>
+              </w:rPr>
+              <w:t xml:space="preserve">The long-term target is 3.5x net debt/EBITDA, reached linearly from 2.36x by 2031: the company uses its debt capacity to grow, as in 2024 (3.78x after the Open Plaza Peru acquisition). At market value this means 77.8% equity and 22.2% debt (D/E 28.5%), which is why the WACC moves over time. Cash not absorbed by investment is returned to shareholders as an additional distribution (CLP 1.79 trillion cumulative to 2031): it does not enter the EV, but it makes the debt assumed in the WACC exist in the plan (Appendix [D]).</w:t>
+            </w:r>
           </w:p>
         </w:tc>
         <w:tc>
@@ -336,90 +490,6 @@
               <w:t xml:space="preserve">Real rates in UF. Source: Central Bank of Chile (30-Jun-26); Mallplaza; Team analysis.</w:t>
             </w:r>
           </w:p>
-          <w:p>
-            <w:pPr>
-              <w:spacing w:after="30" w:before="120" w:line="228" w:lineRule="auto"/>
-            </w:pPr>
-            <w:r>
-              <w:rPr>
-                <w:rFonts w:ascii="Arial" w:cs="Arial" w:eastAsia="Arial" w:hAnsi="Arial"/>
-                <w:b/>
-                <w:bCs/>
-                <w:color w:val="14284B"/>
-                <w:sz w:val="14"/>
-                <w:szCs w:val="14"/>
-              </w:rPr>
-              <w:t xml:space="preserve">Figure 29: </w:t>
-            </w:r>
-            <w:r>
-              <w:rPr>
-                <w:rFonts w:ascii="Arial" w:cs="Arial" w:eastAsia="Arial" w:hAnsi="Arial"/>
-                <w:color w:val="14284B"/>
-                <w:sz w:val="14"/>
-                <w:szCs w:val="14"/>
-              </w:rPr>
-              <w:t xml:space="preserve">Growing below the WACC destroys value: real g = 0%</w:t>
-            </w:r>
-          </w:p>
-          <w:p>
-            <w:pPr>
-              <w:spacing w:after="20" w:before="0"/>
-            </w:pPr>
-            <w:r>
-              <w:drawing>
-                <wp:inline distT="0" distB="0" distL="0" distR="0">
-                  <wp:extent cx="2257425" cy="2152650"/>
-                  <wp:effectExtent t="0" r="0" b="0" l="0"/>
-                  <wp:docPr id="1" name="" descr="" title=""/>
-                  <wp:cNvGraphicFramePr>
-                    <a:graphicFrameLocks xmlns:a="http://schemas.openxmlformats.org/drawingml/2006/main" noChangeAspect="1"/>
-                  </wp:cNvGraphicFramePr>
-                  <a:graphic xmlns:a="http://schemas.openxmlformats.org/drawingml/2006/main">
-                    <a:graphicData uri="http://schemas.openxmlformats.org/drawingml/2006/picture">
-                      <pic:pic xmlns:pic="http://schemas.openxmlformats.org/drawingml/2006/picture">
-                        <pic:nvPicPr>
-                          <pic:cNvPr id="0" name="" descr=""/>
-                          <pic:cNvPicPr>
-                            <a:picLocks noChangeAspect="1" noChangeArrowheads="1"/>
-                          </pic:cNvPicPr>
-                        </pic:nvPicPr>
-                        <pic:blipFill>
-                          <a:blip r:embed="rId13" cstate="none"/>
-                          <a:srcRect/>
-                          <a:stretch>
-                            <a:fillRect/>
-                          </a:stretch>
-                        </pic:blipFill>
-                        <pic:spPr bwMode="auto">
-                          <a:xfrm>
-                            <a:off x="0" y="0"/>
-                            <a:ext cx="2257425" cy="2152650"/>
-                          </a:xfrm>
-                          <a:prstGeom prst="rect">
-                            <a:avLst/>
-                          </a:prstGeom>
-                        </pic:spPr>
-                      </pic:pic>
-                    </a:graphicData>
-                  </a:graphic>
-                </wp:inline>
-              </w:drawing>
-            </w:r>
-          </w:p>
-          <w:p>
-            <w:pPr>
-              <w:spacing w:after="0" w:before="10" w:line="216" w:lineRule="auto"/>
-            </w:pPr>
-            <w:r>
-              <w:rPr>
-                <w:rFonts w:ascii="Arial" w:cs="Arial" w:eastAsia="Arial" w:hAnsi="Arial"/>
-                <w:color w:val="5F5F5F"/>
-                <w:sz w:val="11"/>
-                <w:szCs w:val="11"/>
-              </w:rPr>
-              <w:t xml:space="preserve">Top: DCF value by g. Bottom: relative terminal value by RONIC. Source: Team analysis.</w:t>
-            </w:r>
-          </w:p>
         </w:tc>
       </w:tr>
     </w:tbl>
@@ -483,20 +553,13 @@
                 <w:sz w:val="16"/>
                 <w:szCs w:val="16"/>
               </w:rPr>
-              <w:t xml:space="preserve">DCF: WORKING CAPITAL</w:t>
-            </w:r>
-          </w:p>
-          <w:p>
-            <w:pPr>
-              <w:spacing w:after="3055" w:before="0"/>
-            </w:pPr>
-          </w:p>
-          <w:p>
-            <w:pPr>
-              <w:pBdr>
-                <w:bottom w:val="single" w:color="E9004B" w:sz="8" w:space="1"/>
-              </w:pBdr>
-              <w:spacing w:after="50" w:before="0"/>
+              <w:t xml:space="preserve">DCF: OPERATING FORECAST AND FCFF</w:t>
+            </w:r>
+          </w:p>
+          <w:p>
+            <w:pPr>
+              <w:spacing w:after="60" w:before="0" w:line="228" w:lineRule="auto"/>
+              <w:jc w:val="both"/>
             </w:pPr>
             <w:r>
               <w:rPr>
@@ -507,20 +570,22 @@
                 <w:sz w:val="16"/>
                 <w:szCs w:val="16"/>
               </w:rPr>
-              <w:t xml:space="preserve">DCF VALIDATION</w:t>
-            </w:r>
-          </w:p>
-          <w:p>
-            <w:pPr>
-              <w:spacing w:after="3055" w:before="0"/>
-            </w:pPr>
-          </w:p>
-          <w:p>
-            <w:pPr>
-              <w:pBdr>
-                <w:bottom w:val="single" w:color="E9004B" w:sz="8" w:space="1"/>
-              </w:pBdr>
-              <w:spacing w:after="50" w:before="0"/>
+              <w:t xml:space="preserve">EBITDA excluding revaluation. </w:t>
+            </w:r>
+            <w:r>
+              <w:rPr>
+                <w:rFonts w:ascii="Arial" w:cs="Arial" w:eastAsia="Arial" w:hAnsi="Arial"/>
+                <w:color w:val="1A1A1A"/>
+                <w:sz w:val="16"/>
+                <w:szCs w:val="16"/>
+              </w:rPr>
+              <w:t xml:space="preserve">Reported EBITDA (CLP 544,935 million LTM, 80.5% margin) excludes unrealised gains from investment property revaluation (IAS 40). We forecast a 79.8% margin in 2026E, ~70 bp below LTM, held at that level through 2031E (Appendix [C]).</w:t>
+            </w:r>
+          </w:p>
+          <w:p>
+            <w:pPr>
+              <w:spacing w:after="60" w:before="0" w:line="228" w:lineRule="auto"/>
+              <w:jc w:val="both"/>
             </w:pPr>
             <w:r>
               <w:rPr>
@@ -531,20 +596,22 @@
                 <w:sz w:val="16"/>
                 <w:szCs w:val="16"/>
               </w:rPr>
-              <w:t xml:space="preserve">COMPARABLE MULTIPLES (20%)</w:t>
-            </w:r>
-          </w:p>
-          <w:p>
-            <w:pPr>
-              <w:spacing w:after="3055" w:before="0"/>
-            </w:pPr>
-          </w:p>
-          <w:p>
-            <w:pPr>
-              <w:pBdr>
-                <w:bottom w:val="single" w:color="E9004B" w:sz="8" w:space="1"/>
-              </w:pBdr>
-              <w:spacing w:after="50" w:before="0"/>
+              <w:t xml:space="preserve">Operating tax. </w:t>
+            </w:r>
+            <w:r>
+              <w:rPr>
+                <w:rFonts w:ascii="Arial" w:cs="Arial" w:eastAsia="Arial" w:hAnsi="Arial"/>
+                <w:color w:val="1A1A1A"/>
+                <w:sz w:val="16"/>
+                <w:szCs w:val="16"/>
+              </w:rPr>
+              <w:t xml:space="preserve">The effective rate on EBIT starts at 16.8% in 2026E (current tax over EBITDA less financial cost, which includes existing tax benefits) and converges to the 27% corporate rate in 2030E: 16.8% → 19.0% → 21.5% → 24.0% → 27.0%. We assume those benefits fade so as not to overstate value.</w:t>
+            </w:r>
+          </w:p>
+          <w:p>
+            <w:pPr>
+              <w:spacing w:after="60" w:before="0" w:line="228" w:lineRule="auto"/>
+              <w:jc w:val="both"/>
             </w:pPr>
             <w:r>
               <w:rPr>
@@ -555,13 +622,114 @@
                 <w:sz w:val="16"/>
                 <w:szCs w:val="16"/>
               </w:rPr>
-              <w:t xml:space="preserve">VALUATION SENSITIVITY AND RISK</w:t>
-            </w:r>
-          </w:p>
-          <w:p>
-            <w:pPr>
-              <w:spacing w:after="3055" w:before="0"/>
-            </w:pPr>
+              <w:t xml:space="preserve">Capex. </w:t>
+            </w:r>
+            <w:r>
+              <w:rPr>
+                <w:rFonts w:ascii="Arial" w:cs="Arial" w:eastAsia="Arial" w:hAnsi="Arial"/>
+                <w:color w:val="1A1A1A"/>
+                <w:sz w:val="16"/>
+                <w:szCs w:val="16"/>
+              </w:rPr>
+              <w:t xml:space="preserve">Base capex (announced pipeline plus maintenance and IT at 5.5% of revenue) peaks at CLP 240,660 million in 2027 and settles at CLP 48,000–52,000 million a year from 2029. Expansion capex totals CLP 46,268 million in 2027 and CLP 95,000–104,000 million a year in 2028–2031: from 2029, 27,075 m² open each year (average organic GLA added in 2022, 2023 and 2025), with capex in the two prior years, a 35%/90%/100% revenue ramp and a 6.9% yield on cost. The cost per m² (USD 3,603) comes from the identified pipeline: 170,200 m² and USD 613.2 million (2Q26 Release, p. 13).</w:t>
+            </w:r>
+          </w:p>
+          <w:p>
+            <w:pPr>
+              <w:spacing w:after="60" w:before="0" w:line="228" w:lineRule="auto"/>
+              <w:jc w:val="both"/>
+            </w:pPr>
+            <w:r>
+              <w:rPr>
+                <w:rFonts w:ascii="Arial" w:cs="Arial" w:eastAsia="Arial" w:hAnsi="Arial"/>
+                <w:b/>
+                <w:bCs/>
+                <w:color w:val="14284B"/>
+                <w:sz w:val="16"/>
+                <w:szCs w:val="16"/>
+              </w:rPr>
+              <w:t xml:space="preserve">Working capital. </w:t>
+            </w:r>
+            <w:r>
+              <w:rPr>
+                <w:rFonts w:ascii="Arial" w:cs="Arial" w:eastAsia="Arial" w:hAnsi="Arial"/>
+                <w:color w:val="1A1A1A"/>
+                <w:sz w:val="16"/>
+                <w:szCs w:val="16"/>
+              </w:rPr>
+              <w:t xml:space="preserve">Mallplaza has positive net working capital (CLP 102,039 million, 15.6% of revenue at Dec-25), because tenant receivables (CLP 122,370 million) exceed rents collected in advance (CLP 20,247 million). Incremental investment (15.6% × Δ revenue) is small and predictable: CLP 7,100–9,900 million a year, 0.7%–1.3% of revenue. Changing this assumption moves the price by ±1.2% (Figure 29).</w:t>
+            </w:r>
+          </w:p>
+          <w:p>
+            <w:pPr>
+              <w:pBdr>
+                <w:bottom w:val="single" w:color="E9004B" w:sz="8" w:space="1"/>
+              </w:pBdr>
+              <w:spacing w:after="50" w:before="90"/>
+            </w:pPr>
+            <w:r>
+              <w:rPr>
+                <w:rFonts w:ascii="Arial" w:cs="Arial" w:eastAsia="Arial" w:hAnsi="Arial"/>
+                <w:b/>
+                <w:bCs/>
+                <w:color w:val="14284B"/>
+                <w:sz w:val="16"/>
+                <w:szCs w:val="16"/>
+              </w:rPr>
+              <w:t xml:space="preserve">DCF: TERMINAL VALUE AND IMPLIED CAP RATE</w:t>
+            </w:r>
+          </w:p>
+          <w:p>
+            <w:pPr>
+              <w:spacing w:after="60" w:before="0" w:line="228" w:lineRule="auto"/>
+              <w:jc w:val="both"/>
+            </w:pPr>
+            <w:r>
+              <w:rPr>
+                <w:rFonts w:ascii="Arial" w:cs="Arial" w:eastAsia="Arial" w:hAnsi="Arial"/>
+                <w:b/>
+                <w:bCs/>
+                <w:color w:val="14284B"/>
+                <w:sz w:val="16"/>
+                <w:szCs w:val="16"/>
+              </w:rPr>
+              <w:t xml:space="preserve">Terminal growth. </w:t>
+            </w:r>
+            <w:r>
+              <w:rPr>
+                <w:rFonts w:ascii="Arial" w:cs="Arial" w:eastAsia="Arial" w:hAnsi="Arial"/>
+                <w:color w:val="1A1A1A"/>
+                <w:sz w:val="16"/>
+                <w:szCs w:val="16"/>
+              </w:rPr>
+              <w:t xml:space="preserve">We use g = 3.0% nominal (0% real), equal to the Central Bank's inflation target. The value driver supports it: the real RONIC on expansion (5.0%) is below the real WACC (7.2%), so expanding beyond the horizon would destroy value and a higher g lowers value (Figure 30). Terminal reinvestment is therefore zero and rents grow only with inflation.</w:t>
+            </w:r>
+          </w:p>
+          <w:p>
+            <w:pPr>
+              <w:spacing w:after="60" w:before="0" w:line="228" w:lineRule="auto"/>
+              <w:jc w:val="both"/>
+            </w:pPr>
+            <w:r>
+              <w:rPr>
+                <w:rFonts w:ascii="Arial" w:cs="Arial" w:eastAsia="Arial" w:hAnsi="Arial"/>
+                <w:b/>
+                <w:bCs/>
+                <w:color w:val="14284B"/>
+                <w:sz w:val="16"/>
+                <w:szCs w:val="16"/>
+              </w:rPr>
+              <w:t xml:space="preserve">Implied cap rate. </w:t>
+            </w:r>
+            <w:r>
+              <w:rPr>
+                <w:rFonts w:ascii="Arial" w:cs="Arial" w:eastAsia="Arial" w:hAnsi="Arial"/>
+                <w:color w:val="1A1A1A"/>
+                <w:sz w:val="16"/>
+                <w:szCs w:val="16"/>
+              </w:rPr>
+              <w:t xml:space="preserve">The DCF implies a real cap rate of 10.1% on enterprise value and 11.3% on terminal value, well above the market's (6.0%), Chilean peers' (6.4%), the book cap rate (7.5%) and the real rate used by independent appraisers in Note 11 of the financial statements (5.55%, mid-point of the range) (Figure 31). This gap is not an inconsistency to resolve: it is the core of the thesis. Our model asks far more of the cash flows than the market and the appraisers do; to justify the current price, the WACC would have to be 285 bp lower (Figure 32).</w:t>
+            </w:r>
           </w:p>
         </w:tc>
         <w:tc>
@@ -613,7 +781,7 @@
                 <w:sz w:val="14"/>
                 <w:szCs w:val="14"/>
               </w:rPr>
-              <w:t xml:space="preserve">Figure 30: </w:t>
+              <w:t xml:space="preserve">Figure 29: </w:t>
             </w:r>
             <w:r>
               <w:rPr>
@@ -633,6 +801,90 @@
               <w:drawing>
                 <wp:inline distT="0" distB="0" distL="0" distR="0">
                   <wp:extent cx="2257425" cy="2105025"/>
+                  <wp:effectExtent t="0" r="0" b="0" l="0"/>
+                  <wp:docPr id="1" name="" descr="" title=""/>
+                  <wp:cNvGraphicFramePr>
+                    <a:graphicFrameLocks xmlns:a="http://schemas.openxmlformats.org/drawingml/2006/main" noChangeAspect="1"/>
+                  </wp:cNvGraphicFramePr>
+                  <a:graphic xmlns:a="http://schemas.openxmlformats.org/drawingml/2006/main">
+                    <a:graphicData uri="http://schemas.openxmlformats.org/drawingml/2006/picture">
+                      <pic:pic xmlns:pic="http://schemas.openxmlformats.org/drawingml/2006/picture">
+                        <pic:nvPicPr>
+                          <pic:cNvPr id="0" name="" descr=""/>
+                          <pic:cNvPicPr>
+                            <a:picLocks noChangeAspect="1" noChangeArrowheads="1"/>
+                          </pic:cNvPicPr>
+                        </pic:nvPicPr>
+                        <pic:blipFill>
+                          <a:blip r:embed="rId13" cstate="none"/>
+                          <a:srcRect/>
+                          <a:stretch>
+                            <a:fillRect/>
+                          </a:stretch>
+                        </pic:blipFill>
+                        <pic:spPr bwMode="auto">
+                          <a:xfrm>
+                            <a:off x="0" y="0"/>
+                            <a:ext cx="2257425" cy="2105025"/>
+                          </a:xfrm>
+                          <a:prstGeom prst="rect">
+                            <a:avLst/>
+                          </a:prstGeom>
+                        </pic:spPr>
+                      </pic:pic>
+                    </a:graphicData>
+                  </a:graphic>
+                </wp:inline>
+              </w:drawing>
+            </w:r>
+          </w:p>
+          <w:p>
+            <w:pPr>
+              <w:spacing w:after="0" w:before="10" w:line="216" w:lineRule="auto"/>
+            </w:pPr>
+            <w:r>
+              <w:rPr>
+                <w:rFonts w:ascii="Arial" w:cs="Arial" w:eastAsia="Arial" w:hAnsi="Arial"/>
+                <w:color w:val="5F5F5F"/>
+                <w:sz w:val="11"/>
+                <w:szCs w:val="11"/>
+              </w:rPr>
+              <w:t xml:space="preserve">Source: Mallplaza financial statements; Team analysis.</w:t>
+            </w:r>
+          </w:p>
+          <w:p>
+            <w:pPr>
+              <w:spacing w:after="30" w:before="120" w:line="228" w:lineRule="auto"/>
+            </w:pPr>
+            <w:r>
+              <w:rPr>
+                <w:rFonts w:ascii="Arial" w:cs="Arial" w:eastAsia="Arial" w:hAnsi="Arial"/>
+                <w:b/>
+                <w:bCs/>
+                <w:color w:val="14284B"/>
+                <w:sz w:val="14"/>
+                <w:szCs w:val="14"/>
+              </w:rPr>
+              <w:t xml:space="preserve">Figure 30: </w:t>
+            </w:r>
+            <w:r>
+              <w:rPr>
+                <w:rFonts w:ascii="Arial" w:cs="Arial" w:eastAsia="Arial" w:hAnsi="Arial"/>
+                <w:color w:val="14284B"/>
+                <w:sz w:val="14"/>
+                <w:szCs w:val="14"/>
+              </w:rPr>
+              <w:t xml:space="preserve">Growing below the WACC destroys value: real g = 0%</w:t>
+            </w:r>
+          </w:p>
+          <w:p>
+            <w:pPr>
+              <w:spacing w:after="20" w:before="0"/>
+            </w:pPr>
+            <w:r>
+              <w:drawing>
+                <wp:inline distT="0" distB="0" distL="0" distR="0">
+                  <wp:extent cx="2257425" cy="2152650"/>
                   <wp:effectExtent t="0" r="0" b="0" l="0"/>
                   <wp:docPr id="1" name="" descr="" title=""/>
                   <wp:cNvGraphicFramePr>
@@ -657,7 +909,7 @@
                         <pic:spPr bwMode="auto">
                           <a:xfrm>
                             <a:off x="0" y="0"/>
-                            <a:ext cx="2257425" cy="2105025"/>
+                            <a:ext cx="2257425" cy="2152650"/>
                           </a:xfrm>
                           <a:prstGeom prst="rect">
                             <a:avLst/>
@@ -681,7 +933,7 @@
                 <w:sz w:val="11"/>
                 <w:szCs w:val="11"/>
               </w:rPr>
-              <w:t xml:space="preserve">Source: Mallplaza financial statements; Team analysis.</w:t>
+              <w:t xml:space="preserve">Top: DCF value by g. Bottom: relative terminal value by RONIC. Source: Team analysis.</w:t>
             </w:r>
           </w:p>
           <w:p>
@@ -768,9 +1020,343 @@
               <w:t xml:space="preserve">Gran Plaza: subsequent event, not in the model. Source: Mallplaza; Bloomberg; DF; Team analysis.</w:t>
             </w:r>
           </w:p>
-          <w:p>
-            <w:pPr>
-              <w:spacing w:after="30" w:before="120" w:line="228" w:lineRule="auto"/>
+        </w:tc>
+      </w:tr>
+    </w:tbl>
+    <w:p>
+      <w:pPr>
+        <w:pageBreakBefore/>
+        <w:spacing w:after="0"/>
+      </w:pPr>
+    </w:p>
+    <w:tbl>
+      <w:tblPr>
+        <w:tblW w:type="dxa" w:w="10666"/>
+        <w:tblBorders>
+          <w:top w:val="none" w:color="FFFFFF" w:sz="0"/>
+          <w:left w:val="none" w:color="FFFFFF" w:sz="0"/>
+          <w:bottom w:val="none" w:color="FFFFFF" w:sz="0"/>
+          <w:right w:val="none" w:color="FFFFFF" w:sz="0"/>
+          <w:insideH w:val="none" w:color="FFFFFF" w:sz="0"/>
+          <w:insideV w:val="none" w:color="FFFFFF" w:sz="0"/>
+        </w:tblBorders>
+      </w:tblPr>
+      <w:tblGrid>
+        <w:gridCol w:w="6900"/>
+        <w:gridCol w:w="216"/>
+        <w:gridCol w:w="3550"/>
+      </w:tblGrid>
+      <w:tr>
+        <w:trPr>
+          <w:cantSplit/>
+        </w:trPr>
+        <w:tc>
+          <w:tcPr>
+            <w:tcW w:type="dxa" w:w="6900"/>
+            <w:tcBorders>
+              <w:top w:val="none" w:color="FFFFFF" w:sz="0"/>
+              <w:left w:val="none" w:color="FFFFFF" w:sz="0"/>
+              <w:bottom w:val="none" w:color="FFFFFF" w:sz="0"/>
+              <w:right w:val="none" w:color="FFFFFF" w:sz="0"/>
+            </w:tcBorders>
+            <w:tcMar>
+              <w:top w:type="dxa" w:w="0"/>
+              <w:left w:type="dxa" w:w="0"/>
+              <w:bottom w:type="dxa" w:w="0"/>
+              <w:right w:type="dxa" w:w="0"/>
+            </w:tcMar>
+            <w:vAlign w:val="top"/>
+          </w:tcPr>
+          <w:p>
+            <w:pPr>
+              <w:pBdr>
+                <w:bottom w:val="single" w:color="E9004B" w:sz="8" w:space="1"/>
+              </w:pBdr>
+              <w:spacing w:after="50" w:before="20"/>
+            </w:pPr>
+            <w:r>
+              <w:rPr>
+                <w:rFonts w:ascii="Arial" w:cs="Arial" w:eastAsia="Arial" w:hAnsi="Arial"/>
+                <w:b/>
+                <w:bCs/>
+                <w:color w:val="14284B"/>
+                <w:sz w:val="16"/>
+                <w:szCs w:val="16"/>
+              </w:rPr>
+              <w:t xml:space="preserve">RELATIVE VALUATION: MULTIPLES (20%)</w:t>
+            </w:r>
+          </w:p>
+          <w:p>
+            <w:pPr>
+              <w:spacing w:after="60" w:before="0" w:line="228" w:lineRule="auto"/>
+              <w:jc w:val="both"/>
+            </w:pPr>
+            <w:r>
+              <w:rPr>
+                <w:rFonts w:ascii="Arial" w:cs="Arial" w:eastAsia="Arial" w:hAnsi="Arial"/>
+                <w:b/>
+                <w:bCs/>
+                <w:color w:val="14284B"/>
+                <w:sz w:val="16"/>
+                <w:szCs w:val="16"/>
+              </w:rPr>
+              <w:t xml:space="preserve">Peer group. </w:t>
+            </w:r>
+            <w:r>
+              <w:rPr>
+                <w:rFonts w:ascii="Arial" w:cs="Arial" w:eastAsia="Arial" w:hAnsi="Arial"/>
+                <w:color w:val="1A1A1A"/>
+                <w:sz w:val="16"/>
+                <w:szCs w:val="16"/>
+              </w:rPr>
+              <w:t xml:space="preserve">It is the same set that defines the beta: two Chilean peers (Parque Arauco and Cencosud Shopping), three Brazilian ones (Allos, Multiplan and Iguatemi) and IRSA (Argentina), chosen for business model, scale and quality of rental assets. IRSA is kept with caution, as it reports under IAS 29 (hyperinflation) and its NTM consensus has a single analyst. We exclude Fibra Danhos (Mexico): as a FIBRA it must distribute 95% of its taxable income, which distorts its multiples, and it has no beta in the WACC (Appendix [E]).</w:t>
+            </w:r>
+          </w:p>
+          <w:p>
+            <w:pPr>
+              <w:spacing w:after="60" w:before="0" w:line="228" w:lineRule="auto"/>
+              <w:jc w:val="both"/>
+            </w:pPr>
+            <w:r>
+              <w:rPr>
+                <w:rFonts w:ascii="Arial" w:cs="Arial" w:eastAsia="Arial" w:hAnsi="Arial"/>
+                <w:color w:val="1A1A1A"/>
+                <w:sz w:val="16"/>
+                <w:szCs w:val="16"/>
+              </w:rPr>
+              <w:t xml:space="preserve">Brazilian peers trade at structurally lower multiples because of Brazil's higher rates and risk premia (median 9.0x EV/EBITDA versus 15.7x in Chile; Figure 33). Applying the full set unadjusted would penalise Mallplaza for a risk it does not carry, when 71.8% of its revenue comes from Chile. The multiple therefore weights the Chilean median at 70% and the full-set median at 30%.</w:t>
+            </w:r>
+          </w:p>
+          <w:p>
+            <w:pPr>
+              <w:spacing w:after="60" w:before="0" w:line="228" w:lineRule="auto"/>
+              <w:jc w:val="both"/>
+            </w:pPr>
+            <w:r>
+              <w:rPr>
+                <w:rFonts w:ascii="Arial" w:cs="Arial" w:eastAsia="Arial" w:hAnsi="Arial"/>
+                <w:b/>
+                <w:bCs/>
+                <w:color w:val="14284B"/>
+                <w:sz w:val="16"/>
+                <w:szCs w:val="16"/>
+              </w:rPr>
+              <w:t xml:space="preserve">Main multiple. </w:t>
+            </w:r>
+            <w:r>
+              <w:rPr>
+                <w:rFonts w:ascii="Arial" w:cs="Arial" w:eastAsia="Arial" w:hAnsi="Arial"/>
+                <w:color w:val="1A1A1A"/>
+                <w:sz w:val="16"/>
+                <w:szCs w:val="16"/>
+              </w:rPr>
+              <w:t xml:space="preserve">We use EV/EBITDA because it is neutral to leverage and leaves out property revaluation (IAS 40): it measures only the operating cash of leased GLA. The target multiple is 14.4x (70% × 15.7x + 30% × 11.1x), which gives CLP 2,951 per share. Mallplaza trades at 16.8x LTM: 7% above the Chilean median, below Parque Arauco (18.4x) and 17% above the weighted multiple (Figure 34). Multiples confirm the direction (the stock is expensive); the size of the downside comes from the DCF.</w:t>
+            </w:r>
+          </w:p>
+          <w:p>
+            <w:pPr>
+              <w:spacing w:after="60" w:before="0" w:line="228" w:lineRule="auto"/>
+              <w:jc w:val="both"/>
+            </w:pPr>
+            <w:r>
+              <w:rPr>
+                <w:rFonts w:ascii="Arial" w:cs="Arial" w:eastAsia="Arial" w:hAnsi="Arial"/>
+                <w:color w:val="1A1A1A"/>
+                <w:sz w:val="16"/>
+                <w:szCs w:val="16"/>
+              </w:rPr>
+              <w:t xml:space="preserve">We exclude P/E because its implied value (CLP 8,644) is distorted by revaluation gains in net income. To stay consistent with peers, multiples use Bloomberg net debt (CLP 1,311,569 million), slightly different from the company's net financial debt used in the DCF (CLP 1,285,740 million).</w:t>
+            </w:r>
+          </w:p>
+          <w:p>
+            <w:pPr>
+              <w:pBdr>
+                <w:bottom w:val="single" w:color="E9004B" w:sz="8" w:space="1"/>
+              </w:pBdr>
+              <w:spacing w:after="50" w:before="90"/>
+            </w:pPr>
+            <w:r>
+              <w:rPr>
+                <w:rFonts w:ascii="Arial" w:cs="Arial" w:eastAsia="Arial" w:hAnsi="Arial"/>
+                <w:b/>
+                <w:bCs/>
+                <w:color w:val="14284B"/>
+                <w:sz w:val="16"/>
+                <w:szCs w:val="16"/>
+              </w:rPr>
+              <w:t xml:space="preserve">VALUATION SENSITIVITY AND RISKS</w:t>
+            </w:r>
+          </w:p>
+          <w:p>
+            <w:pPr>
+              <w:spacing w:after="60" w:before="0" w:line="228" w:lineRule="auto"/>
+              <w:jc w:val="both"/>
+            </w:pPr>
+            <w:r>
+              <w:rPr>
+                <w:rFonts w:ascii="Arial" w:cs="Arial" w:eastAsia="Arial" w:hAnsi="Arial"/>
+                <w:b/>
+                <w:bCs/>
+                <w:color w:val="14284B"/>
+                <w:sz w:val="16"/>
+                <w:szCs w:val="16"/>
+              </w:rPr>
+              <w:t xml:space="preserve">Sensitivity. </w:t>
+            </w:r>
+            <w:r>
+              <w:rPr>
+                <w:rFonts w:ascii="Arial" w:cs="Arial" w:eastAsia="Arial" w:hAnsi="Arial"/>
+                <w:color w:val="1A1A1A"/>
+                <w:sz w:val="16"/>
+                <w:szCs w:val="16"/>
+              </w:rPr>
+              <w:t xml:space="preserve">With WACC ±100 bp and g between 2.5% and 4.0%, DCF value ranges from CLP 1,379 to 2,329, centred on CLP 1,857 (Figure 25; Appendix [F]). Even the most favourable end is far below the CLP 3,555 price. On operations, the historical worst case (75.8% EBITDA margin) takes 10.0% off the DCF (Figure 24).</w:t>
+            </w:r>
+          </w:p>
+          <w:p>
+            <w:pPr>
+              <w:spacing w:after="60" w:before="0" w:line="228" w:lineRule="auto"/>
+              <w:jc w:val="both"/>
+            </w:pPr>
+            <w:r>
+              <w:rPr>
+                <w:rFonts w:ascii="Arial" w:cs="Arial" w:eastAsia="Arial" w:hAnsi="Arial"/>
+                <w:b/>
+                <w:bCs/>
+                <w:color w:val="14284B"/>
+                <w:sz w:val="16"/>
+                <w:szCs w:val="16"/>
+              </w:rPr>
+              <w:t xml:space="preserve">Dispersion across multiples. </w:t>
+            </w:r>
+            <w:r>
+              <w:rPr>
+                <w:rFonts w:ascii="Arial" w:cs="Arial" w:eastAsia="Arial" w:hAnsi="Arial"/>
+                <w:color w:val="1A1A1A"/>
+                <w:sz w:val="16"/>
+                <w:szCs w:val="16"/>
+              </w:rPr>
+              <w:t xml:space="preserve">Multiples are the most favourable scenario for the stock, and even so all of them sit below the price: EV/EBITDA LTM CLP 2,951 (−17%), EV/EBITDA NTM CLP 2,914 (−18%), EV/EBIT CLP 3,098 (−13%) and P/BV CLP 3,171 (−11%), as does the Chilean median on its own (CLP 3,294, −7%) (Figure 27). The stock being expensive does not depend on the DCF alone.</w:t>
+            </w:r>
+          </w:p>
+          <w:p>
+            <w:pPr>
+              <w:spacing w:after="60" w:before="0" w:line="228" w:lineRule="auto"/>
+              <w:jc w:val="both"/>
+            </w:pPr>
+            <w:r>
+              <w:rPr>
+                <w:rFonts w:ascii="Arial" w:cs="Arial" w:eastAsia="Arial" w:hAnsi="Arial"/>
+                <w:b/>
+                <w:bCs/>
+                <w:color w:val="14284B"/>
+                <w:sz w:val="16"/>
+                <w:szCs w:val="16"/>
+              </w:rPr>
+              <w:t xml:space="preserve">Robustness checks. </w:t>
+            </w:r>
+            <w:r>
+              <w:rPr>
+                <w:rFonts w:ascii="Arial" w:cs="Arial" w:eastAsia="Arial" w:hAnsi="Arial"/>
+                <w:color w:val="1A1A1A"/>
+                <w:sz w:val="16"/>
+                <w:szCs w:val="16"/>
+              </w:rPr>
+              <w:t xml:space="preserve">(i) APV gives CLP 1,894 per share, 2% above the DCF; (ii) using the peso bond as the risk-free rate, the target price rises to ~CLP 2,439, still 31% below the price (Appendix [Z]); and (iii) with a net debt/EBITDA target between 2.36x and 4.0x and a spread of 0 to 50 bp per turn, the DCF moves between CLP 1,819 and 1,894.</w:t>
+            </w:r>
+          </w:p>
+          <w:p>
+            <w:pPr>
+              <w:spacing w:after="60" w:before="0" w:line="228" w:lineRule="auto"/>
+              <w:jc w:val="both"/>
+            </w:pPr>
+            <w:r>
+              <w:rPr>
+                <w:rFonts w:ascii="Arial" w:cs="Arial" w:eastAsia="Arial" w:hAnsi="Arial"/>
+                <w:b/>
+                <w:bCs/>
+                <w:color w:val="14284B"/>
+                <w:sz w:val="16"/>
+                <w:szCs w:val="16"/>
+              </w:rPr>
+              <w:t xml:space="preserve">Target price. </w:t>
+            </w:r>
+            <w:r>
+              <w:rPr>
+                <w:rFonts w:ascii="Arial" w:cs="Arial" w:eastAsia="Arial" w:hAnsi="Arial"/>
+                <w:color w:val="1A1A1A"/>
+                <w:sz w:val="16"/>
+                <w:szCs w:val="16"/>
+              </w:rPr>
+              <w:t xml:space="preserve">80% × CLP 1,857 + 20% × CLP 2,951 = CLP 2,076, an expected return of −41.6% against the CLP 3,555 close of 30-Sep-26. The DCF is dated 30-Jun-26; rolling it to the price date (compounding at Ke for 0.25 years) would lift it to ~CLP 1,910 and the target price to ~CLP 2,118 (−40.4%), without changing the recommendation.</w:t>
+            </w:r>
+          </w:p>
+          <w:p>
+            <w:pPr>
+              <w:spacing w:after="60" w:before="0" w:line="228" w:lineRule="auto"/>
+              <w:jc w:val="both"/>
+            </w:pPr>
+            <w:r>
+              <w:rPr>
+                <w:rFonts w:ascii="Arial" w:cs="Arial" w:eastAsia="Arial" w:hAnsi="Arial"/>
+                <w:b/>
+                <w:bCs/>
+                <w:color w:val="14284B"/>
+                <w:sz w:val="16"/>
+                <w:szCs w:val="16"/>
+              </w:rPr>
+              <w:t xml:space="preserve">Upside risks. </w:t>
+            </w:r>
+            <w:r>
+              <w:rPr>
+                <w:rFonts w:ascii="Arial" w:cs="Arial" w:eastAsia="Arial" w:hAnsi="Arial"/>
+                <w:color w:val="1A1A1A"/>
+                <w:sz w:val="16"/>
+                <w:szCs w:val="16"/>
+              </w:rPr>
+              <w:t xml:space="preserve">A further, sustained compression of market cap rates, driven by stronger institutional appetite for defensive real estate in the region, or a structural premium for Mallplaza's Tier A assets if their quality and pricing power prove more durable than the model assumes (see Investment Risks).</w:t>
+            </w:r>
+          </w:p>
+        </w:tc>
+        <w:tc>
+          <w:tcPr>
+            <w:tcW w:type="dxa" w:w="216"/>
+            <w:tcBorders>
+              <w:top w:val="none" w:color="FFFFFF" w:sz="0"/>
+              <w:left w:val="none" w:color="FFFFFF" w:sz="0"/>
+              <w:bottom w:val="none" w:color="FFFFFF" w:sz="0"/>
+              <w:right w:val="none" w:color="FFFFFF" w:sz="0"/>
+            </w:tcBorders>
+            <w:tcMar>
+              <w:top w:type="dxa" w:w="0"/>
+              <w:left w:type="dxa" w:w="0"/>
+              <w:bottom w:type="dxa" w:w="0"/>
+              <w:right w:type="dxa" w:w="0"/>
+            </w:tcMar>
+            <w:vAlign w:val="top"/>
+          </w:tcPr>
+          <w:p/>
+        </w:tc>
+        <w:tc>
+          <w:tcPr>
+            <w:tcW w:type="dxa" w:w="3550"/>
+            <w:tcBorders>
+              <w:top w:val="none" w:color="FFFFFF" w:sz="0"/>
+              <w:left w:val="none" w:color="FFFFFF" w:sz="0"/>
+              <w:bottom w:val="none" w:color="FFFFFF" w:sz="0"/>
+              <w:right w:val="none" w:color="FFFFFF" w:sz="0"/>
+            </w:tcBorders>
+            <w:tcMar>
+              <w:top w:type="dxa" w:w="0"/>
+              <w:left w:type="dxa" w:w="0"/>
+              <w:bottom w:type="dxa" w:w="0"/>
+              <w:right w:type="dxa" w:w="0"/>
+            </w:tcMar>
+            <w:vAlign w:val="top"/>
+          </w:tcPr>
+          <w:p>
+            <w:pPr>
+              <w:spacing w:after="30" w:before="20" w:line="228" w:lineRule="auto"/>
             </w:pPr>
             <w:r>
               <w:rPr>
@@ -866,6 +1452,81 @@
                 <w:szCs w:val="14"/>
               </w:rPr>
               <w:t xml:space="preserve">Figure 33: </w:t>
+            </w:r>
+            <w:r>
+              <w:rPr>
+                <w:rFonts w:ascii="Arial" w:cs="Arial" w:eastAsia="Arial" w:hAnsi="Arial"/>
+                <w:color w:val="14284B"/>
+                <w:sz w:val="14"/>
+                <w:szCs w:val="14"/>
+              </w:rPr>
+              <w:t xml:space="preserve">Peer multiples vs local rates</w:t>
+            </w:r>
+          </w:p>
+          <w:tbl>
+            <w:tblPr>
+              <w:tblW w:type="dxa" w:w="3550"/>
+              <w:tblBorders>
+                <w:top w:val="single" w:color="auto" w:sz="4"/>
+                <w:left w:val="single" w:color="auto" w:sz="4"/>
+                <w:bottom w:val="single" w:color="auto" w:sz="4"/>
+                <w:right w:val="single" w:color="auto" w:sz="4"/>
+                <w:insideH w:val="single" w:color="auto" w:sz="4"/>
+                <w:insideV w:val="single" w:color="auto" w:sz="4"/>
+              </w:tblBorders>
+            </w:tblPr>
+            <w:tblGrid>
+              <w:gridCol w:w="3550"/>
+            </w:tblGrid>
+            <w:tr>
+              <w:trPr>
+                <w:trHeight w:val="1700" w:hRule="atLeast"/>
+              </w:trPr>
+              <w:tc>
+                <w:tcPr>
+                  <w:tcW w:type="dxa" w:w="3550"/>
+                  <w:tcBorders>
+                    <w:top w:val="dashed" w:color="9AA3B5" w:sz="6"/>
+                    <w:left w:val="dashed" w:color="9AA3B5" w:sz="6"/>
+                    <w:bottom w:val="dashed" w:color="9AA3B5" w:sz="6"/>
+                    <w:right w:val="dashed" w:color="9AA3B5" w:sz="6"/>
+                  </w:tcBorders>
+                  <w:shd w:fill="F7F8FB" w:color="auto" w:val="clear"/>
+                  <w:vAlign w:val="center"/>
+                </w:tcPr>
+                <w:p>
+                  <w:pPr>
+                    <w:jc w:val="center"/>
+                  </w:pPr>
+                  <w:r>
+                    <w:rPr>
+                      <w:rFonts w:ascii="Arial" w:cs="Arial" w:eastAsia="Arial" w:hAnsi="Arial"/>
+                      <w:i/>
+                      <w:iCs/>
+                      <w:color w:val="5F5F5F"/>
+                      <w:sz w:val="14"/>
+                      <w:szCs w:val="14"/>
+                    </w:rPr>
+                    <w:t xml:space="preserve">Chart pending (Brazil NTN-B yield missing, Bloomberg).</w:t>
+                  </w:r>
+                </w:p>
+              </w:tc>
+            </w:tr>
+          </w:tbl>
+          <w:p>
+            <w:pPr>
+              <w:spacing w:after="30" w:before="120" w:line="228" w:lineRule="auto"/>
+            </w:pPr>
+            <w:r>
+              <w:rPr>
+                <w:rFonts w:ascii="Arial" w:cs="Arial" w:eastAsia="Arial" w:hAnsi="Arial"/>
+                <w:b/>
+                <w:bCs/>
+                <w:color w:val="14284B"/>
+                <w:sz w:val="14"/>
+                <w:szCs w:val="14"/>
+              </w:rPr>
+              <w:t xml:space="preserve">Figure 34: </w:t>
             </w:r>
             <w:r>
               <w:rPr>

</xml_diff>

<commit_message>
Condense the Valuation section to two pages plus the WACC appendix
Co-Authored-By: Claude Opus 5.5 <noreply@anthropic.com>
Claude-Session: https://claude.ai/code/session_0188QZHBkA8n5QL7BtmFakQg
</commit_message>
<xml_diff>
--- a/informe/Mallplaza_Valuacion_EN.docx
+++ b/informe/Mallplaza_Valuacion_EN.docx
@@ -106,22 +106,7 @@
                 <w:sz w:val="16"/>
                 <w:szCs w:val="16"/>
               </w:rPr>
-              <w:t xml:space="preserve">We give the DCF an 80% weight because Mallplaza runs retail infrastructure with highly predictable cash flows: 81.4% of LTM revenue is rent, and 93% of that is fixed rent (~76% of total revenue). The DCF best captures the intrinsic value of the business and its expansion plan.</w:t>
-            </w:r>
-          </w:p>
-          <w:p>
-            <w:pPr>
-              <w:spacing w:after="60" w:before="0" w:line="228" w:lineRule="auto"/>
-              <w:jc w:val="both"/>
-            </w:pPr>
-            <w:r>
-              <w:rPr>
-                <w:rFonts w:ascii="Arial" w:cs="Arial" w:eastAsia="Arial" w:hAnsi="Arial"/>
-                <w:color w:val="1A1A1A"/>
-                <w:sz w:val="16"/>
-                <w:szCs w:val="16"/>
-              </w:rPr>
-              <w:t xml:space="preserve">Multiples (20%) test the model against what the market pays for the industry today. We cap their weight for two reasons: (i) Chile has only two direct, liquid peers (Parque Arauco and Cencosud Shopping), which gives little statistical depth; and (ii) multiples reflect current sentiment but not Mallplaza's GLA expansion or financing path, which the DCF does capture.</w:t>
+              <w:t xml:space="preserve">We give the DCF an 80% weight because Mallplaza's cash flows are highly predictable: 81.4% of LTM revenue is rent and 93% of that is fixed. Multiples (20%) test the model against what the market pays today; we cap their weight because Chile has only two direct peers (Parque Arauco and Cencosud Shopping) and because multiples do not capture Mallplaza's GLA expansion or debt path, which the DCF does.</w:t>
             </w:r>
           </w:p>
           <w:p>
@@ -140,7 +125,7 @@
                 <w:sz w:val="16"/>
                 <w:szCs w:val="16"/>
               </w:rPr>
-              <w:t xml:space="preserve">DCF: MODEL STRUCTURE</w:t>
+              <w:t xml:space="preserve">DCF: STRUCTURE AND DISCOUNT RATE</w:t>
             </w:r>
           </w:p>
           <w:p>
@@ -155,30 +140,13 @@
                 <w:sz w:val="16"/>
                 <w:szCs w:val="16"/>
               </w:rPr>
-              <w:t xml:space="preserve">We value a two-stage free cash flow to the firm (FCFF) in nominal CLP, with a 30-Jun-26 valuation date and the mid-year convention. The explicit stage (2H26E–2031E) captures the near-term investment plan and the GLA expansion; the terminal stage (from 2032) is a Gordon perpetuity that accounts for 76% of enterprise value, consistent with long-lived assets (Appendix [B]).</w:t>
+              <w:t xml:space="preserve">We value FCFF in two stages, in nominal CLP, at 30-Jun-26 with the mid-year convention. The explicit stage (2H26E–2031E) includes the capex and ramp-up of projects opening through 2032 (108,301 m² of mature GLA in the terminal year). From 2032, a Gordon perpetuity accounts for 76% of EV, with no new net GLA and maintenance capex only (Appendix [B]).</w:t>
             </w:r>
           </w:p>
           <w:p>
             <w:pPr>
               <w:spacing w:after="60" w:before="0" w:line="228" w:lineRule="auto"/>
               <w:jc w:val="both"/>
-            </w:pPr>
-            <w:r>
-              <w:rPr>
-                <w:rFonts w:ascii="Arial" w:cs="Arial" w:eastAsia="Arial" w:hAnsi="Arial"/>
-                <w:color w:val="1A1A1A"/>
-                <w:sz w:val="16"/>
-                <w:szCs w:val="16"/>
-              </w:rPr>
-              <w:t xml:space="preserve">The explicit horizon includes the capex and revenue ramp-up of projects opening through 2032, adding 108,301 m² of mature GLA in the terminal year. That growth is funded with operating cash flow and more debt: net debt/EBITDA rises from 2.36x to 3.5x by 2031. From 2032 the model adds no net GLA and terminal capex covers maintenance only (5.5% of revenue), because expanding at a return below the real WACC would destroy value (see Terminal value).</w:t>
-            </w:r>
-          </w:p>
-          <w:p>
-            <w:pPr>
-              <w:pBdr>
-                <w:bottom w:val="single" w:color="E9004B" w:sz="8" w:space="1"/>
-              </w:pBdr>
-              <w:spacing w:after="50" w:before="90"/>
             </w:pPr>
             <w:r>
               <w:rPr>
@@ -189,14 +157,8 @@
                 <w:sz w:val="16"/>
                 <w:szCs w:val="16"/>
               </w:rPr>
-              <w:t xml:space="preserve">DCF: DISCOUNT RATE (WACC)</w:t>
-            </w:r>
-          </w:p>
-          <w:p>
-            <w:pPr>
-              <w:spacing w:after="60" w:before="0" w:line="228" w:lineRule="auto"/>
-              <w:jc w:val="both"/>
-            </w:pPr>
+              <w:t xml:space="preserve">WACC. </w:t>
+            </w:r>
             <w:r>
               <w:rPr>
                 <w:rFonts w:ascii="Arial" w:cs="Arial" w:eastAsia="Arial" w:hAnsi="Arial"/>
@@ -204,7 +166,7 @@
                 <w:sz w:val="16"/>
                 <w:szCs w:val="16"/>
               </w:rPr>
-              <w:t xml:space="preserve">The nominal CLP WACC changes by period as the capital structure converges to its target: 10.54% in 2H26E and 10.41% in the terminal period (7.32% and 7.20% in real terms). It follows a country-risk-adjusted CAPM (Damodaran approach); details are in Appendix [Z].</w:t>
+              <w:t xml:space="preserve">It changes by period as net debt/EBITDA converges from 2.36x to 3.5x by 2031 (D/E from 20.0% to 28.5%): 10.54% in 2H26E and 10.41% in the terminal period (7.32% and 7.20% real). Ke is computed in USD and converted to CLP with the inflation differential: Rf 4.98% + beta 1.14 × ERP 4.14% + CRP 1.41% = 11.10% (11.93% in CLP, terminal). The beta relevers the median unlevered beta of six peers (0.94), and the CRP weights sovereign risk by revenue (71.8% Chile, 17.7% Peru and 10.5% Colombia). Kd starts from the latest UF bond coupon (3.6% real) plus 25 bp per turn of leverage above 2.36x: 4.92% after tax in 2H26E and 5.11% in the terminal period. At CLP 3,555, equity yields almost the same as that debt (Figure 28; details in Appendix [Z]).</w:t>
             </w:r>
           </w:p>
           <w:p>
@@ -221,7 +183,7 @@
                 <w:sz w:val="16"/>
                 <w:szCs w:val="16"/>
               </w:rPr>
-              <w:t xml:space="preserve">Cost of equity (Ke). </w:t>
+              <w:t xml:space="preserve">Capital structure. </w:t>
             </w:r>
             <w:r>
               <w:rPr>
@@ -230,13 +192,15 @@
                 <w:sz w:val="16"/>
                 <w:szCs w:val="16"/>
               </w:rPr>
-              <w:t xml:space="preserve">Since Rf, ERP and CRP are in dollars, Ke is first computed in USD: Rf 4.98% (10-year US Treasury) + beta 1.14 × ERP 4.14% (Damodaran implied premium) + CRP 1.41% = 11.10% in the terminal period. The beta comes from unlevering six regional peers with Hamada (median 0.94) and relevering it with Mallplaza's structure: 1.09 in 2H26E and 1.14 in the terminal period. The CRP weights sovereign risk by revenue (71.8% Chile, 17.7% Peru and 10.5% Colombia). USD Ke is converted to CLP with the expected inflation differential: 11.70% in 2H26E and 11.93% in the terminal period.</w:t>
-            </w:r>
-          </w:p>
-          <w:p>
-            <w:pPr>
-              <w:spacing w:after="60" w:before="0" w:line="228" w:lineRule="auto"/>
-              <w:jc w:val="both"/>
+              <w:t xml:space="preserve">The company uses its debt capacity to grow (it reached 3.78x in 2024 after buying Open Plaza Peru). Since FCFF already covers capex, the extra debt is returned to shareholders as a distribution (CLP 1.79 trillion cumulative to 2031): it does not enter the EV, but it makes the debt assumed in the WACC exist in the plan (Appendix [D]).</w:t>
+            </w:r>
+          </w:p>
+          <w:p>
+            <w:pPr>
+              <w:pBdr>
+                <w:bottom w:val="single" w:color="E9004B" w:sz="8" w:space="1"/>
+              </w:pBdr>
+              <w:spacing w:after="50" w:before="90"/>
             </w:pPr>
             <w:r>
               <w:rPr>
@@ -247,8 +211,14 @@
                 <w:sz w:val="16"/>
                 <w:szCs w:val="16"/>
               </w:rPr>
-              <w:t xml:space="preserve">Cost of debt (Kd). </w:t>
-            </w:r>
+              <w:t xml:space="preserve">DCF: OPERATING FORECAST</w:t>
+            </w:r>
+          </w:p>
+          <w:p>
+            <w:pPr>
+              <w:spacing w:after="60" w:before="0" w:line="228" w:lineRule="auto"/>
+              <w:jc w:val="both"/>
+            </w:pPr>
             <w:r>
               <w:rPr>
                 <w:rFonts w:ascii="Arial" w:cs="Arial" w:eastAsia="Arial" w:hAnsi="Arial"/>
@@ -256,13 +226,15 @@
                 <w:sz w:val="16"/>
                 <w:szCs w:val="16"/>
               </w:rPr>
-              <w:t xml:space="preserve">It starts from the coupon of the latest UF bond issue (3.6% real), converted to nominal with the Central Bank's 3.0% inflation target, plus 25 bp for each turn of net debt/EBITDA above 2.36x (team assumption). After tax (27%), it rises from 4.92% in 2H26E to 5.11% in the terminal period. At CLP 3,555, equity yields almost the same as this debt (Figure 28).</w:t>
-            </w:r>
-          </w:p>
-          <w:p>
-            <w:pPr>
-              <w:spacing w:after="60" w:before="0" w:line="228" w:lineRule="auto"/>
-              <w:jc w:val="both"/>
+              <w:t xml:space="preserve">Reported EBITDA (CLP 544,935 million LTM, 80.5% margin) excludes property revaluation (IAS 40); we forecast a 79.8% margin through 2031E. The operating tax rate rises from 16.8% in 2026E to 27% in 2030E as existing benefits fade. Base capex (pipeline plus maintenance at 5.5% of revenue) peaks at CLP 240,660 million in 2027 and falls to ~CLP 50,000 million from 2029. From 2029, 27,075 m² also open each year (historical average), with capex of CLP 95,000–104,000 million a year, a 35%/90%/100% ramp and a 6.9% yield on cost, at the cost of the identified pipeline (USD 3,603/m²: 170,200 m² and USD 613.2 million). Working capital (15.6% × Δ revenue) requires CLP 7,100–9,900 million a year and moves the price by only ±1.2% (Appendix [C]).</w:t>
+            </w:r>
+          </w:p>
+          <w:p>
+            <w:pPr>
+              <w:pBdr>
+                <w:bottom w:val="single" w:color="E9004B" w:sz="8" w:space="1"/>
+              </w:pBdr>
+              <w:spacing w:after="50" w:before="90"/>
             </w:pPr>
             <w:r>
               <w:rPr>
@@ -273,8 +245,14 @@
                 <w:sz w:val="16"/>
                 <w:szCs w:val="16"/>
               </w:rPr>
-              <w:t xml:space="preserve">Capital structure. </w:t>
-            </w:r>
+              <w:t xml:space="preserve">DCF: TERMINAL VALUE AND IMPLIED CAP RATE</w:t>
+            </w:r>
+          </w:p>
+          <w:p>
+            <w:pPr>
+              <w:spacing w:after="60" w:before="0" w:line="228" w:lineRule="auto"/>
+              <w:jc w:val="both"/>
+            </w:pPr>
             <w:r>
               <w:rPr>
                 <w:rFonts w:ascii="Arial" w:cs="Arial" w:eastAsia="Arial" w:hAnsi="Arial"/>
@@ -282,7 +260,7 @@
                 <w:sz w:val="16"/>
                 <w:szCs w:val="16"/>
               </w:rPr>
-              <w:t xml:space="preserve">The long-term target is 3.5x net debt/EBITDA, reached linearly from 2.36x by 2031: the company uses its debt capacity to grow, as in 2024 (3.78x after the Open Plaza Peru acquisition). At market value this means 77.8% equity and 22.2% debt (D/E 28.5%), which is why the WACC moves over time. Cash not absorbed by investment is returned to shareholders as an additional distribution (CLP 1.79 trillion cumulative to 2031): it does not enter the EV, but it makes the debt assumed in the WACC exist in the plan (Appendix [D]).</w:t>
+              <w:t xml:space="preserve">We use g = 3.0% nominal (0% real). The real RONIC on expansion (5.0%) is below the real WACC (7.2%): growing beyond the horizon destroys value and a higher g lowers it (Figure 29). The DCF implies a cap rate of 10.1% on EV and 11.3% on terminal value, versus 6.0% for the market, 6.4% for Chilean peers, 7.5% at book value and 5.55% for the appraisers (Note 11) (Figure 30). That gap is not an inconsistency: it is the core of the thesis. To justify the current price, the WACC would have to be 285 bp lower (Figure 31).</w:t>
             </w:r>
           </w:p>
         </w:tc>
@@ -490,6 +468,90 @@
               <w:t xml:space="preserve">Real rates in UF. Source: Central Bank of Chile (30-Jun-26); Mallplaza; Team analysis.</w:t>
             </w:r>
           </w:p>
+          <w:p>
+            <w:pPr>
+              <w:spacing w:after="30" w:before="120" w:line="228" w:lineRule="auto"/>
+            </w:pPr>
+            <w:r>
+              <w:rPr>
+                <w:rFonts w:ascii="Arial" w:cs="Arial" w:eastAsia="Arial" w:hAnsi="Arial"/>
+                <w:b/>
+                <w:bCs/>
+                <w:color w:val="14284B"/>
+                <w:sz w:val="14"/>
+                <w:szCs w:val="14"/>
+              </w:rPr>
+              <w:t xml:space="preserve">Figure 29: </w:t>
+            </w:r>
+            <w:r>
+              <w:rPr>
+                <w:rFonts w:ascii="Arial" w:cs="Arial" w:eastAsia="Arial" w:hAnsi="Arial"/>
+                <w:color w:val="14284B"/>
+                <w:sz w:val="14"/>
+                <w:szCs w:val="14"/>
+              </w:rPr>
+              <w:t xml:space="preserve">Growing below the WACC destroys value: real g = 0%</w:t>
+            </w:r>
+          </w:p>
+          <w:p>
+            <w:pPr>
+              <w:spacing w:after="20" w:before="0"/>
+            </w:pPr>
+            <w:r>
+              <w:drawing>
+                <wp:inline distT="0" distB="0" distL="0" distR="0">
+                  <wp:extent cx="2257425" cy="2152650"/>
+                  <wp:effectExtent t="0" r="0" b="0" l="0"/>
+                  <wp:docPr id="1" name="" descr="" title=""/>
+                  <wp:cNvGraphicFramePr>
+                    <a:graphicFrameLocks xmlns:a="http://schemas.openxmlformats.org/drawingml/2006/main" noChangeAspect="1"/>
+                  </wp:cNvGraphicFramePr>
+                  <a:graphic xmlns:a="http://schemas.openxmlformats.org/drawingml/2006/main">
+                    <a:graphicData uri="http://schemas.openxmlformats.org/drawingml/2006/picture">
+                      <pic:pic xmlns:pic="http://schemas.openxmlformats.org/drawingml/2006/picture">
+                        <pic:nvPicPr>
+                          <pic:cNvPr id="0" name="" descr=""/>
+                          <pic:cNvPicPr>
+                            <a:picLocks noChangeAspect="1" noChangeArrowheads="1"/>
+                          </pic:cNvPicPr>
+                        </pic:nvPicPr>
+                        <pic:blipFill>
+                          <a:blip r:embed="rId13" cstate="none"/>
+                          <a:srcRect/>
+                          <a:stretch>
+                            <a:fillRect/>
+                          </a:stretch>
+                        </pic:blipFill>
+                        <pic:spPr bwMode="auto">
+                          <a:xfrm>
+                            <a:off x="0" y="0"/>
+                            <a:ext cx="2257425" cy="2152650"/>
+                          </a:xfrm>
+                          <a:prstGeom prst="rect">
+                            <a:avLst/>
+                          </a:prstGeom>
+                        </pic:spPr>
+                      </pic:pic>
+                    </a:graphicData>
+                  </a:graphic>
+                </wp:inline>
+              </w:drawing>
+            </w:r>
+          </w:p>
+          <w:p>
+            <w:pPr>
+              <w:spacing w:after="0" w:before="10" w:line="216" w:lineRule="auto"/>
+            </w:pPr>
+            <w:r>
+              <w:rPr>
+                <w:rFonts w:ascii="Arial" w:cs="Arial" w:eastAsia="Arial" w:hAnsi="Arial"/>
+                <w:color w:val="5F5F5F"/>
+                <w:sz w:val="11"/>
+                <w:szCs w:val="11"/>
+              </w:rPr>
+              <w:t xml:space="preserve">Top: DCF value by g. Bottom: relative terminal value by RONIC. Source: Team analysis.</w:t>
+            </w:r>
+          </w:p>
         </w:tc>
       </w:tr>
     </w:tbl>
@@ -553,13 +615,45 @@
                 <w:sz w:val="16"/>
                 <w:szCs w:val="16"/>
               </w:rPr>
-              <w:t xml:space="preserve">DCF: OPERATING FORECAST AND FCFF</w:t>
+              <w:t xml:space="preserve">RELATIVE VALUATION: MULTIPLES (20%)</w:t>
             </w:r>
           </w:p>
           <w:p>
             <w:pPr>
               <w:spacing w:after="60" w:before="0" w:line="228" w:lineRule="auto"/>
               <w:jc w:val="both"/>
+            </w:pPr>
+            <w:r>
+              <w:rPr>
+                <w:rFonts w:ascii="Arial" w:cs="Arial" w:eastAsia="Arial" w:hAnsi="Arial"/>
+                <w:color w:val="1A1A1A"/>
+                <w:sz w:val="16"/>
+                <w:szCs w:val="16"/>
+              </w:rPr>
+              <w:t xml:space="preserve">The set is the same as for the beta: Parque Arauco and Cencosud Shopping (Chile), Allos, Multiplan and Iguatemi (Brazil) and IRSA (Argentina, used with caution because of IAS 29 and a single NTM analyst). We exclude Fibra Danhos, which as a FIBRA distributes 95% of its taxable income (Appendix [E]). Brazil trades at lower multiples because of its rates and risk premia (median 9.0x EV/EBITDA versus 15.7x in Chile; Figure 32). Since 71.8% of revenue comes from Chile, the multiple weights the Chilean median at 70% and the full-set median (11.1x) at 30%: 14.4x.</w:t>
+            </w:r>
+          </w:p>
+          <w:p>
+            <w:pPr>
+              <w:spacing w:after="60" w:before="0" w:line="228" w:lineRule="auto"/>
+              <w:jc w:val="both"/>
+            </w:pPr>
+            <w:r>
+              <w:rPr>
+                <w:rFonts w:ascii="Arial" w:cs="Arial" w:eastAsia="Arial" w:hAnsi="Arial"/>
+                <w:color w:val="1A1A1A"/>
+                <w:sz w:val="16"/>
+                <w:szCs w:val="16"/>
+              </w:rPr>
+              <w:t xml:space="preserve">We use EV/EBITDA because it is neutral to leverage and to revaluation (IAS 40). At 14.4x, value is CLP 2,951 per share. Mallplaza trades at 16.8x LTM: 7% above the Chilean median, below Parque Arauco (18.4x) and 17% above the weighted multiple (Figure 33). We exclude P/E (CLP 8,644, distorted by revaluation). Multiples use Bloomberg net debt (CLP 1,311,569 million), as for peers; the DCF uses the company's net financial debt (CLP 1,285,740 million).</w:t>
+            </w:r>
+          </w:p>
+          <w:p>
+            <w:pPr>
+              <w:pBdr>
+                <w:bottom w:val="single" w:color="E9004B" w:sz="8" w:space="1"/>
+              </w:pBdr>
+              <w:spacing w:after="50" w:before="90"/>
             </w:pPr>
             <w:r>
               <w:rPr>
@@ -570,16 +664,7 @@
                 <w:sz w:val="16"/>
                 <w:szCs w:val="16"/>
               </w:rPr>
-              <w:t xml:space="preserve">EBITDA excluding revaluation. </w:t>
-            </w:r>
-            <w:r>
-              <w:rPr>
-                <w:rFonts w:ascii="Arial" w:cs="Arial" w:eastAsia="Arial" w:hAnsi="Arial"/>
-                <w:color w:val="1A1A1A"/>
-                <w:sz w:val="16"/>
-                <w:szCs w:val="16"/>
-              </w:rPr>
-              <w:t xml:space="preserve">Reported EBITDA (CLP 544,935 million LTM, 80.5% margin) excludes unrealised gains from investment property revaluation (IAS 40). We forecast a 79.8% margin in 2026E, ~70 bp below LTM, held at that level through 2031E (Appendix [C]).</w:t>
+              <w:t xml:space="preserve">VALUATION SENSITIVITY AND RISKS</w:t>
             </w:r>
           </w:p>
           <w:p>
@@ -596,7 +681,7 @@
                 <w:sz w:val="16"/>
                 <w:szCs w:val="16"/>
               </w:rPr>
-              <w:t xml:space="preserve">Operating tax. </w:t>
+              <w:t xml:space="preserve">Sensitivity. </w:t>
             </w:r>
             <w:r>
               <w:rPr>
@@ -605,7 +690,7 @@
                 <w:sz w:val="16"/>
                 <w:szCs w:val="16"/>
               </w:rPr>
-              <w:t xml:space="preserve">The effective rate on EBIT starts at 16.8% in 2026E (current tax over EBITDA less financial cost, which includes existing tax benefits) and converges to the 27% corporate rate in 2030E: 16.8% → 19.0% → 21.5% → 24.0% → 27.0%. We assume those benefits fade so as not to overstate value.</w:t>
+              <w:t xml:space="preserve">With WACC ±100 bp and g between 2.5% and 4.0%, the DCF ranges from CLP 1,379 to 2,329 (Figure 25; Appendix [F]), and the historical worst operating case takes 10.0% off (Figure 24). Every multiple sits below the price: EV/EBITDA LTM CLP 2,951 (−17%), NTM CLP 2,914 (−18%), EV/EBIT CLP 3,098 (−13%), P/BV CLP 3,171 (−11%) and the Chilean median alone CLP 3,294 (−7%) (Figure 27).</w:t>
             </w:r>
           </w:p>
           <w:p>
@@ -622,7 +707,7 @@
                 <w:sz w:val="16"/>
                 <w:szCs w:val="16"/>
               </w:rPr>
-              <w:t xml:space="preserve">Capex. </w:t>
+              <w:t xml:space="preserve">Robustness. </w:t>
             </w:r>
             <w:r>
               <w:rPr>
@@ -631,7 +716,7 @@
                 <w:sz w:val="16"/>
                 <w:szCs w:val="16"/>
               </w:rPr>
-              <w:t xml:space="preserve">Base capex (announced pipeline plus maintenance and IT at 5.5% of revenue) peaks at CLP 240,660 million in 2027 and settles at CLP 48,000–52,000 million a year from 2029. Expansion capex totals CLP 46,268 million in 2027 and CLP 95,000–104,000 million a year in 2028–2031: from 2029, 27,075 m² open each year (average organic GLA added in 2022, 2023 and 2025), with capex in the two prior years, a 35%/90%/100% revenue ramp and a 6.9% yield on cost. The cost per m² (USD 3,603) comes from the identified pipeline: 170,200 m² and USD 613.2 million (2Q26 Release, p. 13).</w:t>
+              <w:t xml:space="preserve">APV gives CLP 1,894 (2% above the DCF); with the peso bond as Rf, the target price rises to ~CLP 2,439 (−31%; Appendix [Z]); and with a net debt/EBITDA target between 2.36x and 4.0x, the DCF ranges from CLP 1,819 to 1,894.</w:t>
             </w:r>
           </w:p>
           <w:p>
@@ -648,7 +733,7 @@
                 <w:sz w:val="16"/>
                 <w:szCs w:val="16"/>
               </w:rPr>
-              <w:t xml:space="preserve">Working capital. </w:t>
+              <w:t xml:space="preserve">Target price. </w:t>
             </w:r>
             <w:r>
               <w:rPr>
@@ -657,15 +742,13 @@
                 <w:sz w:val="16"/>
                 <w:szCs w:val="16"/>
               </w:rPr>
-              <w:t xml:space="preserve">Mallplaza has positive net working capital (CLP 102,039 million, 15.6% of revenue at Dec-25), because tenant receivables (CLP 122,370 million) exceed rents collected in advance (CLP 20,247 million). Incremental investment (15.6% × Δ revenue) is small and predictable: CLP 7,100–9,900 million a year, 0.7%–1.3% of revenue. Changing this assumption moves the price by ±1.2% (Figure 29).</w:t>
-            </w:r>
-          </w:p>
-          <w:p>
-            <w:pPr>
-              <w:pBdr>
-                <w:bottom w:val="single" w:color="E9004B" w:sz="8" w:space="1"/>
-              </w:pBdr>
-              <w:spacing w:after="50" w:before="90"/>
+              <w:t xml:space="preserve">80% × CLP 1,857 + 20% × CLP 2,951 = CLP 2,076, a −41.6% return against CLP 3,555 (30-Sep-26). Rolling the DCF from 30-Jun to 30-Sep-26 would lift it to ~CLP 1,910 and the target to ~CLP 2,118 (−40.4%): the recommendation does not change.</w:t>
+            </w:r>
+          </w:p>
+          <w:p>
+            <w:pPr>
+              <w:spacing w:after="60" w:before="0" w:line="228" w:lineRule="auto"/>
+              <w:jc w:val="both"/>
             </w:pPr>
             <w:r>
               <w:rPr>
@@ -676,59 +759,16 @@
                 <w:sz w:val="16"/>
                 <w:szCs w:val="16"/>
               </w:rPr>
-              <w:t xml:space="preserve">DCF: TERMINAL VALUE AND IMPLIED CAP RATE</w:t>
-            </w:r>
-          </w:p>
-          <w:p>
-            <w:pPr>
-              <w:spacing w:after="60" w:before="0" w:line="228" w:lineRule="auto"/>
-              <w:jc w:val="both"/>
-            </w:pPr>
-            <w:r>
-              <w:rPr>
-                <w:rFonts w:ascii="Arial" w:cs="Arial" w:eastAsia="Arial" w:hAnsi="Arial"/>
-                <w:b/>
-                <w:bCs/>
-                <w:color w:val="14284B"/>
+              <w:t xml:space="preserve">Upside risks. </w:t>
+            </w:r>
+            <w:r>
+              <w:rPr>
+                <w:rFonts w:ascii="Arial" w:cs="Arial" w:eastAsia="Arial" w:hAnsi="Arial"/>
+                <w:color w:val="1A1A1A"/>
                 <w:sz w:val="16"/>
                 <w:szCs w:val="16"/>
               </w:rPr>
-              <w:t xml:space="preserve">Terminal growth. </w:t>
-            </w:r>
-            <w:r>
-              <w:rPr>
-                <w:rFonts w:ascii="Arial" w:cs="Arial" w:eastAsia="Arial" w:hAnsi="Arial"/>
-                <w:color w:val="1A1A1A"/>
-                <w:sz w:val="16"/>
-                <w:szCs w:val="16"/>
-              </w:rPr>
-              <w:t xml:space="preserve">We use g = 3.0% nominal (0% real), equal to the Central Bank's inflation target. The value driver supports it: the real RONIC on expansion (5.0%) is below the real WACC (7.2%), so expanding beyond the horizon would destroy value and a higher g lowers value (Figure 30). Terminal reinvestment is therefore zero and rents grow only with inflation.</w:t>
-            </w:r>
-          </w:p>
-          <w:p>
-            <w:pPr>
-              <w:spacing w:after="60" w:before="0" w:line="228" w:lineRule="auto"/>
-              <w:jc w:val="both"/>
-            </w:pPr>
-            <w:r>
-              <w:rPr>
-                <w:rFonts w:ascii="Arial" w:cs="Arial" w:eastAsia="Arial" w:hAnsi="Arial"/>
-                <w:b/>
-                <w:bCs/>
-                <w:color w:val="14284B"/>
-                <w:sz w:val="16"/>
-                <w:szCs w:val="16"/>
-              </w:rPr>
-              <w:t xml:space="preserve">Implied cap rate. </w:t>
-            </w:r>
-            <w:r>
-              <w:rPr>
-                <w:rFonts w:ascii="Arial" w:cs="Arial" w:eastAsia="Arial" w:hAnsi="Arial"/>
-                <w:color w:val="1A1A1A"/>
-                <w:sz w:val="16"/>
-                <w:szCs w:val="16"/>
-              </w:rPr>
-              <w:t xml:space="preserve">The DCF implies a real cap rate of 10.1% on enterprise value and 11.3% on terminal value, well above the market's (6.0%), Chilean peers' (6.4%), the book cap rate (7.5%) and the real rate used by independent appraisers in Note 11 of the financial statements (5.55%, mid-point of the range) (Figure 31). This gap is not an inconsistency to resolve: it is the core of the thesis. Our model asks far more of the cash flows than the market and the appraisers do; to justify the current price, the WACC would have to be 285 bp lower (Figure 32).</w:t>
+              <w:t xml:space="preserve">A sustained compression of cap rates on stronger institutional demand for defensive assets, or a structural premium for Mallplaza's Tier A assets (see Investment Risks).</w:t>
             </w:r>
           </w:p>
         </w:tc>
@@ -781,7 +821,7 @@
                 <w:sz w:val="14"/>
                 <w:szCs w:val="14"/>
               </w:rPr>
-              <w:t xml:space="preserve">Figure 29: </w:t>
+              <w:t xml:space="preserve">Figure 30: </w:t>
             </w:r>
             <w:r>
               <w:rPr>
@@ -790,7 +830,7 @@
                 <w:sz w:val="14"/>
                 <w:szCs w:val="14"/>
               </w:rPr>
-              <w:t xml:space="preserve">Working capital: an assumption that does not move the price (±1.2%)</w:t>
+              <w:t xml:space="preserve">The market pays 6.0%; our cash flows are worth 10.1%</w:t>
             </w:r>
           </w:p>
           <w:p>
@@ -800,91 +840,7 @@
             <w:r>
               <w:drawing>
                 <wp:inline distT="0" distB="0" distL="0" distR="0">
-                  <wp:extent cx="2257425" cy="2105025"/>
-                  <wp:effectExtent t="0" r="0" b="0" l="0"/>
-                  <wp:docPr id="1" name="" descr="" title=""/>
-                  <wp:cNvGraphicFramePr>
-                    <a:graphicFrameLocks xmlns:a="http://schemas.openxmlformats.org/drawingml/2006/main" noChangeAspect="1"/>
-                  </wp:cNvGraphicFramePr>
-                  <a:graphic xmlns:a="http://schemas.openxmlformats.org/drawingml/2006/main">
-                    <a:graphicData uri="http://schemas.openxmlformats.org/drawingml/2006/picture">
-                      <pic:pic xmlns:pic="http://schemas.openxmlformats.org/drawingml/2006/picture">
-                        <pic:nvPicPr>
-                          <pic:cNvPr id="0" name="" descr=""/>
-                          <pic:cNvPicPr>
-                            <a:picLocks noChangeAspect="1" noChangeArrowheads="1"/>
-                          </pic:cNvPicPr>
-                        </pic:nvPicPr>
-                        <pic:blipFill>
-                          <a:blip r:embed="rId13" cstate="none"/>
-                          <a:srcRect/>
-                          <a:stretch>
-                            <a:fillRect/>
-                          </a:stretch>
-                        </pic:blipFill>
-                        <pic:spPr bwMode="auto">
-                          <a:xfrm>
-                            <a:off x="0" y="0"/>
-                            <a:ext cx="2257425" cy="2105025"/>
-                          </a:xfrm>
-                          <a:prstGeom prst="rect">
-                            <a:avLst/>
-                          </a:prstGeom>
-                        </pic:spPr>
-                      </pic:pic>
-                    </a:graphicData>
-                  </a:graphic>
-                </wp:inline>
-              </w:drawing>
-            </w:r>
-          </w:p>
-          <w:p>
-            <w:pPr>
-              <w:spacing w:after="0" w:before="10" w:line="216" w:lineRule="auto"/>
-            </w:pPr>
-            <w:r>
-              <w:rPr>
-                <w:rFonts w:ascii="Arial" w:cs="Arial" w:eastAsia="Arial" w:hAnsi="Arial"/>
-                <w:color w:val="5F5F5F"/>
-                <w:sz w:val="11"/>
-                <w:szCs w:val="11"/>
-              </w:rPr>
-              <w:t xml:space="preserve">Source: Mallplaza financial statements; Team analysis.</w:t>
-            </w:r>
-          </w:p>
-          <w:p>
-            <w:pPr>
-              <w:spacing w:after="30" w:before="120" w:line="228" w:lineRule="auto"/>
-            </w:pPr>
-            <w:r>
-              <w:rPr>
-                <w:rFonts w:ascii="Arial" w:cs="Arial" w:eastAsia="Arial" w:hAnsi="Arial"/>
-                <w:b/>
-                <w:bCs/>
-                <w:color w:val="14284B"/>
-                <w:sz w:val="14"/>
-                <w:szCs w:val="14"/>
-              </w:rPr>
-              <w:t xml:space="preserve">Figure 30: </w:t>
-            </w:r>
-            <w:r>
-              <w:rPr>
-                <w:rFonts w:ascii="Arial" w:cs="Arial" w:eastAsia="Arial" w:hAnsi="Arial"/>
-                <w:color w:val="14284B"/>
-                <w:sz w:val="14"/>
-                <w:szCs w:val="14"/>
-              </w:rPr>
-              <w:t xml:space="preserve">Growing below the WACC destroys value: real g = 0%</w:t>
-            </w:r>
-          </w:p>
-          <w:p>
-            <w:pPr>
-              <w:spacing w:after="20" w:before="0"/>
-            </w:pPr>
-            <w:r>
-              <w:drawing>
-                <wp:inline distT="0" distB="0" distL="0" distR="0">
-                  <wp:extent cx="2257425" cy="2152650"/>
+                  <wp:extent cx="2257425" cy="1600200"/>
                   <wp:effectExtent t="0" r="0" b="0" l="0"/>
                   <wp:docPr id="1" name="" descr="" title=""/>
                   <wp:cNvGraphicFramePr>
@@ -909,7 +865,7 @@
                         <pic:spPr bwMode="auto">
                           <a:xfrm>
                             <a:off x="0" y="0"/>
-                            <a:ext cx="2257425" cy="2152650"/>
+                            <a:ext cx="2257425" cy="1600200"/>
                           </a:xfrm>
                           <a:prstGeom prst="rect">
                             <a:avLst/>
@@ -933,7 +889,7 @@
                 <w:sz w:val="11"/>
                 <w:szCs w:val="11"/>
               </w:rPr>
-              <w:t xml:space="preserve">Top: DCF value by g. Bottom: relative terminal value by RONIC. Source: Team analysis.</w:t>
+              <w:t xml:space="preserve">Gran Plaza: subsequent event, not in the model. Source: Mallplaza; Bloomberg; DF; Team analysis.</w:t>
             </w:r>
           </w:p>
           <w:p>
@@ -958,7 +914,7 @@
                 <w:sz w:val="14"/>
                 <w:szCs w:val="14"/>
               </w:rPr>
-              <w:t xml:space="preserve">The market pays 6.0%; our cash flows are worth 10.1%</w:t>
+              <w:t xml:space="preserve">The price requires a WACC 285 bp lower</w:t>
             </w:r>
           </w:p>
           <w:p>
@@ -968,7 +924,7 @@
             <w:r>
               <w:drawing>
                 <wp:inline distT="0" distB="0" distL="0" distR="0">
-                  <wp:extent cx="2257425" cy="1600200"/>
+                  <wp:extent cx="2257425" cy="1781175"/>
                   <wp:effectExtent t="0" r="0" b="0" l="0"/>
                   <wp:docPr id="1" name="" descr="" title=""/>
                   <wp:cNvGraphicFramePr>
@@ -993,424 +949,6 @@
                         <pic:spPr bwMode="auto">
                           <a:xfrm>
                             <a:off x="0" y="0"/>
-                            <a:ext cx="2257425" cy="1600200"/>
-                          </a:xfrm>
-                          <a:prstGeom prst="rect">
-                            <a:avLst/>
-                          </a:prstGeom>
-                        </pic:spPr>
-                      </pic:pic>
-                    </a:graphicData>
-                  </a:graphic>
-                </wp:inline>
-              </w:drawing>
-            </w:r>
-          </w:p>
-          <w:p>
-            <w:pPr>
-              <w:spacing w:after="0" w:before="10" w:line="216" w:lineRule="auto"/>
-            </w:pPr>
-            <w:r>
-              <w:rPr>
-                <w:rFonts w:ascii="Arial" w:cs="Arial" w:eastAsia="Arial" w:hAnsi="Arial"/>
-                <w:color w:val="5F5F5F"/>
-                <w:sz w:val="11"/>
-                <w:szCs w:val="11"/>
-              </w:rPr>
-              <w:t xml:space="preserve">Gran Plaza: subsequent event, not in the model. Source: Mallplaza; Bloomberg; DF; Team analysis.</w:t>
-            </w:r>
-          </w:p>
-        </w:tc>
-      </w:tr>
-    </w:tbl>
-    <w:p>
-      <w:pPr>
-        <w:pageBreakBefore/>
-        <w:spacing w:after="0"/>
-      </w:pPr>
-    </w:p>
-    <w:tbl>
-      <w:tblPr>
-        <w:tblW w:type="dxa" w:w="10666"/>
-        <w:tblBorders>
-          <w:top w:val="none" w:color="FFFFFF" w:sz="0"/>
-          <w:left w:val="none" w:color="FFFFFF" w:sz="0"/>
-          <w:bottom w:val="none" w:color="FFFFFF" w:sz="0"/>
-          <w:right w:val="none" w:color="FFFFFF" w:sz="0"/>
-          <w:insideH w:val="none" w:color="FFFFFF" w:sz="0"/>
-          <w:insideV w:val="none" w:color="FFFFFF" w:sz="0"/>
-        </w:tblBorders>
-      </w:tblPr>
-      <w:tblGrid>
-        <w:gridCol w:w="6900"/>
-        <w:gridCol w:w="216"/>
-        <w:gridCol w:w="3550"/>
-      </w:tblGrid>
-      <w:tr>
-        <w:trPr>
-          <w:cantSplit/>
-        </w:trPr>
-        <w:tc>
-          <w:tcPr>
-            <w:tcW w:type="dxa" w:w="6900"/>
-            <w:tcBorders>
-              <w:top w:val="none" w:color="FFFFFF" w:sz="0"/>
-              <w:left w:val="none" w:color="FFFFFF" w:sz="0"/>
-              <w:bottom w:val="none" w:color="FFFFFF" w:sz="0"/>
-              <w:right w:val="none" w:color="FFFFFF" w:sz="0"/>
-            </w:tcBorders>
-            <w:tcMar>
-              <w:top w:type="dxa" w:w="0"/>
-              <w:left w:type="dxa" w:w="0"/>
-              <w:bottom w:type="dxa" w:w="0"/>
-              <w:right w:type="dxa" w:w="0"/>
-            </w:tcMar>
-            <w:vAlign w:val="top"/>
-          </w:tcPr>
-          <w:p>
-            <w:pPr>
-              <w:pBdr>
-                <w:bottom w:val="single" w:color="E9004B" w:sz="8" w:space="1"/>
-              </w:pBdr>
-              <w:spacing w:after="50" w:before="20"/>
-            </w:pPr>
-            <w:r>
-              <w:rPr>
-                <w:rFonts w:ascii="Arial" w:cs="Arial" w:eastAsia="Arial" w:hAnsi="Arial"/>
-                <w:b/>
-                <w:bCs/>
-                <w:color w:val="14284B"/>
-                <w:sz w:val="16"/>
-                <w:szCs w:val="16"/>
-              </w:rPr>
-              <w:t xml:space="preserve">RELATIVE VALUATION: MULTIPLES (20%)</w:t>
-            </w:r>
-          </w:p>
-          <w:p>
-            <w:pPr>
-              <w:spacing w:after="60" w:before="0" w:line="228" w:lineRule="auto"/>
-              <w:jc w:val="both"/>
-            </w:pPr>
-            <w:r>
-              <w:rPr>
-                <w:rFonts w:ascii="Arial" w:cs="Arial" w:eastAsia="Arial" w:hAnsi="Arial"/>
-                <w:b/>
-                <w:bCs/>
-                <w:color w:val="14284B"/>
-                <w:sz w:val="16"/>
-                <w:szCs w:val="16"/>
-              </w:rPr>
-              <w:t xml:space="preserve">Peer group. </w:t>
-            </w:r>
-            <w:r>
-              <w:rPr>
-                <w:rFonts w:ascii="Arial" w:cs="Arial" w:eastAsia="Arial" w:hAnsi="Arial"/>
-                <w:color w:val="1A1A1A"/>
-                <w:sz w:val="16"/>
-                <w:szCs w:val="16"/>
-              </w:rPr>
-              <w:t xml:space="preserve">It is the same set that defines the beta: two Chilean peers (Parque Arauco and Cencosud Shopping), three Brazilian ones (Allos, Multiplan and Iguatemi) and IRSA (Argentina), chosen for business model, scale and quality of rental assets. IRSA is kept with caution, as it reports under IAS 29 (hyperinflation) and its NTM consensus has a single analyst. We exclude Fibra Danhos (Mexico): as a FIBRA it must distribute 95% of its taxable income, which distorts its multiples, and it has no beta in the WACC (Appendix [E]).</w:t>
-            </w:r>
-          </w:p>
-          <w:p>
-            <w:pPr>
-              <w:spacing w:after="60" w:before="0" w:line="228" w:lineRule="auto"/>
-              <w:jc w:val="both"/>
-            </w:pPr>
-            <w:r>
-              <w:rPr>
-                <w:rFonts w:ascii="Arial" w:cs="Arial" w:eastAsia="Arial" w:hAnsi="Arial"/>
-                <w:color w:val="1A1A1A"/>
-                <w:sz w:val="16"/>
-                <w:szCs w:val="16"/>
-              </w:rPr>
-              <w:t xml:space="preserve">Brazilian peers trade at structurally lower multiples because of Brazil's higher rates and risk premia (median 9.0x EV/EBITDA versus 15.7x in Chile; Figure 33). Applying the full set unadjusted would penalise Mallplaza for a risk it does not carry, when 71.8% of its revenue comes from Chile. The multiple therefore weights the Chilean median at 70% and the full-set median at 30%.</w:t>
-            </w:r>
-          </w:p>
-          <w:p>
-            <w:pPr>
-              <w:spacing w:after="60" w:before="0" w:line="228" w:lineRule="auto"/>
-              <w:jc w:val="both"/>
-            </w:pPr>
-            <w:r>
-              <w:rPr>
-                <w:rFonts w:ascii="Arial" w:cs="Arial" w:eastAsia="Arial" w:hAnsi="Arial"/>
-                <w:b/>
-                <w:bCs/>
-                <w:color w:val="14284B"/>
-                <w:sz w:val="16"/>
-                <w:szCs w:val="16"/>
-              </w:rPr>
-              <w:t xml:space="preserve">Main multiple. </w:t>
-            </w:r>
-            <w:r>
-              <w:rPr>
-                <w:rFonts w:ascii="Arial" w:cs="Arial" w:eastAsia="Arial" w:hAnsi="Arial"/>
-                <w:color w:val="1A1A1A"/>
-                <w:sz w:val="16"/>
-                <w:szCs w:val="16"/>
-              </w:rPr>
-              <w:t xml:space="preserve">We use EV/EBITDA because it is neutral to leverage and leaves out property revaluation (IAS 40): it measures only the operating cash of leased GLA. The target multiple is 14.4x (70% × 15.7x + 30% × 11.1x), which gives CLP 2,951 per share. Mallplaza trades at 16.8x LTM: 7% above the Chilean median, below Parque Arauco (18.4x) and 17% above the weighted multiple (Figure 34). Multiples confirm the direction (the stock is expensive); the size of the downside comes from the DCF.</w:t>
-            </w:r>
-          </w:p>
-          <w:p>
-            <w:pPr>
-              <w:spacing w:after="60" w:before="0" w:line="228" w:lineRule="auto"/>
-              <w:jc w:val="both"/>
-            </w:pPr>
-            <w:r>
-              <w:rPr>
-                <w:rFonts w:ascii="Arial" w:cs="Arial" w:eastAsia="Arial" w:hAnsi="Arial"/>
-                <w:color w:val="1A1A1A"/>
-                <w:sz w:val="16"/>
-                <w:szCs w:val="16"/>
-              </w:rPr>
-              <w:t xml:space="preserve">We exclude P/E because its implied value (CLP 8,644) is distorted by revaluation gains in net income. To stay consistent with peers, multiples use Bloomberg net debt (CLP 1,311,569 million), slightly different from the company's net financial debt used in the DCF (CLP 1,285,740 million).</w:t>
-            </w:r>
-          </w:p>
-          <w:p>
-            <w:pPr>
-              <w:pBdr>
-                <w:bottom w:val="single" w:color="E9004B" w:sz="8" w:space="1"/>
-              </w:pBdr>
-              <w:spacing w:after="50" w:before="90"/>
-            </w:pPr>
-            <w:r>
-              <w:rPr>
-                <w:rFonts w:ascii="Arial" w:cs="Arial" w:eastAsia="Arial" w:hAnsi="Arial"/>
-                <w:b/>
-                <w:bCs/>
-                <w:color w:val="14284B"/>
-                <w:sz w:val="16"/>
-                <w:szCs w:val="16"/>
-              </w:rPr>
-              <w:t xml:space="preserve">VALUATION SENSITIVITY AND RISKS</w:t>
-            </w:r>
-          </w:p>
-          <w:p>
-            <w:pPr>
-              <w:spacing w:after="60" w:before="0" w:line="228" w:lineRule="auto"/>
-              <w:jc w:val="both"/>
-            </w:pPr>
-            <w:r>
-              <w:rPr>
-                <w:rFonts w:ascii="Arial" w:cs="Arial" w:eastAsia="Arial" w:hAnsi="Arial"/>
-                <w:b/>
-                <w:bCs/>
-                <w:color w:val="14284B"/>
-                <w:sz w:val="16"/>
-                <w:szCs w:val="16"/>
-              </w:rPr>
-              <w:t xml:space="preserve">Sensitivity. </w:t>
-            </w:r>
-            <w:r>
-              <w:rPr>
-                <w:rFonts w:ascii="Arial" w:cs="Arial" w:eastAsia="Arial" w:hAnsi="Arial"/>
-                <w:color w:val="1A1A1A"/>
-                <w:sz w:val="16"/>
-                <w:szCs w:val="16"/>
-              </w:rPr>
-              <w:t xml:space="preserve">With WACC ±100 bp and g between 2.5% and 4.0%, DCF value ranges from CLP 1,379 to 2,329, centred on CLP 1,857 (Figure 25; Appendix [F]). Even the most favourable end is far below the CLP 3,555 price. On operations, the historical worst case (75.8% EBITDA margin) takes 10.0% off the DCF (Figure 24).</w:t>
-            </w:r>
-          </w:p>
-          <w:p>
-            <w:pPr>
-              <w:spacing w:after="60" w:before="0" w:line="228" w:lineRule="auto"/>
-              <w:jc w:val="both"/>
-            </w:pPr>
-            <w:r>
-              <w:rPr>
-                <w:rFonts w:ascii="Arial" w:cs="Arial" w:eastAsia="Arial" w:hAnsi="Arial"/>
-                <w:b/>
-                <w:bCs/>
-                <w:color w:val="14284B"/>
-                <w:sz w:val="16"/>
-                <w:szCs w:val="16"/>
-              </w:rPr>
-              <w:t xml:space="preserve">Dispersion across multiples. </w:t>
-            </w:r>
-            <w:r>
-              <w:rPr>
-                <w:rFonts w:ascii="Arial" w:cs="Arial" w:eastAsia="Arial" w:hAnsi="Arial"/>
-                <w:color w:val="1A1A1A"/>
-                <w:sz w:val="16"/>
-                <w:szCs w:val="16"/>
-              </w:rPr>
-              <w:t xml:space="preserve">Multiples are the most favourable scenario for the stock, and even so all of them sit below the price: EV/EBITDA LTM CLP 2,951 (−17%), EV/EBITDA NTM CLP 2,914 (−18%), EV/EBIT CLP 3,098 (−13%) and P/BV CLP 3,171 (−11%), as does the Chilean median on its own (CLP 3,294, −7%) (Figure 27). The stock being expensive does not depend on the DCF alone.</w:t>
-            </w:r>
-          </w:p>
-          <w:p>
-            <w:pPr>
-              <w:spacing w:after="60" w:before="0" w:line="228" w:lineRule="auto"/>
-              <w:jc w:val="both"/>
-            </w:pPr>
-            <w:r>
-              <w:rPr>
-                <w:rFonts w:ascii="Arial" w:cs="Arial" w:eastAsia="Arial" w:hAnsi="Arial"/>
-                <w:b/>
-                <w:bCs/>
-                <w:color w:val="14284B"/>
-                <w:sz w:val="16"/>
-                <w:szCs w:val="16"/>
-              </w:rPr>
-              <w:t xml:space="preserve">Robustness checks. </w:t>
-            </w:r>
-            <w:r>
-              <w:rPr>
-                <w:rFonts w:ascii="Arial" w:cs="Arial" w:eastAsia="Arial" w:hAnsi="Arial"/>
-                <w:color w:val="1A1A1A"/>
-                <w:sz w:val="16"/>
-                <w:szCs w:val="16"/>
-              </w:rPr>
-              <w:t xml:space="preserve">(i) APV gives CLP 1,894 per share, 2% above the DCF; (ii) using the peso bond as the risk-free rate, the target price rises to ~CLP 2,439, still 31% below the price (Appendix [Z]); and (iii) with a net debt/EBITDA target between 2.36x and 4.0x and a spread of 0 to 50 bp per turn, the DCF moves between CLP 1,819 and 1,894.</w:t>
-            </w:r>
-          </w:p>
-          <w:p>
-            <w:pPr>
-              <w:spacing w:after="60" w:before="0" w:line="228" w:lineRule="auto"/>
-              <w:jc w:val="both"/>
-            </w:pPr>
-            <w:r>
-              <w:rPr>
-                <w:rFonts w:ascii="Arial" w:cs="Arial" w:eastAsia="Arial" w:hAnsi="Arial"/>
-                <w:b/>
-                <w:bCs/>
-                <w:color w:val="14284B"/>
-                <w:sz w:val="16"/>
-                <w:szCs w:val="16"/>
-              </w:rPr>
-              <w:t xml:space="preserve">Target price. </w:t>
-            </w:r>
-            <w:r>
-              <w:rPr>
-                <w:rFonts w:ascii="Arial" w:cs="Arial" w:eastAsia="Arial" w:hAnsi="Arial"/>
-                <w:color w:val="1A1A1A"/>
-                <w:sz w:val="16"/>
-                <w:szCs w:val="16"/>
-              </w:rPr>
-              <w:t xml:space="preserve">80% × CLP 1,857 + 20% × CLP 2,951 = CLP 2,076, an expected return of −41.6% against the CLP 3,555 close of 30-Sep-26. The DCF is dated 30-Jun-26; rolling it to the price date (compounding at Ke for 0.25 years) would lift it to ~CLP 1,910 and the target price to ~CLP 2,118 (−40.4%), without changing the recommendation.</w:t>
-            </w:r>
-          </w:p>
-          <w:p>
-            <w:pPr>
-              <w:spacing w:after="60" w:before="0" w:line="228" w:lineRule="auto"/>
-              <w:jc w:val="both"/>
-            </w:pPr>
-            <w:r>
-              <w:rPr>
-                <w:rFonts w:ascii="Arial" w:cs="Arial" w:eastAsia="Arial" w:hAnsi="Arial"/>
-                <w:b/>
-                <w:bCs/>
-                <w:color w:val="14284B"/>
-                <w:sz w:val="16"/>
-                <w:szCs w:val="16"/>
-              </w:rPr>
-              <w:t xml:space="preserve">Upside risks. </w:t>
-            </w:r>
-            <w:r>
-              <w:rPr>
-                <w:rFonts w:ascii="Arial" w:cs="Arial" w:eastAsia="Arial" w:hAnsi="Arial"/>
-                <w:color w:val="1A1A1A"/>
-                <w:sz w:val="16"/>
-                <w:szCs w:val="16"/>
-              </w:rPr>
-              <w:t xml:space="preserve">A further, sustained compression of market cap rates, driven by stronger institutional appetite for defensive real estate in the region, or a structural premium for Mallplaza's Tier A assets if their quality and pricing power prove more durable than the model assumes (see Investment Risks).</w:t>
-            </w:r>
-          </w:p>
-        </w:tc>
-        <w:tc>
-          <w:tcPr>
-            <w:tcW w:type="dxa" w:w="216"/>
-            <w:tcBorders>
-              <w:top w:val="none" w:color="FFFFFF" w:sz="0"/>
-              <w:left w:val="none" w:color="FFFFFF" w:sz="0"/>
-              <w:bottom w:val="none" w:color="FFFFFF" w:sz="0"/>
-              <w:right w:val="none" w:color="FFFFFF" w:sz="0"/>
-            </w:tcBorders>
-            <w:tcMar>
-              <w:top w:type="dxa" w:w="0"/>
-              <w:left w:type="dxa" w:w="0"/>
-              <w:bottom w:type="dxa" w:w="0"/>
-              <w:right w:type="dxa" w:w="0"/>
-            </w:tcMar>
-            <w:vAlign w:val="top"/>
-          </w:tcPr>
-          <w:p/>
-        </w:tc>
-        <w:tc>
-          <w:tcPr>
-            <w:tcW w:type="dxa" w:w="3550"/>
-            <w:tcBorders>
-              <w:top w:val="none" w:color="FFFFFF" w:sz="0"/>
-              <w:left w:val="none" w:color="FFFFFF" w:sz="0"/>
-              <w:bottom w:val="none" w:color="FFFFFF" w:sz="0"/>
-              <w:right w:val="none" w:color="FFFFFF" w:sz="0"/>
-            </w:tcBorders>
-            <w:tcMar>
-              <w:top w:type="dxa" w:w="0"/>
-              <w:left w:type="dxa" w:w="0"/>
-              <w:bottom w:type="dxa" w:w="0"/>
-              <w:right w:type="dxa" w:w="0"/>
-            </w:tcMar>
-            <w:vAlign w:val="top"/>
-          </w:tcPr>
-          <w:p>
-            <w:pPr>
-              <w:spacing w:after="30" w:before="20" w:line="228" w:lineRule="auto"/>
-            </w:pPr>
-            <w:r>
-              <w:rPr>
-                <w:rFonts w:ascii="Arial" w:cs="Arial" w:eastAsia="Arial" w:hAnsi="Arial"/>
-                <w:b/>
-                <w:bCs/>
-                <w:color w:val="14284B"/>
-                <w:sz w:val="14"/>
-                <w:szCs w:val="14"/>
-              </w:rPr>
-              <w:t xml:space="preserve">Figure 32: </w:t>
-            </w:r>
-            <w:r>
-              <w:rPr>
-                <w:rFonts w:ascii="Arial" w:cs="Arial" w:eastAsia="Arial" w:hAnsi="Arial"/>
-                <w:color w:val="14284B"/>
-                <w:sz w:val="14"/>
-                <w:szCs w:val="14"/>
-              </w:rPr>
-              <w:t xml:space="preserve">The price requires a WACC 285 bp lower</w:t>
-            </w:r>
-          </w:p>
-          <w:p>
-            <w:pPr>
-              <w:spacing w:after="20" w:before="0"/>
-            </w:pPr>
-            <w:r>
-              <w:drawing>
-                <wp:inline distT="0" distB="0" distL="0" distR="0">
-                  <wp:extent cx="2257425" cy="1781175"/>
-                  <wp:effectExtent t="0" r="0" b="0" l="0"/>
-                  <wp:docPr id="1" name="" descr="" title=""/>
-                  <wp:cNvGraphicFramePr>
-                    <a:graphicFrameLocks xmlns:a="http://schemas.openxmlformats.org/drawingml/2006/main" noChangeAspect="1"/>
-                  </wp:cNvGraphicFramePr>
-                  <a:graphic xmlns:a="http://schemas.openxmlformats.org/drawingml/2006/main">
-                    <a:graphicData uri="http://schemas.openxmlformats.org/drawingml/2006/picture">
-                      <pic:pic xmlns:pic="http://schemas.openxmlformats.org/drawingml/2006/picture">
-                        <pic:nvPicPr>
-                          <pic:cNvPr id="0" name="" descr=""/>
-                          <pic:cNvPicPr>
-                            <a:picLocks noChangeAspect="1" noChangeArrowheads="1"/>
-                          </pic:cNvPicPr>
-                        </pic:nvPicPr>
-                        <pic:blipFill>
-                          <a:blip r:embed="rId16" cstate="none"/>
-                          <a:srcRect/>
-                          <a:stretch>
-                            <a:fillRect/>
-                          </a:stretch>
-                        </pic:blipFill>
-                        <pic:spPr bwMode="auto">
-                          <a:xfrm>
-                            <a:off x="0" y="0"/>
                             <a:ext cx="2257425" cy="1781175"/>
                           </a:xfrm>
                           <a:prstGeom prst="rect">
@@ -1451,7 +989,7 @@
                 <w:sz w:val="14"/>
                 <w:szCs w:val="14"/>
               </w:rPr>
-              <w:t xml:space="preserve">Figure 33: </w:t>
+              <w:t xml:space="preserve">Figure 32: </w:t>
             </w:r>
             <w:r>
               <w:rPr>
@@ -1526,7 +1064,7 @@
                 <w:sz w:val="14"/>
                 <w:szCs w:val="14"/>
               </w:rPr>
-              <w:t xml:space="preserve">Figure 34: </w:t>
+              <w:t xml:space="preserve">Figure 33: </w:t>
             </w:r>
             <w:r>
               <w:rPr>
@@ -1561,7 +1099,7 @@
                           </pic:cNvPicPr>
                         </pic:nvPicPr>
                         <pic:blipFill>
-                          <a:blip r:embed="rId17" cstate="none"/>
+                          <a:blip r:embed="rId16" cstate="none"/>
                           <a:srcRect/>
                           <a:stretch>
                             <a:fillRect/>
@@ -1594,7 +1132,7 @@
                 <w:sz w:val="11"/>
                 <w:szCs w:val="11"/>
               </w:rPr>
-              <w:t xml:space="preserve">Target = 80% DCF + 20% EV/EBITDA LTM. P/E excluded (includes property revaluation). Peer set = companies with a WACC beta. Source: Bloomberg (prices at 30-Sep-26); Team analysis.</w:t>
+              <w:t xml:space="preserve">Target = 80% DCF + 20% EV/EBITDA LTM. P/E excluded (includes revaluation). Source: Bloomberg (30-Sep-26); Team analysis.</w:t>
             </w:r>
           </w:p>
         </w:tc>
@@ -9013,7 +8551,7 @@
                           </pic:cNvPicPr>
                         </pic:nvPicPr>
                         <pic:blipFill>
-                          <a:blip r:embed="rId18" cstate="none"/>
+                          <a:blip r:embed="rId17" cstate="none"/>
                           <a:srcRect/>
                           <a:stretch>
                             <a:fillRect/>

</xml_diff>

<commit_message>
Valuation: add value decomposition, implied price analysis, book vs appraisers, scenarios, total return, premium and consensus checks
Co-Authored-By: Claude Opus 5.5 <noreply@anthropic.com>
Claude-Session: https://claude.ai/code/session_0188QZHBkA8n5QL7BtmFakQg
</commit_message>
<xml_diff>
--- a/informe/Mallplaza_Valuacion_EN.docx
+++ b/informe/Mallplaza_Valuacion_EN.docx
@@ -157,7 +157,7 @@
                 <w:sz w:val="16"/>
                 <w:szCs w:val="16"/>
               </w:rPr>
-              <w:t xml:space="preserve">WACC. </w:t>
+              <w:t xml:space="preserve">Value decomposition. </w:t>
             </w:r>
             <w:r>
               <w:rPr>
@@ -166,7 +166,7 @@
                 <w:sz w:val="16"/>
                 <w:szCs w:val="16"/>
               </w:rPr>
-              <w:t xml:space="preserve">It changes by period as net debt/EBITDA converges from 2.36x to 3.5x by 2031 (D/E from 20.0% to 28.5%): 10.54% in 2H26E and 10.41% in the terminal period (7.32% and 7.20% real). Ke is computed in USD and converted to CLP with the inflation differential: Rf 4.98% + beta 1.14 × ERP 4.14% + CRP 1.41% = 11.10% (11.93% in CLP, terminal). The beta relevers the median unlevered beta of six peers (0.94), and the CRP weights sovereign risk by revenue (71.8% Chile, 17.7% Peru and 10.5% Colombia). Kd starts from the latest UF bond coupon (3.6% real) plus 25 bp per turn of leverage above 2.36x: 4.92% after tax in 2H26E and 5.11% in the terminal period. At CLP 3,555, equity yields almost the same as that debt (Figure 28; details in Appendix [Z]).</w:t>
+              <w:t xml:space="preserve">Of the CLP 1,857 per share, CLP 583 comes from explicit cash flows and CLP 1,884 from terminal value, less CLP 587 of net debt and CLP 23 of minorities. With terminal value at 76% of EV, the result depends mostly on the terminal WACC and g rather than forecast detail, which is why the sensitivity focuses on those two variables.</w:t>
             </w:r>
           </w:p>
           <w:p>
@@ -183,7 +183,7 @@
                 <w:sz w:val="16"/>
                 <w:szCs w:val="16"/>
               </w:rPr>
-              <w:t xml:space="preserve">Capital structure. </w:t>
+              <w:t xml:space="preserve">WACC. </w:t>
             </w:r>
             <w:r>
               <w:rPr>
@@ -192,15 +192,13 @@
                 <w:sz w:val="16"/>
                 <w:szCs w:val="16"/>
               </w:rPr>
-              <w:t xml:space="preserve">The company uses its debt capacity to grow, as in 2024 (3.78x after buying Open Plaza Peru): net debt/EBITDA rises from 2.36x to 3.5x by 2031, and new debt (CLP 1.40 trillion) funds all of the period's capex (CLP 1.11 trillion). Operating cash is distributed to shareholders: ordinary dividends plus CLP 1.79 trillion of additional distributions. Debt is cheaper than equity (Kd ~5% after tax versus Ke ~12%) and creates a tax shield; financing does not change the EV, but it sets the WACC structure (Appendix [D]).</w:t>
-            </w:r>
-          </w:p>
-          <w:p>
-            <w:pPr>
-              <w:pBdr>
-                <w:bottom w:val="single" w:color="E9004B" w:sz="8" w:space="1"/>
-              </w:pBdr>
-              <w:spacing w:after="50" w:before="90"/>
+              <w:t xml:space="preserve">It changes by period as net debt/EBITDA converges from 2.36x to 3.5x by 2031 (D/E from 20.0% to 28.5%): 10.54% in 2H26E and 10.41% in the terminal period (7.32% and 7.20% real). Ke is computed in USD and converted to CLP with the inflation differential: Rf 4.98% + beta 1.14 × ERP 4.14% + CRP 1.41% = 11.10% (11.93% in CLP, terminal). The beta relevers the median unlevered beta of six peers (0.94), and the CRP weights sovereign risk by revenue (71.8% Chile, 17.7% Peru and 10.5% Colombia). Kd starts from the latest UF bond coupon (3.6% real) plus 25 bp per turn of leverage above 2.36x: 4.92% after tax in 2H26E and 5.11% in the terminal period. At CLP 3,555, equity yields almost the same as that debt (Figure 28; details in Appendix [Z]).</w:t>
+            </w:r>
+          </w:p>
+          <w:p>
+            <w:pPr>
+              <w:spacing w:after="60" w:before="0" w:line="228" w:lineRule="auto"/>
+              <w:jc w:val="both"/>
             </w:pPr>
             <w:r>
               <w:rPr>
@@ -211,14 +209,8 @@
                 <w:sz w:val="16"/>
                 <w:szCs w:val="16"/>
               </w:rPr>
-              <w:t xml:space="preserve">DCF: OPERATING FORECAST</w:t>
-            </w:r>
-          </w:p>
-          <w:p>
-            <w:pPr>
-              <w:spacing w:after="60" w:before="0" w:line="228" w:lineRule="auto"/>
-              <w:jc w:val="both"/>
-            </w:pPr>
+              <w:t xml:space="preserve">Capital structure. </w:t>
+            </w:r>
             <w:r>
               <w:rPr>
                 <w:rFonts w:ascii="Arial" w:cs="Arial" w:eastAsia="Arial" w:hAnsi="Arial"/>
@@ -226,7 +218,7 @@
                 <w:sz w:val="16"/>
                 <w:szCs w:val="16"/>
               </w:rPr>
-              <w:t xml:space="preserve">Reported EBITDA (CLP 544,935 million LTM, 80.5% margin) excludes property revaluation (IAS 40); we forecast a 79.8% margin through 2031E. The operating tax rate rises from 16.8% in 2026E to 27% in 2030E as existing benefits fade. Base capex (pipeline plus maintenance at 5.5% of revenue) peaks at CLP 240,660 million in 2027 and falls to ~CLP 50,000 million from 2029. From 2029, 27,075 m² also open each year (historical average), with capex of CLP 95,000–104,000 million a year, a 35%/90%/100% ramp and a 6.9% yield on cost, at the cost of the identified pipeline (USD 3,603/m²: 170,200 m² and USD 613.2 million). Working capital (15.6% × Δ revenue) requires CLP 7,100–9,900 million a year and moves the price by only ±1.2% (Appendix [C]).</w:t>
+              <w:t xml:space="preserve">The company uses its debt capacity to grow, as in 2024 (3.78x after buying Open Plaza Peru): net debt/EBITDA rises from 2.36x to 3.5x by 2031, and new debt (CLP 1.40 trillion) funds all of the period's capex (CLP 1.11 trillion). Operating cash is distributed to shareholders: ordinary dividends plus CLP 1.79 trillion of additional distributions. Debt is cheaper than equity (Kd ~5% after tax versus Ke ~12%) and creates a tax shield; financing does not change the EV, but it sets the WACC structure (Appendix [D]).</w:t>
             </w:r>
           </w:p>
           <w:p>
@@ -245,7 +237,7 @@
                 <w:sz w:val="16"/>
                 <w:szCs w:val="16"/>
               </w:rPr>
-              <w:t xml:space="preserve">DCF: TERMINAL VALUE AND IMPLIED CAP RATE</w:t>
+              <w:t xml:space="preserve">DCF: OPERATING FORECAST</w:t>
             </w:r>
           </w:p>
           <w:p>
@@ -260,7 +252,93 @@
                 <w:sz w:val="16"/>
                 <w:szCs w:val="16"/>
               </w:rPr>
+              <w:t xml:space="preserve">Reported EBITDA (CLP 544,935 million LTM, 80.5% margin) excludes property revaluation (IAS 40); we forecast a 79.8% margin through 2031E. The operating tax rate rises from 16.8% in 2026E to 27% in 2030E as existing benefits fade. Base capex (pipeline plus maintenance at 5.5% of revenue) peaks at CLP 240,660 million in 2027 and falls to ~CLP 50,000 million from 2029. From 2029, 27,075 m² also open each year (historical average), with capex of CLP 95,000–104,000 million a year, a 35%/90%/100% ramp and a 6.9% yield on cost, at the cost of the identified pipeline (USD 3,603/m²: 170,200 m² and USD 613.2 million). Working capital (15.6% × Δ revenue) requires CLP 7,100–9,900 million a year and moves the price by only ±1.2% (Appendix [C]).</w:t>
+            </w:r>
+          </w:p>
+          <w:p>
+            <w:pPr>
+              <w:pBdr>
+                <w:bottom w:val="single" w:color="E9004B" w:sz="8" w:space="1"/>
+              </w:pBdr>
+              <w:spacing w:after="50" w:before="90"/>
+            </w:pPr>
+            <w:r>
+              <w:rPr>
+                <w:rFonts w:ascii="Arial" w:cs="Arial" w:eastAsia="Arial" w:hAnsi="Arial"/>
+                <w:b/>
+                <w:bCs/>
+                <w:color w:val="14284B"/>
+                <w:sz w:val="16"/>
+                <w:szCs w:val="16"/>
+              </w:rPr>
+              <w:t xml:space="preserve">DCF: TERMINAL VALUE AND IMPLIED CAP RATE</w:t>
+            </w:r>
+          </w:p>
+          <w:p>
+            <w:pPr>
+              <w:spacing w:after="60" w:before="0" w:line="228" w:lineRule="auto"/>
+              <w:jc w:val="both"/>
+            </w:pPr>
+            <w:r>
+              <w:rPr>
+                <w:rFonts w:ascii="Arial" w:cs="Arial" w:eastAsia="Arial" w:hAnsi="Arial"/>
+                <w:color w:val="1A1A1A"/>
+                <w:sz w:val="16"/>
+                <w:szCs w:val="16"/>
+              </w:rPr>
               <w:t xml:space="preserve">We use g = 3.0% nominal (0% real). The real RONIC on expansion (5.0%) is below the real WACC (7.2%): growing beyond the horizon destroys value and a higher g lowers it (Figure 29). The DCF implies a cap rate of 10.1% on EV and 11.3% on terminal value, versus 6.0% for the market, 6.4% for Chilean peers, 7.5% at book value and 5.55% for the appraisers (Note 11) (Figure 30). That gap is not an inconsistency: it is the core of the thesis. To justify the current price, the WACC would have to be 285 bp lower (Figure 31).</w:t>
+            </w:r>
+          </w:p>
+          <w:p>
+            <w:pPr>
+              <w:spacing w:after="60" w:before="0" w:line="228" w:lineRule="auto"/>
+              <w:jc w:val="both"/>
+            </w:pPr>
+            <w:r>
+              <w:rPr>
+                <w:rFonts w:ascii="Arial" w:cs="Arial" w:eastAsia="Arial" w:hAnsi="Arial"/>
+                <w:b/>
+                <w:bCs/>
+                <w:color w:val="14284B"/>
+                <w:sz w:val="16"/>
+                <w:szCs w:val="16"/>
+              </w:rPr>
+              <w:t xml:space="preserve">What the price discounts. </w:t>
+            </w:r>
+            <w:r>
+              <w:rPr>
+                <w:rFonts w:ascii="Arial" w:cs="Arial" w:eastAsia="Arial" w:hAnsi="Arial"/>
+                <w:color w:val="1A1A1A"/>
+                <w:sz w:val="16"/>
+                <w:szCs w:val="16"/>
+              </w:rPr>
+              <w:t xml:space="preserve">At CLP 3,555 the implied EV is CLP 9.12 trillion, 69% above our EV (CLP 5.40 trillion): 16.7x LTM EBITDA, a 6.0% cap rate. Justifying it would require cash flows 69% higher forever or a 7.56% WACC, equivalent to ~4.4% real, just 80 bp above the company's own real Kd (3.6%): the price leaves equity with almost no risk premium. And since RONIC is below the WACC, assuming more growth does not close the gap, it widens it.</w:t>
+            </w:r>
+          </w:p>
+          <w:p>
+            <w:pPr>
+              <w:spacing w:after="60" w:before="0" w:line="228" w:lineRule="auto"/>
+              <w:jc w:val="both"/>
+            </w:pPr>
+            <w:r>
+              <w:rPr>
+                <w:rFonts w:ascii="Arial" w:cs="Arial" w:eastAsia="Arial" w:hAnsi="Arial"/>
+                <w:b/>
+                <w:bCs/>
+                <w:color w:val="14284B"/>
+                <w:sz w:val="16"/>
+                <w:szCs w:val="16"/>
+              </w:rPr>
+              <w:t xml:space="preserve">Book value and appraisers. </w:t>
+            </w:r>
+            <w:r>
+              <w:rPr>
+                <w:rFonts w:ascii="Arial" w:cs="Arial" w:eastAsia="Arial" w:hAnsi="Arial"/>
+                <w:color w:val="1A1A1A"/>
+                <w:sz w:val="16"/>
+                <w:szCs w:val="16"/>
+              </w:rPr>
+              <w:t xml:space="preserve">Book equity (CLP 2,201 per share) already carries properties at fair value, appraised at a ~5.55% real rate (Note 11). The market pays 1.61x that value, more than the appraisers themselves, even allowing for deferred taxes reducing book equity; our target price implies 0.94x. Even discounting at the appraisers' rate (8.72% nominal WACC), the DCF would be CLP 2,660, 25% below the price.</w:t>
             </w:r>
           </w:p>
         </w:tc>
@@ -650,10 +728,8 @@
           </w:p>
           <w:p>
             <w:pPr>
-              <w:pBdr>
-                <w:bottom w:val="single" w:color="E9004B" w:sz="8" w:space="1"/>
-              </w:pBdr>
-              <w:spacing w:after="50" w:before="90"/>
+              <w:spacing w:after="60" w:before="0" w:line="228" w:lineRule="auto"/>
+              <w:jc w:val="both"/>
             </w:pPr>
             <w:r>
               <w:rPr>
@@ -664,7 +740,16 @@
                 <w:sz w:val="16"/>
                 <w:szCs w:val="16"/>
               </w:rPr>
-              <w:t xml:space="preserve">VALUATION SENSITIVITY AND RISKS</w:t>
+              <w:t xml:space="preserve">Is the premium justified? </w:t>
+            </w:r>
+            <w:r>
+              <w:rPr>
+                <w:rFonts w:ascii="Arial" w:cs="Arial" w:eastAsia="Arial" w:hAnsi="Arial"/>
+                <w:color w:val="1A1A1A"/>
+                <w:sz w:val="16"/>
+                <w:szCs w:val="16"/>
+              </w:rPr>
+              <w:t xml:space="preserve">Mallplaza trades 29% above Cencosud Shopping (13.0x), yet its EBITDA per m² is only 1.8% higher (CLP 59,451 vs 58,384 in 2Q26; see Industry). Only at Parque Arauco's multiple (18.4x) would the stock be worth more than its price (CLP 3,967), and Parque Arauco runs at 5.7x net debt/EBITDA with its own pipeline, which are not comparable. At Cencosud's multiple it would be worth CLP 2,621.</w:t>
             </w:r>
           </w:p>
           <w:p>
@@ -681,7 +766,7 @@
                 <w:sz w:val="16"/>
                 <w:szCs w:val="16"/>
               </w:rPr>
-              <w:t xml:space="preserve">Sensitivity. </w:t>
+              <w:t xml:space="preserve">The disagreement is about the rate, not the cash flows. </w:t>
             </w:r>
             <w:r>
               <w:rPr>
@@ -690,13 +775,15 @@
                 <w:sz w:val="16"/>
                 <w:szCs w:val="16"/>
               </w:rPr>
-              <w:t xml:space="preserve">With WACC ±100 bp and g between 2.5% and 4.0%, the DCF ranges from CLP 1,379 to 2,329 (Figure 25; Appendix [F]), and the historical worst operating case takes 10.0% off (Figure 24). Every multiple sits below the price: EV/EBITDA LTM CLP 2,951 (−17%), NTM CLP 2,914 (−18%), EV/EBIT CLP 3,098 (−13%), P/BV CLP 3,171 (−11%) and the Chilean median alone CLP 3,294 (−7%) (Figure 27).</w:t>
-            </w:r>
-          </w:p>
-          <w:p>
-            <w:pPr>
-              <w:spacing w:after="60" w:before="0" w:line="228" w:lineRule="auto"/>
-              <w:jc w:val="both"/>
+              <w:t xml:space="preserve">The 13-analyst consensus forecasts NTM EBITDA of CLP 617,130 million, ~3% above our forecast for the same period (~CLP 598,850 million). Our cash flows are not more pessimistic than the market's: the value gap comes from the discount rate the price implies.</w:t>
+            </w:r>
+          </w:p>
+          <w:p>
+            <w:pPr>
+              <w:pBdr>
+                <w:bottom w:val="single" w:color="E9004B" w:sz="8" w:space="1"/>
+              </w:pBdr>
+              <w:spacing w:after="50" w:before="90"/>
             </w:pPr>
             <w:r>
               <w:rPr>
@@ -707,16 +794,7 @@
                 <w:sz w:val="16"/>
                 <w:szCs w:val="16"/>
               </w:rPr>
-              <w:t xml:space="preserve">Robustness. </w:t>
-            </w:r>
-            <w:r>
-              <w:rPr>
-                <w:rFonts w:ascii="Arial" w:cs="Arial" w:eastAsia="Arial" w:hAnsi="Arial"/>
-                <w:color w:val="1A1A1A"/>
-                <w:sz w:val="16"/>
-                <w:szCs w:val="16"/>
-              </w:rPr>
-              <w:t xml:space="preserve">APV gives CLP 1,894 (2% above the DCF); with the peso bond as Rf, the target price rises to ~CLP 2,439 (−31%; Appendix [Z]); and with a net debt/EBITDA target between 2.36x and 4.0x, the DCF ranges from CLP 1,819 to 1,894.</w:t>
+              <w:t xml:space="preserve">VALUATION SENSITIVITY AND RISKS</w:t>
             </w:r>
           </w:p>
           <w:p>
@@ -733,7 +811,7 @@
                 <w:sz w:val="16"/>
                 <w:szCs w:val="16"/>
               </w:rPr>
-              <w:t xml:space="preserve">Target price. </w:t>
+              <w:t xml:space="preserve">Sensitivity. </w:t>
             </w:r>
             <w:r>
               <w:rPr>
@@ -742,7 +820,1065 @@
                 <w:sz w:val="16"/>
                 <w:szCs w:val="16"/>
               </w:rPr>
+              <w:t xml:space="preserve">With WACC ±100 bp and g between 2.5% and 4.0%, the DCF ranges from CLP 1,379 to 2,329 (Figure 25; Appendix [F]), and the historical worst operating case takes 10.0% off (Figure 24). Every multiple sits below the price: EV/EBITDA LTM CLP 2,951 (−17%), NTM CLP 2,914 (−18%), EV/EBIT CLP 3,098 (−13%), P/BV CLP 3,171 (−11%) and the Chilean median alone CLP 3,294 (−7%) (Figure 27).</w:t>
+            </w:r>
+          </w:p>
+          <w:p>
+            <w:pPr>
+              <w:spacing w:after="60" w:before="0" w:line="228" w:lineRule="auto"/>
+              <w:jc w:val="both"/>
+            </w:pPr>
+            <w:r>
+              <w:rPr>
+                <w:rFonts w:ascii="Arial" w:cs="Arial" w:eastAsia="Arial" w:hAnsi="Arial"/>
+                <w:b/>
+                <w:bCs/>
+                <w:color w:val="14284B"/>
+                <w:sz w:val="16"/>
+                <w:szCs w:val="16"/>
+              </w:rPr>
+              <w:t xml:space="preserve">Robustness. </w:t>
+            </w:r>
+            <w:r>
+              <w:rPr>
+                <w:rFonts w:ascii="Arial" w:cs="Arial" w:eastAsia="Arial" w:hAnsi="Arial"/>
+                <w:color w:val="1A1A1A"/>
+                <w:sz w:val="16"/>
+                <w:szCs w:val="16"/>
+              </w:rPr>
+              <w:t xml:space="preserve">APV gives CLP 1,894 (2% above the DCF); with the peso bond as Rf, the target price rises to ~CLP 2,439 (−31%; Appendix [Z]); and with a net debt/EBITDA target between 2.36x and 4.0x, the DCF ranges from CLP 1,819 to 1,894.</w:t>
+            </w:r>
+          </w:p>
+          <w:p>
+            <w:pPr>
+              <w:spacing w:after="60" w:before="0" w:line="228" w:lineRule="auto"/>
+              <w:jc w:val="both"/>
+            </w:pPr>
+            <w:r>
+              <w:rPr>
+                <w:rFonts w:ascii="Arial" w:cs="Arial" w:eastAsia="Arial" w:hAnsi="Arial"/>
+                <w:b/>
+                <w:bCs/>
+                <w:color w:val="14284B"/>
+                <w:sz w:val="16"/>
+                <w:szCs w:val="16"/>
+              </w:rPr>
+              <w:t xml:space="preserve">Scenarios. </w:t>
+            </w:r>
+            <w:r>
+              <w:rPr>
+                <w:rFonts w:ascii="Arial" w:cs="Arial" w:eastAsia="Arial" w:hAnsi="Arial"/>
+                <w:color w:val="1A1A1A"/>
+                <w:sz w:val="16"/>
+                <w:szCs w:val="16"/>
+              </w:rPr>
+              <w:t xml:space="preserve">We combine the most favourable and most adverse assumptions. In the bull case a lower g raises value because RONIC is below the WACC. Neither the bull case nor the appraisers' rate reaches the price:</w:t>
+            </w:r>
+          </w:p>
+          <w:tbl>
+            <w:tblPr>
+              <w:tblW w:type="dxa" w:w="6900"/>
+              <w:tblBorders>
+                <w:top w:val="none" w:color="FFFFFF" w:sz="0"/>
+                <w:left w:val="none" w:color="FFFFFF" w:sz="0"/>
+                <w:bottom w:val="none" w:color="FFFFFF" w:sz="0"/>
+                <w:right w:val="none" w:color="FFFFFF" w:sz="0"/>
+                <w:insideH w:val="none" w:color="FFFFFF" w:sz="0"/>
+                <w:insideV w:val="none" w:color="FFFFFF" w:sz="0"/>
+              </w:tblBorders>
+            </w:tblPr>
+            <w:tblGrid>
+              <w:gridCol w:w="1050"/>
+              <w:gridCol w:w="3450"/>
+              <w:gridCol w:w="750"/>
+              <w:gridCol w:w="900"/>
+              <w:gridCol w:w="750"/>
+            </w:tblGrid>
+            <w:tr>
+              <w:trPr>
+                <w:tblHeader/>
+              </w:trPr>
+              <w:tc>
+                <w:tcPr>
+                  <w:tcW w:type="dxa" w:w="1050"/>
+                  <w:tcBorders>
+                    <w:top w:val="none" w:color="FFFFFF" w:sz="0"/>
+                    <w:left w:val="none" w:color="FFFFFF" w:sz="0"/>
+                    <w:bottom w:val="none" w:color="FFFFFF" w:sz="0"/>
+                    <w:right w:val="none" w:color="FFFFFF" w:sz="0"/>
+                  </w:tcBorders>
+                  <w:shd w:fill="14284B" w:color="auto" w:val="clear"/>
+                  <w:tcMar>
+                    <w:top w:type="dxa" w:w="35"/>
+                    <w:left w:type="dxa" w:w="80"/>
+                    <w:bottom w:type="dxa" w:w="35"/>
+                    <w:right w:type="dxa" w:w="80"/>
+                  </w:tcMar>
+                </w:tcPr>
+                <w:p>
+                  <w:pPr>
+                    <w:jc w:val="left"/>
+                  </w:pPr>
+                  <w:r>
+                    <w:rPr>
+                      <w:rFonts w:ascii="Arial" w:cs="Arial" w:eastAsia="Arial" w:hAnsi="Arial"/>
+                      <w:b/>
+                      <w:bCs/>
+                      <w:color w:val="FFFFFF"/>
+                      <w:sz w:val="13"/>
+                      <w:szCs w:val="13"/>
+                    </w:rPr>
+                    <w:t xml:space="preserve">Scenario</w:t>
+                  </w:r>
+                </w:p>
+              </w:tc>
+              <w:tc>
+                <w:tcPr>
+                  <w:tcW w:type="dxa" w:w="3450"/>
+                  <w:tcBorders>
+                    <w:top w:val="none" w:color="FFFFFF" w:sz="0"/>
+                    <w:left w:val="none" w:color="FFFFFF" w:sz="0"/>
+                    <w:bottom w:val="none" w:color="FFFFFF" w:sz="0"/>
+                    <w:right w:val="none" w:color="FFFFFF" w:sz="0"/>
+                  </w:tcBorders>
+                  <w:shd w:fill="14284B" w:color="auto" w:val="clear"/>
+                  <w:tcMar>
+                    <w:top w:type="dxa" w:w="35"/>
+                    <w:left w:type="dxa" w:w="80"/>
+                    <w:bottom w:type="dxa" w:w="35"/>
+                    <w:right w:type="dxa" w:w="80"/>
+                  </w:tcMar>
+                </w:tcPr>
+                <w:p>
+                  <w:pPr>
+                    <w:jc w:val="left"/>
+                  </w:pPr>
+                  <w:r>
+                    <w:rPr>
+                      <w:rFonts w:ascii="Arial" w:cs="Arial" w:eastAsia="Arial" w:hAnsi="Arial"/>
+                      <w:b/>
+                      <w:bCs/>
+                      <w:color w:val="FFFFFF"/>
+                      <w:sz w:val="13"/>
+                      <w:szCs w:val="13"/>
+                    </w:rPr>
+                    <w:t xml:space="preserve">Assumptions</w:t>
+                  </w:r>
+                </w:p>
+              </w:tc>
+              <w:tc>
+                <w:tcPr>
+                  <w:tcW w:type="dxa" w:w="750"/>
+                  <w:tcBorders>
+                    <w:top w:val="none" w:color="FFFFFF" w:sz="0"/>
+                    <w:left w:val="none" w:color="FFFFFF" w:sz="0"/>
+                    <w:bottom w:val="none" w:color="FFFFFF" w:sz="0"/>
+                    <w:right w:val="none" w:color="FFFFFF" w:sz="0"/>
+                  </w:tcBorders>
+                  <w:shd w:fill="14284B" w:color="auto" w:val="clear"/>
+                  <w:tcMar>
+                    <w:top w:type="dxa" w:w="35"/>
+                    <w:left w:type="dxa" w:w="80"/>
+                    <w:bottom w:type="dxa" w:w="35"/>
+                    <w:right w:type="dxa" w:w="80"/>
+                  </w:tcMar>
+                </w:tcPr>
+                <w:p>
+                  <w:pPr>
+                    <w:jc w:val="right"/>
+                  </w:pPr>
+                  <w:r>
+                    <w:rPr>
+                      <w:rFonts w:ascii="Arial" w:cs="Arial" w:eastAsia="Arial" w:hAnsi="Arial"/>
+                      <w:b/>
+                      <w:bCs/>
+                      <w:color w:val="FFFFFF"/>
+                      <w:sz w:val="13"/>
+                      <w:szCs w:val="13"/>
+                    </w:rPr>
+                    <w:t xml:space="preserve">DCF</w:t>
+                  </w:r>
+                </w:p>
+              </w:tc>
+              <w:tc>
+                <w:tcPr>
+                  <w:tcW w:type="dxa" w:w="900"/>
+                  <w:tcBorders>
+                    <w:top w:val="none" w:color="FFFFFF" w:sz="0"/>
+                    <w:left w:val="none" w:color="FFFFFF" w:sz="0"/>
+                    <w:bottom w:val="none" w:color="FFFFFF" w:sz="0"/>
+                    <w:right w:val="none" w:color="FFFFFF" w:sz="0"/>
+                  </w:tcBorders>
+                  <w:shd w:fill="14284B" w:color="auto" w:val="clear"/>
+                  <w:tcMar>
+                    <w:top w:type="dxa" w:w="35"/>
+                    <w:left w:type="dxa" w:w="80"/>
+                    <w:bottom w:type="dxa" w:w="35"/>
+                    <w:right w:type="dxa" w:w="80"/>
+                  </w:tcMar>
+                </w:tcPr>
+                <w:p>
+                  <w:pPr>
+                    <w:jc w:val="right"/>
+                  </w:pPr>
+                  <w:r>
+                    <w:rPr>
+                      <w:rFonts w:ascii="Arial" w:cs="Arial" w:eastAsia="Arial" w:hAnsi="Arial"/>
+                      <w:b/>
+                      <w:bCs/>
+                      <w:color w:val="FFFFFF"/>
+                      <w:sz w:val="13"/>
+                      <w:szCs w:val="13"/>
+                    </w:rPr>
+                    <w:t xml:space="preserve">Target</w:t>
+                  </w:r>
+                </w:p>
+              </w:tc>
+              <w:tc>
+                <w:tcPr>
+                  <w:tcW w:type="dxa" w:w="750"/>
+                  <w:tcBorders>
+                    <w:top w:val="none" w:color="FFFFFF" w:sz="0"/>
+                    <w:left w:val="none" w:color="FFFFFF" w:sz="0"/>
+                    <w:bottom w:val="none" w:color="FFFFFF" w:sz="0"/>
+                    <w:right w:val="none" w:color="FFFFFF" w:sz="0"/>
+                  </w:tcBorders>
+                  <w:shd w:fill="14284B" w:color="auto" w:val="clear"/>
+                  <w:tcMar>
+                    <w:top w:type="dxa" w:w="35"/>
+                    <w:left w:type="dxa" w:w="80"/>
+                    <w:bottom w:type="dxa" w:w="35"/>
+                    <w:right w:type="dxa" w:w="80"/>
+                  </w:tcMar>
+                </w:tcPr>
+                <w:p>
+                  <w:pPr>
+                    <w:jc w:val="right"/>
+                  </w:pPr>
+                  <w:r>
+                    <w:rPr>
+                      <w:rFonts w:ascii="Arial" w:cs="Arial" w:eastAsia="Arial" w:hAnsi="Arial"/>
+                      <w:b/>
+                      <w:bCs/>
+                      <w:color w:val="FFFFFF"/>
+                      <w:sz w:val="13"/>
+                      <w:szCs w:val="13"/>
+                    </w:rPr>
+                    <w:t xml:space="preserve">vs price</w:t>
+                  </w:r>
+                </w:p>
+              </w:tc>
+            </w:tr>
+            <w:tr>
+              <w:tc>
+                <w:tcPr>
+                  <w:tcW w:type="dxa" w:w="1050"/>
+                  <w:tcBorders>
+                    <w:top w:val="none" w:color="FFFFFF" w:sz="0"/>
+                    <w:left w:val="none" w:color="FFFFFF" w:sz="0"/>
+                    <w:bottom w:val="single" w:color="D5D9E0" w:sz="4"/>
+                    <w:right w:val="none" w:color="FFFFFF" w:sz="0"/>
+                  </w:tcBorders>
+                  <w:shd w:fill="F7F8FB" w:color="auto" w:val="clear"/>
+                  <w:tcMar>
+                    <w:top w:type="dxa" w:w="25"/>
+                    <w:left w:type="dxa" w:w="80"/>
+                    <w:bottom w:type="dxa" w:w="25"/>
+                    <w:right w:type="dxa" w:w="80"/>
+                  </w:tcMar>
+                  <w:vAlign w:val="center"/>
+                </w:tcPr>
+                <w:p>
+                  <w:pPr>
+                    <w:spacing w:line="216" w:lineRule="auto"/>
+                    <w:jc w:val="left"/>
+                  </w:pPr>
+                  <w:r>
+                    <w:rPr>
+                      <w:rFonts w:ascii="Arial" w:cs="Arial" w:eastAsia="Arial" w:hAnsi="Arial"/>
+                      <w:b w:val="false"/>
+                      <w:bCs w:val="false"/>
+                      <w:color w:val="1A1A1A"/>
+                      <w:sz w:val="13"/>
+                      <w:szCs w:val="13"/>
+                    </w:rPr>
+                    <w:t xml:space="preserve">Bear</w:t>
+                  </w:r>
+                </w:p>
+              </w:tc>
+              <w:tc>
+                <w:tcPr>
+                  <w:tcW w:type="dxa" w:w="3450"/>
+                  <w:tcBorders>
+                    <w:top w:val="none" w:color="FFFFFF" w:sz="0"/>
+                    <w:left w:val="none" w:color="FFFFFF" w:sz="0"/>
+                    <w:bottom w:val="single" w:color="D5D9E0" w:sz="4"/>
+                    <w:right w:val="none" w:color="FFFFFF" w:sz="0"/>
+                  </w:tcBorders>
+                  <w:shd w:fill="F7F8FB" w:color="auto" w:val="clear"/>
+                  <w:tcMar>
+                    <w:top w:type="dxa" w:w="25"/>
+                    <w:left w:type="dxa" w:w="80"/>
+                    <w:bottom w:type="dxa" w:w="25"/>
+                    <w:right w:type="dxa" w:w="80"/>
+                  </w:tcMar>
+                  <w:vAlign w:val="center"/>
+                </w:tcPr>
+                <w:p>
+                  <w:pPr>
+                    <w:spacing w:line="216" w:lineRule="auto"/>
+                    <w:jc w:val="left"/>
+                  </w:pPr>
+                  <w:r>
+                    <w:rPr>
+                      <w:rFonts w:ascii="Arial" w:cs="Arial" w:eastAsia="Arial" w:hAnsi="Arial"/>
+                      <w:b w:val="false"/>
+                      <w:bCs w:val="false"/>
+                      <w:color w:val="1A1A1A"/>
+                      <w:sz w:val="13"/>
+                      <w:szCs w:val="13"/>
+                    </w:rPr>
+                    <w:t xml:space="preserve">WACC +100 bp; EBITDA margin 75.8% (historical low)</w:t>
+                  </w:r>
+                </w:p>
+              </w:tc>
+              <w:tc>
+                <w:tcPr>
+                  <w:tcW w:type="dxa" w:w="750"/>
+                  <w:tcBorders>
+                    <w:top w:val="none" w:color="FFFFFF" w:sz="0"/>
+                    <w:left w:val="none" w:color="FFFFFF" w:sz="0"/>
+                    <w:bottom w:val="single" w:color="D5D9E0" w:sz="4"/>
+                    <w:right w:val="none" w:color="FFFFFF" w:sz="0"/>
+                  </w:tcBorders>
+                  <w:shd w:fill="F7F8FB" w:color="auto" w:val="clear"/>
+                  <w:tcMar>
+                    <w:top w:type="dxa" w:w="25"/>
+                    <w:left w:type="dxa" w:w="80"/>
+                    <w:bottom w:type="dxa" w:w="25"/>
+                    <w:right w:type="dxa" w:w="80"/>
+                  </w:tcMar>
+                  <w:vAlign w:val="center"/>
+                </w:tcPr>
+                <w:p>
+                  <w:pPr>
+                    <w:spacing w:line="216" w:lineRule="auto"/>
+                    <w:jc w:val="right"/>
+                  </w:pPr>
+                  <w:r>
+                    <w:rPr>
+                      <w:rFonts w:ascii="Arial" w:cs="Arial" w:eastAsia="Arial" w:hAnsi="Arial"/>
+                      <w:b w:val="false"/>
+                      <w:bCs w:val="false"/>
+                      <w:color w:val="1A1A1A"/>
+                      <w:sz w:val="13"/>
+                      <w:szCs w:val="13"/>
+                    </w:rPr>
+                    <w:t xml:space="preserve">1,402</w:t>
+                  </w:r>
+                </w:p>
+              </w:tc>
+              <w:tc>
+                <w:tcPr>
+                  <w:tcW w:type="dxa" w:w="900"/>
+                  <w:tcBorders>
+                    <w:top w:val="none" w:color="FFFFFF" w:sz="0"/>
+                    <w:left w:val="none" w:color="FFFFFF" w:sz="0"/>
+                    <w:bottom w:val="single" w:color="D5D9E0" w:sz="4"/>
+                    <w:right w:val="none" w:color="FFFFFF" w:sz="0"/>
+                  </w:tcBorders>
+                  <w:shd w:fill="F7F8FB" w:color="auto" w:val="clear"/>
+                  <w:tcMar>
+                    <w:top w:type="dxa" w:w="25"/>
+                    <w:left w:type="dxa" w:w="80"/>
+                    <w:bottom w:type="dxa" w:w="25"/>
+                    <w:right w:type="dxa" w:w="80"/>
+                  </w:tcMar>
+                  <w:vAlign w:val="center"/>
+                </w:tcPr>
+                <w:p>
+                  <w:pPr>
+                    <w:spacing w:line="216" w:lineRule="auto"/>
+                    <w:jc w:val="right"/>
+                  </w:pPr>
+                  <w:r>
+                    <w:rPr>
+                      <w:rFonts w:ascii="Arial" w:cs="Arial" w:eastAsia="Arial" w:hAnsi="Arial"/>
+                      <w:b w:val="false"/>
+                      <w:bCs w:val="false"/>
+                      <w:color w:val="1A1A1A"/>
+                      <w:sz w:val="13"/>
+                      <w:szCs w:val="13"/>
+                    </w:rPr>
+                    <w:t xml:space="preserve">1,712</w:t>
+                  </w:r>
+                </w:p>
+              </w:tc>
+              <w:tc>
+                <w:tcPr>
+                  <w:tcW w:type="dxa" w:w="750"/>
+                  <w:tcBorders>
+                    <w:top w:val="none" w:color="FFFFFF" w:sz="0"/>
+                    <w:left w:val="none" w:color="FFFFFF" w:sz="0"/>
+                    <w:bottom w:val="single" w:color="D5D9E0" w:sz="4"/>
+                    <w:right w:val="none" w:color="FFFFFF" w:sz="0"/>
+                  </w:tcBorders>
+                  <w:shd w:fill="F7F8FB" w:color="auto" w:val="clear"/>
+                  <w:tcMar>
+                    <w:top w:type="dxa" w:w="25"/>
+                    <w:left w:type="dxa" w:w="80"/>
+                    <w:bottom w:type="dxa" w:w="25"/>
+                    <w:right w:type="dxa" w:w="80"/>
+                  </w:tcMar>
+                  <w:vAlign w:val="center"/>
+                </w:tcPr>
+                <w:p>
+                  <w:pPr>
+                    <w:spacing w:line="216" w:lineRule="auto"/>
+                    <w:jc w:val="right"/>
+                  </w:pPr>
+                  <w:r>
+                    <w:rPr>
+                      <w:rFonts w:ascii="Arial" w:cs="Arial" w:eastAsia="Arial" w:hAnsi="Arial"/>
+                      <w:b w:val="false"/>
+                      <w:bCs w:val="false"/>
+                      <w:color w:val="1A1A1A"/>
+                      <w:sz w:val="13"/>
+                      <w:szCs w:val="13"/>
+                    </w:rPr>
+                    <w:t xml:space="preserve">−51.9%</w:t>
+                  </w:r>
+                </w:p>
+              </w:tc>
+            </w:tr>
+            <w:tr>
+              <w:tc>
+                <w:tcPr>
+                  <w:tcW w:type="dxa" w:w="1050"/>
+                  <w:tcBorders>
+                    <w:top w:val="none" w:color="FFFFFF" w:sz="0"/>
+                    <w:left w:val="none" w:color="FFFFFF" w:sz="0"/>
+                    <w:bottom w:val="single" w:color="D5D9E0" w:sz="4"/>
+                    <w:right w:val="none" w:color="FFFFFF" w:sz="0"/>
+                  </w:tcBorders>
+                  <w:shd w:fill="FDF1CC" w:color="auto" w:val="clear"/>
+                  <w:tcMar>
+                    <w:top w:type="dxa" w:w="25"/>
+                    <w:left w:type="dxa" w:w="80"/>
+                    <w:bottom w:type="dxa" w:w="25"/>
+                    <w:right w:type="dxa" w:w="80"/>
+                  </w:tcMar>
+                  <w:vAlign w:val="center"/>
+                </w:tcPr>
+                <w:p>
+                  <w:pPr>
+                    <w:spacing w:line="216" w:lineRule="auto"/>
+                    <w:jc w:val="left"/>
+                  </w:pPr>
+                  <w:r>
+                    <w:rPr>
+                      <w:rFonts w:ascii="Arial" w:cs="Arial" w:eastAsia="Arial" w:hAnsi="Arial"/>
+                      <w:b/>
+                      <w:bCs/>
+                      <w:color w:val="1A1A1A"/>
+                      <w:sz w:val="13"/>
+                      <w:szCs w:val="13"/>
+                    </w:rPr>
+                    <w:t xml:space="preserve">Base</w:t>
+                  </w:r>
+                </w:p>
+              </w:tc>
+              <w:tc>
+                <w:tcPr>
+                  <w:tcW w:type="dxa" w:w="3450"/>
+                  <w:tcBorders>
+                    <w:top w:val="none" w:color="FFFFFF" w:sz="0"/>
+                    <w:left w:val="none" w:color="FFFFFF" w:sz="0"/>
+                    <w:bottom w:val="single" w:color="D5D9E0" w:sz="4"/>
+                    <w:right w:val="none" w:color="FFFFFF" w:sz="0"/>
+                  </w:tcBorders>
+                  <w:shd w:fill="FDF1CC" w:color="auto" w:val="clear"/>
+                  <w:tcMar>
+                    <w:top w:type="dxa" w:w="25"/>
+                    <w:left w:type="dxa" w:w="80"/>
+                    <w:bottom w:type="dxa" w:w="25"/>
+                    <w:right w:type="dxa" w:w="80"/>
+                  </w:tcMar>
+                  <w:vAlign w:val="center"/>
+                </w:tcPr>
+                <w:p>
+                  <w:pPr>
+                    <w:spacing w:line="216" w:lineRule="auto"/>
+                    <w:jc w:val="left"/>
+                  </w:pPr>
+                  <w:r>
+                    <w:rPr>
+                      <w:rFonts w:ascii="Arial" w:cs="Arial" w:eastAsia="Arial" w:hAnsi="Arial"/>
+                      <w:b/>
+                      <w:bCs/>
+                      <w:color w:val="1A1A1A"/>
+                      <w:sz w:val="13"/>
+                      <w:szCs w:val="13"/>
+                    </w:rPr>
+                    <w:t xml:space="preserve">Model v2</w:t>
+                  </w:r>
+                </w:p>
+              </w:tc>
+              <w:tc>
+                <w:tcPr>
+                  <w:tcW w:type="dxa" w:w="750"/>
+                  <w:tcBorders>
+                    <w:top w:val="none" w:color="FFFFFF" w:sz="0"/>
+                    <w:left w:val="none" w:color="FFFFFF" w:sz="0"/>
+                    <w:bottom w:val="single" w:color="D5D9E0" w:sz="4"/>
+                    <w:right w:val="none" w:color="FFFFFF" w:sz="0"/>
+                  </w:tcBorders>
+                  <w:shd w:fill="FDF1CC" w:color="auto" w:val="clear"/>
+                  <w:tcMar>
+                    <w:top w:type="dxa" w:w="25"/>
+                    <w:left w:type="dxa" w:w="80"/>
+                    <w:bottom w:type="dxa" w:w="25"/>
+                    <w:right w:type="dxa" w:w="80"/>
+                  </w:tcMar>
+                  <w:vAlign w:val="center"/>
+                </w:tcPr>
+                <w:p>
+                  <w:pPr>
+                    <w:spacing w:line="216" w:lineRule="auto"/>
+                    <w:jc w:val="right"/>
+                  </w:pPr>
+                  <w:r>
+                    <w:rPr>
+                      <w:rFonts w:ascii="Arial" w:cs="Arial" w:eastAsia="Arial" w:hAnsi="Arial"/>
+                      <w:b/>
+                      <w:bCs/>
+                      <w:color w:val="1A1A1A"/>
+                      <w:sz w:val="13"/>
+                      <w:szCs w:val="13"/>
+                    </w:rPr>
+                    <w:t xml:space="preserve">1,857</w:t>
+                  </w:r>
+                </w:p>
+              </w:tc>
+              <w:tc>
+                <w:tcPr>
+                  <w:tcW w:type="dxa" w:w="900"/>
+                  <w:tcBorders>
+                    <w:top w:val="none" w:color="FFFFFF" w:sz="0"/>
+                    <w:left w:val="none" w:color="FFFFFF" w:sz="0"/>
+                    <w:bottom w:val="single" w:color="D5D9E0" w:sz="4"/>
+                    <w:right w:val="none" w:color="FFFFFF" w:sz="0"/>
+                  </w:tcBorders>
+                  <w:shd w:fill="FDF1CC" w:color="auto" w:val="clear"/>
+                  <w:tcMar>
+                    <w:top w:type="dxa" w:w="25"/>
+                    <w:left w:type="dxa" w:w="80"/>
+                    <w:bottom w:type="dxa" w:w="25"/>
+                    <w:right w:type="dxa" w:w="80"/>
+                  </w:tcMar>
+                  <w:vAlign w:val="center"/>
+                </w:tcPr>
+                <w:p>
+                  <w:pPr>
+                    <w:spacing w:line="216" w:lineRule="auto"/>
+                    <w:jc w:val="right"/>
+                  </w:pPr>
+                  <w:r>
+                    <w:rPr>
+                      <w:rFonts w:ascii="Arial" w:cs="Arial" w:eastAsia="Arial" w:hAnsi="Arial"/>
+                      <w:b/>
+                      <w:bCs/>
+                      <w:color w:val="1A1A1A"/>
+                      <w:sz w:val="13"/>
+                      <w:szCs w:val="13"/>
+                    </w:rPr>
+                    <w:t xml:space="preserve">2,076</w:t>
+                  </w:r>
+                </w:p>
+              </w:tc>
+              <w:tc>
+                <w:tcPr>
+                  <w:tcW w:type="dxa" w:w="750"/>
+                  <w:tcBorders>
+                    <w:top w:val="none" w:color="FFFFFF" w:sz="0"/>
+                    <w:left w:val="none" w:color="FFFFFF" w:sz="0"/>
+                    <w:bottom w:val="single" w:color="D5D9E0" w:sz="4"/>
+                    <w:right w:val="none" w:color="FFFFFF" w:sz="0"/>
+                  </w:tcBorders>
+                  <w:shd w:fill="FDF1CC" w:color="auto" w:val="clear"/>
+                  <w:tcMar>
+                    <w:top w:type="dxa" w:w="25"/>
+                    <w:left w:type="dxa" w:w="80"/>
+                    <w:bottom w:type="dxa" w:w="25"/>
+                    <w:right w:type="dxa" w:w="80"/>
+                  </w:tcMar>
+                  <w:vAlign w:val="center"/>
+                </w:tcPr>
+                <w:p>
+                  <w:pPr>
+                    <w:spacing w:line="216" w:lineRule="auto"/>
+                    <w:jc w:val="right"/>
+                  </w:pPr>
+                  <w:r>
+                    <w:rPr>
+                      <w:rFonts w:ascii="Arial" w:cs="Arial" w:eastAsia="Arial" w:hAnsi="Arial"/>
+                      <w:b/>
+                      <w:bCs/>
+                      <w:color w:val="1A1A1A"/>
+                      <w:sz w:val="13"/>
+                      <w:szCs w:val="13"/>
+                    </w:rPr>
+                    <w:t xml:space="preserve">−41.6%</w:t>
+                  </w:r>
+                </w:p>
+              </w:tc>
+            </w:tr>
+            <w:tr>
+              <w:tc>
+                <w:tcPr>
+                  <w:tcW w:type="dxa" w:w="1050"/>
+                  <w:tcBorders>
+                    <w:top w:val="none" w:color="FFFFFF" w:sz="0"/>
+                    <w:left w:val="none" w:color="FFFFFF" w:sz="0"/>
+                    <w:bottom w:val="single" w:color="D5D9E0" w:sz="4"/>
+                    <w:right w:val="none" w:color="FFFFFF" w:sz="0"/>
+                  </w:tcBorders>
+                  <w:shd w:fill="F7F8FB" w:color="auto" w:val="clear"/>
+                  <w:tcMar>
+                    <w:top w:type="dxa" w:w="25"/>
+                    <w:left w:type="dxa" w:w="80"/>
+                    <w:bottom w:type="dxa" w:w="25"/>
+                    <w:right w:type="dxa" w:w="80"/>
+                  </w:tcMar>
+                  <w:vAlign w:val="center"/>
+                </w:tcPr>
+                <w:p>
+                  <w:pPr>
+                    <w:spacing w:line="216" w:lineRule="auto"/>
+                    <w:jc w:val="left"/>
+                  </w:pPr>
+                  <w:r>
+                    <w:rPr>
+                      <w:rFonts w:ascii="Arial" w:cs="Arial" w:eastAsia="Arial" w:hAnsi="Arial"/>
+                      <w:b w:val="false"/>
+                      <w:bCs w:val="false"/>
+                      <w:color w:val="1A1A1A"/>
+                      <w:sz w:val="13"/>
+                      <w:szCs w:val="13"/>
+                    </w:rPr>
+                    <w:t xml:space="preserve">Bull</w:t>
+                  </w:r>
+                </w:p>
+              </w:tc>
+              <w:tc>
+                <w:tcPr>
+                  <w:tcW w:type="dxa" w:w="3450"/>
+                  <w:tcBorders>
+                    <w:top w:val="none" w:color="FFFFFF" w:sz="0"/>
+                    <w:left w:val="none" w:color="FFFFFF" w:sz="0"/>
+                    <w:bottom w:val="single" w:color="D5D9E0" w:sz="4"/>
+                    <w:right w:val="none" w:color="FFFFFF" w:sz="0"/>
+                  </w:tcBorders>
+                  <w:shd w:fill="F7F8FB" w:color="auto" w:val="clear"/>
+                  <w:tcMar>
+                    <w:top w:type="dxa" w:w="25"/>
+                    <w:left w:type="dxa" w:w="80"/>
+                    <w:bottom w:type="dxa" w:w="25"/>
+                    <w:right w:type="dxa" w:w="80"/>
+                  </w:tcMar>
+                  <w:vAlign w:val="center"/>
+                </w:tcPr>
+                <w:p>
+                  <w:pPr>
+                    <w:spacing w:line="216" w:lineRule="auto"/>
+                    <w:jc w:val="left"/>
+                  </w:pPr>
+                  <w:r>
+                    <w:rPr>
+                      <w:rFonts w:ascii="Arial" w:cs="Arial" w:eastAsia="Arial" w:hAnsi="Arial"/>
+                      <w:b w:val="false"/>
+                      <w:bCs w:val="false"/>
+                      <w:color w:val="1A1A1A"/>
+                      <w:sz w:val="13"/>
+                      <w:szCs w:val="13"/>
+                    </w:rPr>
+                    <w:t xml:space="preserve">WACC −100 bp; g 2.5%; margin 81.3% (high); 23% tax in Chile</w:t>
+                  </w:r>
+                </w:p>
+              </w:tc>
+              <w:tc>
+                <w:tcPr>
+                  <w:tcW w:type="dxa" w:w="750"/>
+                  <w:tcBorders>
+                    <w:top w:val="none" w:color="FFFFFF" w:sz="0"/>
+                    <w:left w:val="none" w:color="FFFFFF" w:sz="0"/>
+                    <w:bottom w:val="single" w:color="D5D9E0" w:sz="4"/>
+                    <w:right w:val="none" w:color="FFFFFF" w:sz="0"/>
+                  </w:tcBorders>
+                  <w:shd w:fill="F7F8FB" w:color="auto" w:val="clear"/>
+                  <w:tcMar>
+                    <w:top w:type="dxa" w:w="25"/>
+                    <w:left w:type="dxa" w:w="80"/>
+                    <w:bottom w:type="dxa" w:w="25"/>
+                    <w:right w:type="dxa" w:w="80"/>
+                  </w:tcMar>
+                  <w:vAlign w:val="center"/>
+                </w:tcPr>
+                <w:p>
+                  <w:pPr>
+                    <w:spacing w:line="216" w:lineRule="auto"/>
+                    <w:jc w:val="right"/>
+                  </w:pPr>
+                  <w:r>
+                    <w:rPr>
+                      <w:rFonts w:ascii="Arial" w:cs="Arial" w:eastAsia="Arial" w:hAnsi="Arial"/>
+                      <w:b w:val="false"/>
+                      <w:bCs w:val="false"/>
+                      <w:color w:val="1A1A1A"/>
+                      <w:sz w:val="13"/>
+                      <w:szCs w:val="13"/>
+                    </w:rPr>
+                    <w:t xml:space="preserve">2,506</w:t>
+                  </w:r>
+                </w:p>
+              </w:tc>
+              <w:tc>
+                <w:tcPr>
+                  <w:tcW w:type="dxa" w:w="900"/>
+                  <w:tcBorders>
+                    <w:top w:val="none" w:color="FFFFFF" w:sz="0"/>
+                    <w:left w:val="none" w:color="FFFFFF" w:sz="0"/>
+                    <w:bottom w:val="single" w:color="D5D9E0" w:sz="4"/>
+                    <w:right w:val="none" w:color="FFFFFF" w:sz="0"/>
+                  </w:tcBorders>
+                  <w:shd w:fill="F7F8FB" w:color="auto" w:val="clear"/>
+                  <w:tcMar>
+                    <w:top w:type="dxa" w:w="25"/>
+                    <w:left w:type="dxa" w:w="80"/>
+                    <w:bottom w:type="dxa" w:w="25"/>
+                    <w:right w:type="dxa" w:w="80"/>
+                  </w:tcMar>
+                  <w:vAlign w:val="center"/>
+                </w:tcPr>
+                <w:p>
+                  <w:pPr>
+                    <w:spacing w:line="216" w:lineRule="auto"/>
+                    <w:jc w:val="right"/>
+                  </w:pPr>
+                  <w:r>
+                    <w:rPr>
+                      <w:rFonts w:ascii="Arial" w:cs="Arial" w:eastAsia="Arial" w:hAnsi="Arial"/>
+                      <w:b w:val="false"/>
+                      <w:bCs w:val="false"/>
+                      <w:color w:val="1A1A1A"/>
+                      <w:sz w:val="13"/>
+                      <w:szCs w:val="13"/>
+                    </w:rPr>
+                    <w:t xml:space="preserve">2,595</w:t>
+                  </w:r>
+                </w:p>
+              </w:tc>
+              <w:tc>
+                <w:tcPr>
+                  <w:tcW w:type="dxa" w:w="750"/>
+                  <w:tcBorders>
+                    <w:top w:val="none" w:color="FFFFFF" w:sz="0"/>
+                    <w:left w:val="none" w:color="FFFFFF" w:sz="0"/>
+                    <w:bottom w:val="single" w:color="D5D9E0" w:sz="4"/>
+                    <w:right w:val="none" w:color="FFFFFF" w:sz="0"/>
+                  </w:tcBorders>
+                  <w:shd w:fill="F7F8FB" w:color="auto" w:val="clear"/>
+                  <w:tcMar>
+                    <w:top w:type="dxa" w:w="25"/>
+                    <w:left w:type="dxa" w:w="80"/>
+                    <w:bottom w:type="dxa" w:w="25"/>
+                    <w:right w:type="dxa" w:w="80"/>
+                  </w:tcMar>
+                  <w:vAlign w:val="center"/>
+                </w:tcPr>
+                <w:p>
+                  <w:pPr>
+                    <w:spacing w:line="216" w:lineRule="auto"/>
+                    <w:jc w:val="right"/>
+                  </w:pPr>
+                  <w:r>
+                    <w:rPr>
+                      <w:rFonts w:ascii="Arial" w:cs="Arial" w:eastAsia="Arial" w:hAnsi="Arial"/>
+                      <w:b w:val="false"/>
+                      <w:bCs w:val="false"/>
+                      <w:color w:val="1A1A1A"/>
+                      <w:sz w:val="13"/>
+                      <w:szCs w:val="13"/>
+                    </w:rPr>
+                    <w:t xml:space="preserve">−27.0%</w:t>
+                  </w:r>
+                </w:p>
+              </w:tc>
+            </w:tr>
+            <w:tr>
+              <w:tc>
+                <w:tcPr>
+                  <w:tcW w:type="dxa" w:w="1050"/>
+                  <w:tcBorders>
+                    <w:top w:val="none" w:color="FFFFFF" w:sz="0"/>
+                    <w:left w:val="none" w:color="FFFFFF" w:sz="0"/>
+                    <w:bottom w:val="single" w:color="D5D9E0" w:sz="4"/>
+                    <w:right w:val="none" w:color="FFFFFF" w:sz="0"/>
+                  </w:tcBorders>
+                  <w:shd w:fill="FFFFFF" w:color="auto" w:val="clear"/>
+                  <w:tcMar>
+                    <w:top w:type="dxa" w:w="25"/>
+                    <w:left w:type="dxa" w:w="80"/>
+                    <w:bottom w:type="dxa" w:w="25"/>
+                    <w:right w:type="dxa" w:w="80"/>
+                  </w:tcMar>
+                  <w:vAlign w:val="center"/>
+                </w:tcPr>
+                <w:p>
+                  <w:pPr>
+                    <w:spacing w:line="216" w:lineRule="auto"/>
+                    <w:jc w:val="left"/>
+                  </w:pPr>
+                  <w:r>
+                    <w:rPr>
+                      <w:rFonts w:ascii="Arial" w:cs="Arial" w:eastAsia="Arial" w:hAnsi="Arial"/>
+                      <w:b w:val="false"/>
+                      <w:bCs w:val="false"/>
+                      <w:color w:val="1A1A1A"/>
+                      <w:sz w:val="13"/>
+                      <w:szCs w:val="13"/>
+                    </w:rPr>
+                    <w:t xml:space="preserve">Appraisers</w:t>
+                  </w:r>
+                </w:p>
+              </w:tc>
+              <w:tc>
+                <w:tcPr>
+                  <w:tcW w:type="dxa" w:w="3450"/>
+                  <w:tcBorders>
+                    <w:top w:val="none" w:color="FFFFFF" w:sz="0"/>
+                    <w:left w:val="none" w:color="FFFFFF" w:sz="0"/>
+                    <w:bottom w:val="single" w:color="D5D9E0" w:sz="4"/>
+                    <w:right w:val="none" w:color="FFFFFF" w:sz="0"/>
+                  </w:tcBorders>
+                  <w:shd w:fill="FFFFFF" w:color="auto" w:val="clear"/>
+                  <w:tcMar>
+                    <w:top w:type="dxa" w:w="25"/>
+                    <w:left w:type="dxa" w:w="80"/>
+                    <w:bottom w:type="dxa" w:w="25"/>
+                    <w:right w:type="dxa" w:w="80"/>
+                  </w:tcMar>
+                  <w:vAlign w:val="center"/>
+                </w:tcPr>
+                <w:p>
+                  <w:pPr>
+                    <w:spacing w:line="216" w:lineRule="auto"/>
+                    <w:jc w:val="left"/>
+                  </w:pPr>
+                  <w:r>
+                    <w:rPr>
+                      <w:rFonts w:ascii="Arial" w:cs="Arial" w:eastAsia="Arial" w:hAnsi="Arial"/>
+                      <w:b w:val="false"/>
+                      <w:bCs w:val="false"/>
+                      <w:color w:val="1A1A1A"/>
+                      <w:sz w:val="13"/>
+                      <w:szCs w:val="13"/>
+                    </w:rPr>
+                    <w:t xml:space="preserve">WACC 8.72% (5.55% real, Note 11)</w:t>
+                  </w:r>
+                </w:p>
+              </w:tc>
+              <w:tc>
+                <w:tcPr>
+                  <w:tcW w:type="dxa" w:w="750"/>
+                  <w:tcBorders>
+                    <w:top w:val="none" w:color="FFFFFF" w:sz="0"/>
+                    <w:left w:val="none" w:color="FFFFFF" w:sz="0"/>
+                    <w:bottom w:val="single" w:color="D5D9E0" w:sz="4"/>
+                    <w:right w:val="none" w:color="FFFFFF" w:sz="0"/>
+                  </w:tcBorders>
+                  <w:shd w:fill="FFFFFF" w:color="auto" w:val="clear"/>
+                  <w:tcMar>
+                    <w:top w:type="dxa" w:w="25"/>
+                    <w:left w:type="dxa" w:w="80"/>
+                    <w:bottom w:type="dxa" w:w="25"/>
+                    <w:right w:type="dxa" w:w="80"/>
+                  </w:tcMar>
+                  <w:vAlign w:val="center"/>
+                </w:tcPr>
+                <w:p>
+                  <w:pPr>
+                    <w:spacing w:line="216" w:lineRule="auto"/>
+                    <w:jc w:val="right"/>
+                  </w:pPr>
+                  <w:r>
+                    <w:rPr>
+                      <w:rFonts w:ascii="Arial" w:cs="Arial" w:eastAsia="Arial" w:hAnsi="Arial"/>
+                      <w:b w:val="false"/>
+                      <w:bCs w:val="false"/>
+                      <w:color w:val="1A1A1A"/>
+                      <w:sz w:val="13"/>
+                      <w:szCs w:val="13"/>
+                    </w:rPr>
+                    <w:t xml:space="preserve">2,660</w:t>
+                  </w:r>
+                </w:p>
+              </w:tc>
+              <w:tc>
+                <w:tcPr>
+                  <w:tcW w:type="dxa" w:w="900"/>
+                  <w:tcBorders>
+                    <w:top w:val="none" w:color="FFFFFF" w:sz="0"/>
+                    <w:left w:val="none" w:color="FFFFFF" w:sz="0"/>
+                    <w:bottom w:val="single" w:color="D5D9E0" w:sz="4"/>
+                    <w:right w:val="none" w:color="FFFFFF" w:sz="0"/>
+                  </w:tcBorders>
+                  <w:shd w:fill="FFFFFF" w:color="auto" w:val="clear"/>
+                  <w:tcMar>
+                    <w:top w:type="dxa" w:w="25"/>
+                    <w:left w:type="dxa" w:w="80"/>
+                    <w:bottom w:type="dxa" w:w="25"/>
+                    <w:right w:type="dxa" w:w="80"/>
+                  </w:tcMar>
+                  <w:vAlign w:val="center"/>
+                </w:tcPr>
+                <w:p>
+                  <w:pPr>
+                    <w:spacing w:line="216" w:lineRule="auto"/>
+                    <w:jc w:val="right"/>
+                  </w:pPr>
+                  <w:r>
+                    <w:rPr>
+                      <w:rFonts w:ascii="Arial" w:cs="Arial" w:eastAsia="Arial" w:hAnsi="Arial"/>
+                      <w:b w:val="false"/>
+                      <w:bCs w:val="false"/>
+                      <w:color w:val="1A1A1A"/>
+                      <w:sz w:val="13"/>
+                      <w:szCs w:val="13"/>
+                    </w:rPr>
+                    <w:t xml:space="preserve">2,719</w:t>
+                  </w:r>
+                </w:p>
+              </w:tc>
+              <w:tc>
+                <w:tcPr>
+                  <w:tcW w:type="dxa" w:w="750"/>
+                  <w:tcBorders>
+                    <w:top w:val="none" w:color="FFFFFF" w:sz="0"/>
+                    <w:left w:val="none" w:color="FFFFFF" w:sz="0"/>
+                    <w:bottom w:val="single" w:color="D5D9E0" w:sz="4"/>
+                    <w:right w:val="none" w:color="FFFFFF" w:sz="0"/>
+                  </w:tcBorders>
+                  <w:shd w:fill="FFFFFF" w:color="auto" w:val="clear"/>
+                  <w:tcMar>
+                    <w:top w:type="dxa" w:w="25"/>
+                    <w:left w:type="dxa" w:w="80"/>
+                    <w:bottom w:type="dxa" w:w="25"/>
+                    <w:right w:type="dxa" w:w="80"/>
+                  </w:tcMar>
+                  <w:vAlign w:val="center"/>
+                </w:tcPr>
+                <w:p>
+                  <w:pPr>
+                    <w:spacing w:line="216" w:lineRule="auto"/>
+                    <w:jc w:val="right"/>
+                  </w:pPr>
+                  <w:r>
+                    <w:rPr>
+                      <w:rFonts w:ascii="Arial" w:cs="Arial" w:eastAsia="Arial" w:hAnsi="Arial"/>
+                      <w:b w:val="false"/>
+                      <w:bCs w:val="false"/>
+                      <w:color w:val="1A1A1A"/>
+                      <w:sz w:val="13"/>
+                      <w:szCs w:val="13"/>
+                    </w:rPr>
+                    <w:t xml:space="preserve">−23.5%</w:t>
+                  </w:r>
+                </w:p>
+              </w:tc>
+            </w:tr>
+          </w:tbl>
+          <w:p>
+            <w:pPr>
+              <w:spacing w:after="60"/>
+            </w:pPr>
+          </w:p>
+          <w:p>
+            <w:pPr>
+              <w:spacing w:after="60" w:before="0" w:line="228" w:lineRule="auto"/>
+              <w:jc w:val="both"/>
+            </w:pPr>
+            <w:r>
+              <w:rPr>
+                <w:rFonts w:ascii="Arial" w:cs="Arial" w:eastAsia="Arial" w:hAnsi="Arial"/>
+                <w:b/>
+                <w:bCs/>
+                <w:color w:val="14284B"/>
+                <w:sz w:val="16"/>
+                <w:szCs w:val="16"/>
+              </w:rPr>
+              <w:t xml:space="preserve">Target price. </w:t>
+            </w:r>
+            <w:r>
+              <w:rPr>
+                <w:rFonts w:ascii="Arial" w:cs="Arial" w:eastAsia="Arial" w:hAnsi="Arial"/>
+                <w:color w:val="1A1A1A"/>
+                <w:sz w:val="16"/>
+                <w:szCs w:val="16"/>
+              </w:rPr>
               <w:t xml:space="preserve">80% × CLP 1,857 + 20% × CLP 2,951 = CLP 2,076, a −41.6% return against CLP 3,555 (30-Sep-26). Rolling the DCF from 30-Jun to 30-Sep-26 would lift it to ~CLP 1,910 and the target to ~CLP 2,118 (−40.4%): the recommendation does not change.</w:t>
+            </w:r>
+          </w:p>
+          <w:p>
+            <w:pPr>
+              <w:spacing w:after="60" w:before="0" w:line="228" w:lineRule="auto"/>
+              <w:jc w:val="both"/>
+            </w:pPr>
+            <w:r>
+              <w:rPr>
+                <w:rFonts w:ascii="Arial" w:cs="Arial" w:eastAsia="Arial" w:hAnsi="Arial"/>
+                <w:b/>
+                <w:bCs/>
+                <w:color w:val="14284B"/>
+                <w:sz w:val="16"/>
+                <w:szCs w:val="16"/>
+              </w:rPr>
+              <w:t xml:space="preserve">Total return and implied metrics. </w:t>
+            </w:r>
+            <w:r>
+              <w:rPr>
+                <w:rFonts w:ascii="Arial" w:cs="Arial" w:eastAsia="Arial" w:hAnsi="Arial"/>
+                <w:color w:val="1A1A1A"/>
+                <w:sz w:val="16"/>
+                <w:szCs w:val="16"/>
+              </w:rPr>
+              <w:t xml:space="preserve">With an expected dividend of ~CLP 69 per share (2.0% yield), the expected total return is −39.7%. The target price implies 10.8x LTM EV/EBITDA, a 9.3% cap rate and 0.94x book value, versus 16.7x, 6.0% and 1.61x at the current price.</w:t>
+            </w:r>
+          </w:p>
+          <w:p>
+            <w:pPr>
+              <w:spacing w:after="60" w:before="0" w:line="228" w:lineRule="auto"/>
+              <w:jc w:val="both"/>
+            </w:pPr>
+            <w:r>
+              <w:rPr>
+                <w:rFonts w:ascii="Arial" w:cs="Arial" w:eastAsia="Arial" w:hAnsi="Arial"/>
+                <w:b/>
+                <w:bCs/>
+                <w:color w:val="14284B"/>
+                <w:sz w:val="16"/>
+                <w:szCs w:val="16"/>
+              </w:rPr>
+              <w:t xml:space="preserve">Catalysts. </w:t>
+            </w:r>
+            <w:r>
+              <w:rPr>
+                <w:rFonts w:ascii="Arial" w:cs="Arial" w:eastAsia="Arial" w:hAnsi="Arial"/>
+                <w:color w:val="1A1A1A"/>
+                <w:sz w:val="16"/>
+                <w:szCs w:val="16"/>
+              </w:rPr>
+              <w:t xml:space="preserve">The 10Y UST at 5.22%, its highest since 2002, and Fed hikes put pressure on market cap rates (Investment Risks, FR1). Each appraisal update at higher rates brings book value closer to our DCF and removes support for the current multiple.</w:t>
             </w:r>
           </w:p>
           <w:p>

</xml_diff>

<commit_message>
Valuation: tighten page 1 so the section fits two pages in Word
Co-Authored-By: Claude Opus 5.5 <noreply@anthropic.com>
Claude-Session: https://claude.ai/code/session_0188QZHBkA8n5QL7BtmFakQg
</commit_message>
<xml_diff>
--- a/informe/Mallplaza_Valuacion_EN.docx
+++ b/informe/Mallplaza_Valuacion_EN.docx
@@ -166,7 +166,7 @@
                 <w:sz w:val="16"/>
                 <w:szCs w:val="16"/>
               </w:rPr>
-              <w:t xml:space="preserve">Of the CLP 1,857 per share, CLP 583 comes from explicit cash flows and CLP 1,884 from terminal value, less CLP 587 of net debt and CLP 23 of minorities. With terminal value at 76% of EV, the result depends mostly on the terminal WACC and g rather than forecast detail, which is why the sensitivity focuses on those two variables.</w:t>
+              <w:t xml:space="preserve">The CLP 1,857 per share is CLP 583 of explicit cash flows plus CLP 1,884 of terminal value, less CLP 587 of net debt and CLP 23 of minorities: the result depends mostly on the terminal WACC and g.</w:t>
             </w:r>
           </w:p>
           <w:p>
@@ -192,7 +192,7 @@
                 <w:sz w:val="16"/>
                 <w:szCs w:val="16"/>
               </w:rPr>
-              <w:t xml:space="preserve">It changes by period as net debt/EBITDA converges from 2.36x to 3.5x by 2031 (D/E from 20.0% to 28.5%): 10.54% in 2H26E and 10.41% in the terminal period (7.32% and 7.20% real). Ke is computed in USD and converted to CLP with the inflation differential: Rf 4.98% + beta 1.14 × ERP 4.14% + CRP 1.41% = 11.10% (11.93% in CLP, terminal). The beta relevers the median unlevered beta of six peers (0.94), and the CRP weights sovereign risk by revenue (71.8% Chile, 17.7% Peru and 10.5% Colombia). Kd starts from the latest UF bond coupon (3.6% real) plus 25 bp per turn of leverage above 2.36x: 4.92% after tax in 2H26E and 5.11% in the terminal period. At CLP 3,555, equity yields almost the same as that debt (Figure 28; details in Appendix [Z]).</w:t>
+              <w:t xml:space="preserve">It changes by period as net debt/EBITDA converges from 2.36x to 3.5x by 2031: 10.54% in 2H26E and 10.41% in the terminal period (7.32% and 7.20% real). Ke is computed in USD and converted to CLP with the inflation differential: Rf 4.98% + beta 1.14 × ERP 4.14% + CRP 1.41% = 11.10% (11.93% in CLP, terminal). The beta relevers the six-peer median (0.94) and the CRP weights country risk by revenue (71.8% Chile). Kd starts from the latest UF bond coupon (3.6% real) plus 25 bp per turn of leverage above 2.36x: 4.92% after tax in 2H26E and 5.11% in the terminal period. At CLP 3,555, equity yields almost the same as that debt (Figure 28; details in Appendix [Z]).</w:t>
             </w:r>
           </w:p>
           <w:p>
@@ -218,7 +218,7 @@
                 <w:sz w:val="16"/>
                 <w:szCs w:val="16"/>
               </w:rPr>
-              <w:t xml:space="preserve">The company uses its debt capacity to grow, as in 2024 (3.78x after buying Open Plaza Peru): net debt/EBITDA rises from 2.36x to 3.5x by 2031, and new debt (CLP 1.40 trillion) funds all of the period's capex (CLP 1.11 trillion). Operating cash is distributed to shareholders: ordinary dividends plus CLP 1.79 trillion of additional distributions. Debt is cheaper than equity (Kd ~5% after tax versus Ke ~12%) and creates a tax shield; financing does not change the EV, but it sets the WACC structure (Appendix [D]).</w:t>
+              <w:t xml:space="preserve">The company uses its debt capacity to grow, as in 2024 (3.78x after buying Open Plaza Peru): net debt/EBITDA rises from 2.36x to 3.5x by 2031, and new debt (CLP 1.40 trillion) funds all of the period's capex (CLP 1.11 trillion). Operating cash is distributed to shareholders (dividends plus CLP 1.79 trillion of additional distributions). Debt is cheaper than equity (Kd ~5% vs Ke ~12%) and creates a tax shield (Appendix [D]).</w:t>
             </w:r>
           </w:p>
           <w:p>
@@ -312,7 +312,7 @@
                 <w:sz w:val="16"/>
                 <w:szCs w:val="16"/>
               </w:rPr>
-              <w:t xml:space="preserve">At CLP 3,555 the implied EV is CLP 9.12 trillion, 69% above our EV (CLP 5.40 trillion): 16.7x LTM EBITDA, a 6.0% cap rate. Justifying it would require cash flows 69% higher forever or a 7.56% WACC, equivalent to ~4.4% real, just 80 bp above the company's own real Kd (3.6%): the price leaves equity with almost no risk premium. And since RONIC is below the WACC, assuming more growth does not close the gap, it widens it.</w:t>
+              <w:t xml:space="preserve">At CLP 3,555 the implied EV (CLP 9.12 trillion) is 69% above ours. Justifying it would require cash flows 69% higher forever or a WACC of ~4.4% real, just 80 bp above the company's real Kd (3.6%): almost no premium for equity. And since RONIC is below the WACC, more growth widens the gap.</w:t>
             </w:r>
           </w:p>
           <w:p>
@@ -338,7 +338,7 @@
                 <w:sz w:val="16"/>
                 <w:szCs w:val="16"/>
               </w:rPr>
-              <w:t xml:space="preserve">Book equity (CLP 2,201 per share) already carries properties at fair value, appraised at a ~5.55% real rate (Note 11). The market pays 1.61x that value, more than the appraisers themselves, even allowing for deferred taxes reducing book equity; our target price implies 0.94x. Even discounting at the appraisers' rate (8.72% nominal WACC), the DCF would be CLP 2,660, 25% below the price.</w:t>
+              <w:t xml:space="preserve">Book equity (CLP 2,201 per share) already carries properties at fair value, appraised at ~5.55% real (Note 11). The market pays 1.61x that value, more than the appraisers (even allowing for deferred taxes); our target price implies 0.94x. Even at the appraisers' rate, the DCF would be CLP 2,660, 25% below the price.</w:t>
             </w:r>
           </w:p>
         </w:tc>

</xml_diff>

<commit_message>
Valuation: 52-week range and peer multiples vs local rates (NTN-B) charts; rewrite the section as a narrative
Co-Authored-By: Claude Opus 5.5 <noreply@anthropic.com>
Claude-Session: https://claude.ai/code/session_0188QZHBkA8n5QL7BtmFakQg
</commit_message>
<xml_diff>
--- a/informe/Mallplaza_Valuacion_EN.docx
+++ b/informe/Mallplaza_Valuacion_EN.docx
@@ -34,7 +34,7 @@
           <w:sz w:val="16"/>
           <w:szCs w:val="16"/>
         </w:rPr>
-        <w:t xml:space="preserve">We recommend SELL on Mallplaza with a target price of CLP 2,076 per share (80% DCF and 20% multiples), 41.6% below the CLP 3,555 close of 30-Sep-26. No method justifies the current price (Figure 27).</w:t>
+        <w:t xml:space="preserve">We recommend SELL on Mallplaza with a target price of CLP 2,076 per share, 41.6% below the CLP 3,555 close of 30-Sep-26 (−39.7% total return including dividends). Our target sits even below the stock's 52-week low (CLP 2,470).</w:t>
       </w:r>
     </w:p>
     <w:tbl>
@@ -91,7 +91,7 @@
                 <w:sz w:val="16"/>
                 <w:szCs w:val="16"/>
               </w:rPr>
-              <w:t xml:space="preserve">SUMMARY AND WEIGHTING</w:t>
+              <w:t xml:space="preserve">A PRICE NO METHOD REACHES</w:t>
             </w:r>
           </w:p>
           <w:p>
@@ -106,67 +106,7 @@
                 <w:sz w:val="16"/>
                 <w:szCs w:val="16"/>
               </w:rPr>
-              <w:t xml:space="preserve">We give the DCF an 80% weight because Mallplaza's cash flows are highly predictable: 81.4% of LTM revenue is rent and 93% of that is fixed. Multiples (20%) test the model against what the market pays today; we cap their weight because Chile has only two direct peers (Parque Arauco and Cencosud Shopping) and because multiples do not capture Mallplaza's GLA expansion or debt path, which the DCF does.</w:t>
-            </w:r>
-          </w:p>
-          <w:p>
-            <w:pPr>
-              <w:pBdr>
-                <w:bottom w:val="single" w:color="E9004B" w:sz="8" w:space="1"/>
-              </w:pBdr>
-              <w:spacing w:after="50" w:before="90"/>
-            </w:pPr>
-            <w:r>
-              <w:rPr>
-                <w:rFonts w:ascii="Arial" w:cs="Arial" w:eastAsia="Arial" w:hAnsi="Arial"/>
-                <w:b/>
-                <w:bCs/>
-                <w:color w:val="14284B"/>
-                <w:sz w:val="16"/>
-                <w:szCs w:val="16"/>
-              </w:rPr>
-              <w:t xml:space="preserve">DCF: STRUCTURE AND DISCOUNT RATE</w:t>
-            </w:r>
-          </w:p>
-          <w:p>
-            <w:pPr>
-              <w:spacing w:after="60" w:before="0" w:line="228" w:lineRule="auto"/>
-              <w:jc w:val="both"/>
-            </w:pPr>
-            <w:r>
-              <w:rPr>
-                <w:rFonts w:ascii="Arial" w:cs="Arial" w:eastAsia="Arial" w:hAnsi="Arial"/>
-                <w:color w:val="1A1A1A"/>
-                <w:sz w:val="16"/>
-                <w:szCs w:val="16"/>
-              </w:rPr>
-              <w:t xml:space="preserve">We value FCFF in two stages, in nominal CLP, at 30-Jun-26 with the mid-year convention. The explicit stage (2H26E–2031E) includes the capex and ramp-up of projects opening through 2032 (108,301 m² of mature GLA in the terminal year). From 2032, a Gordon perpetuity accounts for 76% of EV, with no new net GLA and maintenance capex only (Appendix [B]).</w:t>
-            </w:r>
-          </w:p>
-          <w:p>
-            <w:pPr>
-              <w:spacing w:after="60" w:before="0" w:line="228" w:lineRule="auto"/>
-              <w:jc w:val="both"/>
-            </w:pPr>
-            <w:r>
-              <w:rPr>
-                <w:rFonts w:ascii="Arial" w:cs="Arial" w:eastAsia="Arial" w:hAnsi="Arial"/>
-                <w:b/>
-                <w:bCs/>
-                <w:color w:val="14284B"/>
-                <w:sz w:val="16"/>
-                <w:szCs w:val="16"/>
-              </w:rPr>
-              <w:t xml:space="preserve">Value decomposition. </w:t>
-            </w:r>
-            <w:r>
-              <w:rPr>
-                <w:rFonts w:ascii="Arial" w:cs="Arial" w:eastAsia="Arial" w:hAnsi="Arial"/>
-                <w:color w:val="1A1A1A"/>
-                <w:sz w:val="16"/>
-                <w:szCs w:val="16"/>
-              </w:rPr>
-              <w:t xml:space="preserve">The CLP 1,857 per share is CLP 583 of explicit cash flows plus CLP 1,884 of terminal value, less CLP 587 of net debt and CLP 23 of minorities: the result depends mostly on the terminal WACC and g.</w:t>
+              <w:t xml:space="preserve">In twelve months the stock rose from CLP 2,470 to 4,700 and now trades at CLP 3,555. None of our methods reaches that price: the DCF ranges from CLP 1,379 to 2,329 even with WACC ±100 bp and g between 2.5% and 4.0%, and the most favourable multiples fall short too (Figure 27). We give the DCF an 80% weight because Mallplaza is, at heart, a rent collector: 81.4% of revenue is rent and 93% of that is fixed. The 20% on multiples tests the model against what the market pays today, but with caution: Chile has only two direct peers, and neither captures the company's expansion plan or debt path.</w:t>
             </w:r>
           </w:p>
         </w:tc>
@@ -238,7 +178,7 @@
             <w:r>
               <w:drawing>
                 <wp:inline distT="0" distB="0" distL="0" distR="0">
-                  <wp:extent cx="2257425" cy="1695450"/>
+                  <wp:extent cx="2257425" cy="1828800"/>
                   <wp:effectExtent t="0" r="0" b="0" l="0"/>
                   <wp:docPr id="1" name="" descr="" title=""/>
                   <wp:cNvGraphicFramePr>
@@ -263,7 +203,7 @@
                         <pic:spPr bwMode="auto">
                           <a:xfrm>
                             <a:off x="0" y="0"/>
-                            <a:ext cx="2257425" cy="1695450"/>
+                            <a:ext cx="2257425" cy="1828800"/>
                           </a:xfrm>
                           <a:prstGeom prst="rect">
                             <a:avLst/>
@@ -287,7 +227,7 @@
                 <w:sz w:val="11"/>
                 <w:szCs w:val="11"/>
               </w:rPr>
-              <w:t xml:space="preserve">52-week range pending (Bloomberg). Source: Team analysis; Bloomberg.</w:t>
+              <w:t xml:space="preserve">52-week intraday range (1-Oct-25 to 30-Sep-26; low 10-Oct-25, high 27-Apr-26). Source: Team analysis; Bloomberg.</w:t>
             </w:r>
           </w:p>
         </w:tc>
@@ -315,8 +255,10 @@
           </w:tcPr>
           <w:p>
             <w:pPr>
-              <w:spacing w:after="60" w:before="0" w:line="228" w:lineRule="auto"/>
-              <w:jc w:val="both"/>
+              <w:pBdr>
+                <w:bottom w:val="single" w:color="E9004B" w:sz="8" w:space="1"/>
+              </w:pBdr>
+              <w:spacing w:after="50" w:before="90"/>
             </w:pPr>
             <w:r>
               <w:rPr>
@@ -327,8 +269,14 @@
                 <w:sz w:val="16"/>
                 <w:szCs w:val="16"/>
               </w:rPr>
-              <w:t xml:space="preserve">WACC. </w:t>
-            </w:r>
+              <w:t xml:space="preserve">THE STORY IS IN THE RATE</w:t>
+            </w:r>
+          </w:p>
+          <w:p>
+            <w:pPr>
+              <w:spacing w:after="60" w:before="0" w:line="228" w:lineRule="auto"/>
+              <w:jc w:val="both"/>
+            </w:pPr>
             <w:r>
               <w:rPr>
                 <w:rFonts w:ascii="Arial" w:cs="Arial" w:eastAsia="Arial" w:hAnsi="Arial"/>
@@ -336,7 +284,7 @@
                 <w:sz w:val="16"/>
                 <w:szCs w:val="16"/>
               </w:rPr>
-              <w:t xml:space="preserve">It changes by period as net debt/EBITDA converges from 2.36x to 3.5x by 2031: 10.54% in 2H26E and 10.41% in the terminal period (7.32% and 7.20% real). Ke is computed in USD and converted to CLP with the inflation differential: Rf 4.98% + beta 1.14 × ERP 4.14% + CRP 1.41% = 11.10% (11.93% in CLP, terminal). The beta relevers the six-peer median (0.94) and the CRP weights country risk by revenue (71.8% Chile). Kd starts from the latest UF bond coupon (3.6% real) plus 25 bp per turn of leverage above 2.36x: 4.92% after tax in 2H26E and 5.11% in the terminal period. At CLP 3,555, equity yields almost the same as that debt (Figure 28; details in Appendix [Z]).</w:t>
+              <w:t xml:space="preserve">We project free cash flow to the firm in nominal CLP from 30-Jun-26, with an explicit horizon to 2031E and a terminal value that accounts for 76% of EV (Appendix [B]). The CLP 1,857 per share is CLP 583 of explicit cash flows and CLP 1,884 of terminal value, less CLP 610 of debt and minorities: the result depends, above all, on the discount rate.</w:t>
             </w:r>
           </w:p>
           <w:p>
@@ -347,14 +295,18 @@
             <w:r>
               <w:rPr>
                 <w:rFonts w:ascii="Arial" w:cs="Arial" w:eastAsia="Arial" w:hAnsi="Arial"/>
-                <w:b/>
-                <w:bCs/>
-                <w:color w:val="14284B"/>
+                <w:color w:val="1A1A1A"/>
                 <w:sz w:val="16"/>
                 <w:szCs w:val="16"/>
               </w:rPr>
-              <w:t xml:space="preserve">Capital structure. </w:t>
-            </w:r>
+              <w:t xml:space="preserve">That rate moves with the capital structure. Mallplaza uses its debt capacity to grow, as in 2024 after buying Open Plaza Peru (3.78x): we assume net debt/EBITDA rises from 2.36x to 3.5x by 2031, with 25 bp more real cost per turn, and that new debt (CLP 1.40 trillion) funds all capex while operating cash is distributed to shareholders. The nominal WACC thus moves from 10.54% in 2H26E to 10.41% in the terminal period (7.20% real): an 11.93% Ke (Rf 4.98%, relevered beta of 1.14 from a six-peer median of 0.94, ERP 4.14% and a 1.41% revenue-weighted CRP) and a 5.11% after-tax Kd based on the 3.6% real coupon of the latest bond (Appendix [Z]).</w:t>
+            </w:r>
+          </w:p>
+          <w:p>
+            <w:pPr>
+              <w:spacing w:after="60" w:before="0" w:line="228" w:lineRule="auto"/>
+              <w:jc w:val="both"/>
+            </w:pPr>
             <w:r>
               <w:rPr>
                 <w:rFonts w:ascii="Arial" w:cs="Arial" w:eastAsia="Arial" w:hAnsi="Arial"/>
@@ -362,7 +314,7 @@
                 <w:sz w:val="16"/>
                 <w:szCs w:val="16"/>
               </w:rPr>
-              <w:t xml:space="preserve">The company uses its debt capacity to grow, as in 2024 (3.78x after buying Open Plaza Peru): net debt/EBITDA rises from 2.36x to 3.5x by 2031, and new debt (CLP 1.40 trillion) funds all of the period's capex (CLP 1.11 trillion). Operating cash is distributed to shareholders (dividends plus CLP 1.79 trillion of additional distributions). Debt is cheaper than equity (Kd ~5% vs Ke ~12%) and creates a tax shield (Appendix [D]).</w:t>
+              <w:t xml:space="preserve">Here the first signal appears: at CLP 3,555, equity yields ~4.4% real, just 80 bp above the company's own real cost of debt (Figure 28). The market is pricing the stock almost as if it were a bond.</w:t>
             </w:r>
           </w:p>
         </w:tc>
@@ -525,7 +477,7 @@
                 <w:sz w:val="16"/>
                 <w:szCs w:val="16"/>
               </w:rPr>
-              <w:t xml:space="preserve">DCF: OPERATING FORECAST</w:t>
+              <w:t xml:space="preserve">GROWTH DOES NOT RESCUE THE PRICE</w:t>
             </w:r>
           </w:p>
           <w:p>
@@ -540,93 +492,22 @@
                 <w:sz w:val="16"/>
                 <w:szCs w:val="16"/>
               </w:rPr>
-              <w:t xml:space="preserve">Reported EBITDA (CLP 544,935 million LTM, 80.5% margin) excludes property revaluation (IAS 40); we forecast a 79.7% margin in 2026E and 79.7–79.8% through 2031E. The operating tax rate rises from 16.8% in 2026E to 27% in 2030E as existing benefits fade. Base capex (pipeline plus maintenance at 5.5% of revenue) peaks at CLP 240,660 million in 2027 and falls to ~CLP 50,000 million from 2029. From 2029, 27,075 m² also open each year (historical average), with capex of CLP 95,000–104,000 million a year, a 35%/90%/100% ramp and a 6.9% yield on cost, at the cost of the identified pipeline (USD 3,603/m²: 170,200 m² and USD 613.2 million). Working capital (15.6% × Δ revenue) requires CLP 7,100–9,900 million a year and moves the price by only ±1.2% (Appendix [C]).</w:t>
-            </w:r>
-          </w:p>
-          <w:p>
-            <w:pPr>
-              <w:pBdr>
-                <w:bottom w:val="single" w:color="E9004B" w:sz="8" w:space="1"/>
-              </w:pBdr>
-              <w:spacing w:after="50" w:before="90"/>
-            </w:pPr>
-            <w:r>
-              <w:rPr>
-                <w:rFonts w:ascii="Arial" w:cs="Arial" w:eastAsia="Arial" w:hAnsi="Arial"/>
-                <w:b/>
-                <w:bCs/>
-                <w:color w:val="14284B"/>
+              <w:t xml:space="preserve">This is not pessimism about operations. We forecast a 79.7% EBITDA margin in 2026E (excluding revaluation, below the 80.5% LTM), a tax rate converging from 16.8% to 27%, the announced pipeline (USD 613 million and 170,200 m²) and, from 2029, 27,075 m² of new GLA a year at the historical pace. The 13-analyst consensus expects NTM EBITDA only ~3% above ours: the disagreement with the market is not about cash flows.</w:t>
+            </w:r>
+          </w:p>
+          <w:p>
+            <w:pPr>
+              <w:spacing w:after="60" w:before="0" w:line="228" w:lineRule="auto"/>
+              <w:jc w:val="both"/>
+            </w:pPr>
+            <w:r>
+              <w:rPr>
+                <w:rFonts w:ascii="Arial" w:cs="Arial" w:eastAsia="Arial" w:hAnsi="Arial"/>
+                <w:color w:val="1A1A1A"/>
                 <w:sz w:val="16"/>
                 <w:szCs w:val="16"/>
               </w:rPr>
-              <w:t xml:space="preserve">DCF: TERMINAL VALUE AND IMPLIED CAP RATE</w:t>
-            </w:r>
-          </w:p>
-          <w:p>
-            <w:pPr>
-              <w:spacing w:after="60" w:before="0" w:line="228" w:lineRule="auto"/>
-              <w:jc w:val="both"/>
-            </w:pPr>
-            <w:r>
-              <w:rPr>
-                <w:rFonts w:ascii="Arial" w:cs="Arial" w:eastAsia="Arial" w:hAnsi="Arial"/>
-                <w:color w:val="1A1A1A"/>
-                <w:sz w:val="16"/>
-                <w:szCs w:val="16"/>
-              </w:rPr>
-              <w:t xml:space="preserve">We use g = 3.0% nominal (0% real). The real RONIC on expansion (5.0%) is below the real WACC (7.2%): growing beyond the horizon destroys value and a higher g lowers it (Figure 29). The DCF implies a cap rate of 10.1% on EV and 11.3% on terminal value, versus 6.0% for the market, 6.4% for Chilean peers, 7.5% at book value and 5.55% for the appraisers (Note 11) (Figure 32). That gap is not an inconsistency: it is the core of the thesis. To justify the current price, the WACC would have to be 285 bp lower (Figure 33).</w:t>
-            </w:r>
-          </w:p>
-          <w:p>
-            <w:pPr>
-              <w:spacing w:after="60" w:before="0" w:line="228" w:lineRule="auto"/>
-              <w:jc w:val="both"/>
-            </w:pPr>
-            <w:r>
-              <w:rPr>
-                <w:rFonts w:ascii="Arial" w:cs="Arial" w:eastAsia="Arial" w:hAnsi="Arial"/>
-                <w:b/>
-                <w:bCs/>
-                <w:color w:val="14284B"/>
-                <w:sz w:val="16"/>
-                <w:szCs w:val="16"/>
-              </w:rPr>
-              <w:t xml:space="preserve">What the price discounts. </w:t>
-            </w:r>
-            <w:r>
-              <w:rPr>
-                <w:rFonts w:ascii="Arial" w:cs="Arial" w:eastAsia="Arial" w:hAnsi="Arial"/>
-                <w:color w:val="1A1A1A"/>
-                <w:sz w:val="16"/>
-                <w:szCs w:val="16"/>
-              </w:rPr>
-              <w:t xml:space="preserve">At CLP 3,555 the implied EV (CLP 9.12 trillion) is 69% above ours. Justifying it would require cash flows 69% higher forever or a WACC of ~4.4% real, just 80 bp above the company's real Kd (3.6%): almost no premium for equity. And since RONIC is below the WACC, more growth widens the gap.</w:t>
-            </w:r>
-          </w:p>
-          <w:p>
-            <w:pPr>
-              <w:spacing w:after="60" w:before="0" w:line="228" w:lineRule="auto"/>
-              <w:jc w:val="both"/>
-            </w:pPr>
-            <w:r>
-              <w:rPr>
-                <w:rFonts w:ascii="Arial" w:cs="Arial" w:eastAsia="Arial" w:hAnsi="Arial"/>
-                <w:b/>
-                <w:bCs/>
-                <w:color w:val="14284B"/>
-                <w:sz w:val="16"/>
-                <w:szCs w:val="16"/>
-              </w:rPr>
-              <w:t xml:space="preserve">Book value and appraisers. </w:t>
-            </w:r>
-            <w:r>
-              <w:rPr>
-                <w:rFonts w:ascii="Arial" w:cs="Arial" w:eastAsia="Arial" w:hAnsi="Arial"/>
-                <w:color w:val="1A1A1A"/>
-                <w:sz w:val="16"/>
-                <w:szCs w:val="16"/>
-              </w:rPr>
-              <w:t xml:space="preserve">Book equity (CLP 2,201 per share) already carries properties at fair value, appraised at ~5.55% real (Note 11). The market pays 1.61x that value, more than the appraisers (even allowing for deferred taxes); our target price implies 0.94x. Even at the appraisers' rate, the DCF would be CLP 2,660, 25% below the price.</w:t>
+              <w:t xml:space="preserve">The problem is the return on growth. Each new m² yields 6.9% on cost, a 5.0% real RONIC after tax, below a 7.2% real WACC. Expansion adds revenue but not value, so terminal value grows only with inflation (g of 3.0% nominal, 0% real) and a higher g lowers value (Figure 29). Assuming more growth would not close the gap with the price; it would widen it.</w:t>
             </w:r>
           </w:p>
         </w:tc>
@@ -813,7 +694,7 @@
                 <w:sz w:val="16"/>
                 <w:szCs w:val="16"/>
               </w:rPr>
-              <w:t xml:space="preserve">RELATIVE VALUATION: MULTIPLES (20%)</w:t>
+              <w:t xml:space="preserve">PEERS CONFIRM THE DIRECTION, NOT THE SIZE</w:t>
             </w:r>
           </w:p>
           <w:p>
@@ -828,7 +709,7 @@
                 <w:sz w:val="16"/>
                 <w:szCs w:val="16"/>
               </w:rPr>
-              <w:t xml:space="preserve">The set is the same as for the beta: Parque Arauco and Cencosud Shopping (Chile), Allos, Multiplan and Iguatemi (Brazil) and IRSA (Argentina, used with caution because of IAS 29 and a single NTM analyst). We exclude Fibra Danhos, which as a FIBRA distributes 95% of its taxable income (Appendix [E]). Brazil trades at lower multiples because of its rates and risk premia (median 9.0x EV/EBITDA versus 15.7x in Chile; Figure 30). Since 71.8% of revenue comes from Chile, the multiple weights the Chilean median at 70% and the full-set median (11.1x) at 30%: 14.4x.</w:t>
+              <w:t xml:space="preserve">Mallplaza trades at 16.8x EV/EBITDA, above the Chilean median (15.7x) and far above Brazilian peers (9.0x). The gap with Brazil is about rates, not quality: with local real bonds at 2.5% in Chile and 8.1% in Brazil (NTN-B), the cap-rate spread over the local rate is similar in both countries, 385 bp in Chile and 302 bp in Brazil (Figure 30). We therefore weight the Chilean median at 70% and the common-set median at 30% (which includes IRSA; we exclude Fibra Danhos for its FIBRA regime): 14.4x, giving CLP 2,951 per share. The weighting matters little: between 0% and 100% Chile, the target price only moves from CLP 1,916 to 2,144 (Appendix [E]).</w:t>
             </w:r>
           </w:p>
           <w:p>
@@ -843,59 +724,7 @@
                 <w:sz w:val="16"/>
                 <w:szCs w:val="16"/>
               </w:rPr>
-              <w:t xml:space="preserve">We use EV/EBITDA because it is neutral to leverage and to revaluation (IAS 40). At 14.4x, value is CLP 2,951 per share. Mallplaza trades at 16.8x LTM: 7% above the Chilean median, below Parque Arauco (18.4x) and 17% above the weighted multiple (Figure 31). We exclude P/E (CLP 8,644, distorted by revaluation). Multiples use Bloomberg net debt (CLP 1,311,569 million), as for peers; the DCF uses the company's net financial debt (CLP 1,285,740 million).</w:t>
-            </w:r>
-          </w:p>
-          <w:p>
-            <w:pPr>
-              <w:spacing w:after="60" w:before="0" w:line="228" w:lineRule="auto"/>
-              <w:jc w:val="both"/>
-            </w:pPr>
-            <w:r>
-              <w:rPr>
-                <w:rFonts w:ascii="Arial" w:cs="Arial" w:eastAsia="Arial" w:hAnsi="Arial"/>
-                <w:b/>
-                <w:bCs/>
-                <w:color w:val="14284B"/>
-                <w:sz w:val="16"/>
-                <w:szCs w:val="16"/>
-              </w:rPr>
-              <w:t xml:space="preserve">Is the premium justified? </w:t>
-            </w:r>
-            <w:r>
-              <w:rPr>
-                <w:rFonts w:ascii="Arial" w:cs="Arial" w:eastAsia="Arial" w:hAnsi="Arial"/>
-                <w:color w:val="1A1A1A"/>
-                <w:sz w:val="16"/>
-                <w:szCs w:val="16"/>
-              </w:rPr>
-              <w:t xml:space="preserve">Mallplaza trades 29% above Cencosud Shopping (13.0x), yet its EBITDA per m² is only 1.8% higher (CLP 59,451 vs 58,384 in 2Q26; see Industry). Only at Parque Arauco's multiple (18.4x) would the stock be worth more than its price (CLP 3,967), and Parque Arauco runs at 5.7x net debt/EBITDA with its own pipeline, which are not comparable. At Cencosud's multiple it would be worth CLP 2,621.</w:t>
-            </w:r>
-          </w:p>
-          <w:p>
-            <w:pPr>
-              <w:spacing w:after="60" w:before="0" w:line="228" w:lineRule="auto"/>
-              <w:jc w:val="both"/>
-            </w:pPr>
-            <w:r>
-              <w:rPr>
-                <w:rFonts w:ascii="Arial" w:cs="Arial" w:eastAsia="Arial" w:hAnsi="Arial"/>
-                <w:b/>
-                <w:bCs/>
-                <w:color w:val="14284B"/>
-                <w:sz w:val="16"/>
-                <w:szCs w:val="16"/>
-              </w:rPr>
-              <w:t xml:space="preserve">The disagreement is about the rate, not the cash flows. </w:t>
-            </w:r>
-            <w:r>
-              <w:rPr>
-                <w:rFonts w:ascii="Arial" w:cs="Arial" w:eastAsia="Arial" w:hAnsi="Arial"/>
-                <w:color w:val="1A1A1A"/>
-                <w:sz w:val="16"/>
-                <w:szCs w:val="16"/>
-              </w:rPr>
-              <w:t xml:space="preserve">The 13-analyst consensus forecasts NTM EBITDA of CLP 617,130 million, ~3% above our forecast for the same period (~CLP 598,850 million). Our cash flows are not more pessimistic than the market's: the value gap comes from the discount rate the price implies.</w:t>
+              <w:t xml:space="preserve">Nor does quality justify the premium. Mallplaza trades 29% above Cencosud Shopping, yet its EBITDA per m² is only 1.8% higher (see Industry); only at Parque Arauco's multiple (18.4x), with 5.7x leverage, would it be worth more than its price. Every multiple, from EV/EBITDA NTM (CLP 2,914) to P/BV (CLP 3,171), sits below the price (Figure 31): multiples confirm the stock is expensive, and the DCF sets the size of the gap. We exclude P/E (CLP 8,644), distorted by property revaluation.</w:t>
             </w:r>
           </w:p>
         </w:tc>
@@ -957,82 +786,7 @@
                 <w:sz w:val="14"/>
                 <w:szCs w:val="14"/>
               </w:rPr>
-              <w:t xml:space="preserve">Peer multiples vs local rates</w:t>
-            </w:r>
-          </w:p>
-          <w:tbl>
-            <w:tblPr>
-              <w:tblW w:type="dxa" w:w="3550"/>
-              <w:tblBorders>
-                <w:top w:val="single" w:color="auto" w:sz="4"/>
-                <w:left w:val="single" w:color="auto" w:sz="4"/>
-                <w:bottom w:val="single" w:color="auto" w:sz="4"/>
-                <w:right w:val="single" w:color="auto" w:sz="4"/>
-                <w:insideH w:val="single" w:color="auto" w:sz="4"/>
-                <w:insideV w:val="single" w:color="auto" w:sz="4"/>
-              </w:tblBorders>
-            </w:tblPr>
-            <w:tblGrid>
-              <w:gridCol w:w="3550"/>
-            </w:tblGrid>
-            <w:tr>
-              <w:trPr>
-                <w:trHeight w:val="1700" w:hRule="atLeast"/>
-              </w:trPr>
-              <w:tc>
-                <w:tcPr>
-                  <w:tcW w:type="dxa" w:w="3550"/>
-                  <w:tcBorders>
-                    <w:top w:val="dashed" w:color="9AA3B5" w:sz="6"/>
-                    <w:left w:val="dashed" w:color="9AA3B5" w:sz="6"/>
-                    <w:bottom w:val="dashed" w:color="9AA3B5" w:sz="6"/>
-                    <w:right w:val="dashed" w:color="9AA3B5" w:sz="6"/>
-                  </w:tcBorders>
-                  <w:shd w:fill="F7F8FB" w:color="auto" w:val="clear"/>
-                  <w:vAlign w:val="center"/>
-                </w:tcPr>
-                <w:p>
-                  <w:pPr>
-                    <w:jc w:val="center"/>
-                  </w:pPr>
-                  <w:r>
-                    <w:rPr>
-                      <w:rFonts w:ascii="Arial" w:cs="Arial" w:eastAsia="Arial" w:hAnsi="Arial"/>
-                      <w:i/>
-                      <w:iCs/>
-                      <w:color w:val="5F5F5F"/>
-                      <w:sz w:val="14"/>
-                      <w:szCs w:val="14"/>
-                    </w:rPr>
-                    <w:t xml:space="preserve">Chart pending (Brazil NTN-B yield missing, Bloomberg).</w:t>
-                  </w:r>
-                </w:p>
-              </w:tc>
-            </w:tr>
-          </w:tbl>
-          <w:p>
-            <w:pPr>
-              <w:spacing w:after="30" w:before="90" w:line="228" w:lineRule="auto"/>
-            </w:pPr>
-            <w:r>
-              <w:rPr>
-                <w:rFonts w:ascii="Arial" w:cs="Arial" w:eastAsia="Arial" w:hAnsi="Arial"/>
-                <w:b/>
-                <w:bCs/>
-                <w:color w:val="14284B"/>
-                <w:sz w:val="14"/>
-                <w:szCs w:val="14"/>
-              </w:rPr>
-              <w:t xml:space="preserve">Figure 31: </w:t>
-            </w:r>
-            <w:r>
-              <w:rPr>
-                <w:rFonts w:ascii="Arial" w:cs="Arial" w:eastAsia="Arial" w:hAnsi="Arial"/>
-                <w:color w:val="14284B"/>
-                <w:sz w:val="14"/>
-                <w:szCs w:val="14"/>
-              </w:rPr>
-              <w:t xml:space="preserve">Value implied by each peer's multiple vs DCF and price (CLP per share)</w:t>
+              <w:t xml:space="preserve">Chile and Brazil charge the same premium: multiples differ because of rates</w:t>
             </w:r>
           </w:p>
           <w:p>
@@ -1042,7 +796,7 @@
             <w:r>
               <w:drawing>
                 <wp:inline distT="0" distB="0" distL="0" distR="0">
-                  <wp:extent cx="2257425" cy="1962150"/>
+                  <wp:extent cx="2257425" cy="2238375"/>
                   <wp:effectExtent t="0" r="0" b="0" l="0"/>
                   <wp:docPr id="1" name="" descr="" title=""/>
                   <wp:cNvGraphicFramePr>
@@ -1067,7 +821,7 @@
                         <pic:spPr bwMode="auto">
                           <a:xfrm>
                             <a:off x="0" y="0"/>
-                            <a:ext cx="2257425" cy="1962150"/>
+                            <a:ext cx="2257425" cy="2238375"/>
                           </a:xfrm>
                           <a:prstGeom prst="rect">
                             <a:avLst/>
@@ -1091,1201 +845,12 @@
                 <w:sz w:val="11"/>
                 <w:szCs w:val="11"/>
               </w:rPr>
-              <w:t xml:space="preserve">Target = 80% DCF + 20% EV/EBITDA LTM. P/E excluded (includes revaluation). Source: Bloomberg (30-Sep-26); Team analysis.</w:t>
-            </w:r>
-          </w:p>
-        </w:tc>
-      </w:tr>
-      <w:tr>
-        <w:trPr>
-          <w:cantSplit/>
-        </w:trPr>
-        <w:tc>
-          <w:tcPr>
-            <w:tcW w:type="dxa" w:w="6900"/>
-            <w:tcBorders>
-              <w:top w:val="none" w:color="FFFFFF" w:sz="0"/>
-              <w:left w:val="none" w:color="FFFFFF" w:sz="0"/>
-              <w:bottom w:val="none" w:color="FFFFFF" w:sz="0"/>
-              <w:right w:val="none" w:color="FFFFFF" w:sz="0"/>
-            </w:tcBorders>
-            <w:tcMar>
-              <w:top w:type="dxa" w:w="0"/>
-              <w:left w:type="dxa" w:w="0"/>
-              <w:bottom w:type="dxa" w:w="0"/>
-              <w:right w:type="dxa" w:w="0"/>
-            </w:tcMar>
-            <w:vAlign w:val="top"/>
-          </w:tcPr>
-          <w:p>
-            <w:pPr>
-              <w:pBdr>
-                <w:bottom w:val="single" w:color="E9004B" w:sz="8" w:space="1"/>
-              </w:pBdr>
-              <w:spacing w:after="50" w:before="90"/>
-            </w:pPr>
-            <w:r>
-              <w:rPr>
-                <w:rFonts w:ascii="Arial" w:cs="Arial" w:eastAsia="Arial" w:hAnsi="Arial"/>
-                <w:b/>
-                <w:bCs/>
-                <w:color w:val="14284B"/>
-                <w:sz w:val="16"/>
-                <w:szCs w:val="16"/>
-              </w:rPr>
-              <w:t xml:space="preserve">VALUATION SENSITIVITY AND RISKS</w:t>
-            </w:r>
-          </w:p>
-          <w:p>
-            <w:pPr>
-              <w:spacing w:after="60" w:before="0" w:line="228" w:lineRule="auto"/>
-              <w:jc w:val="both"/>
-            </w:pPr>
-            <w:r>
-              <w:rPr>
-                <w:rFonts w:ascii="Arial" w:cs="Arial" w:eastAsia="Arial" w:hAnsi="Arial"/>
-                <w:b/>
-                <w:bCs/>
-                <w:color w:val="14284B"/>
-                <w:sz w:val="16"/>
-                <w:szCs w:val="16"/>
-              </w:rPr>
-              <w:t xml:space="preserve">Sensitivity. </w:t>
-            </w:r>
-            <w:r>
-              <w:rPr>
-                <w:rFonts w:ascii="Arial" w:cs="Arial" w:eastAsia="Arial" w:hAnsi="Arial"/>
-                <w:color w:val="1A1A1A"/>
-                <w:sz w:val="16"/>
-                <w:szCs w:val="16"/>
-              </w:rPr>
-              <w:t xml:space="preserve">With WACC ±100 bp and g between 2.5% and 4.0%, the DCF ranges from CLP 1,379 to 2,329 (Figure 25; Appendix [F]), and the historical worst operating case takes 10.0% off (Figure 24); justifying the price would require a WACC 285 bp lower (Figure 33). Every multiple sits below the price: EV/EBITDA LTM CLP 2,951 (−17%), NTM CLP 2,914 (−18%), EV/EBIT CLP 3,098 (−13%), P/BV CLP 3,171 (−11%) and the Chilean median alone CLP 3,294 (−7%) (Figure 27).</w:t>
-            </w:r>
-          </w:p>
-          <w:p>
-            <w:pPr>
-              <w:spacing w:after="60" w:before="0" w:line="228" w:lineRule="auto"/>
-              <w:jc w:val="both"/>
-            </w:pPr>
-            <w:r>
-              <w:rPr>
-                <w:rFonts w:ascii="Arial" w:cs="Arial" w:eastAsia="Arial" w:hAnsi="Arial"/>
-                <w:b/>
-                <w:bCs/>
-                <w:color w:val="14284B"/>
-                <w:sz w:val="16"/>
-                <w:szCs w:val="16"/>
-              </w:rPr>
-              <w:t xml:space="preserve">Robustness. </w:t>
-            </w:r>
-            <w:r>
-              <w:rPr>
-                <w:rFonts w:ascii="Arial" w:cs="Arial" w:eastAsia="Arial" w:hAnsi="Arial"/>
-                <w:color w:val="1A1A1A"/>
-                <w:sz w:val="16"/>
-                <w:szCs w:val="16"/>
-              </w:rPr>
-              <w:t xml:space="preserve">APV gives CLP 1,894 (2% above the DCF); with the peso bond as Rf, the target price rises to ~CLP 2,439 (−31%; Appendix [Z]); and with a net debt/EBITDA target between 2.36x and 4.0x, the DCF ranges from CLP 1,819 to 1,894.</w:t>
-            </w:r>
-          </w:p>
-          <w:p>
-            <w:pPr>
-              <w:spacing w:after="60" w:before="0" w:line="228" w:lineRule="auto"/>
-              <w:jc w:val="both"/>
-            </w:pPr>
-            <w:r>
-              <w:rPr>
-                <w:rFonts w:ascii="Arial" w:cs="Arial" w:eastAsia="Arial" w:hAnsi="Arial"/>
-                <w:b/>
-                <w:bCs/>
-                <w:color w:val="14284B"/>
-                <w:sz w:val="16"/>
-                <w:szCs w:val="16"/>
-              </w:rPr>
-              <w:t xml:space="preserve">Scenarios. </w:t>
-            </w:r>
-            <w:r>
-              <w:rPr>
-                <w:rFonts w:ascii="Arial" w:cs="Arial" w:eastAsia="Arial" w:hAnsi="Arial"/>
-                <w:color w:val="1A1A1A"/>
-                <w:sz w:val="16"/>
-                <w:szCs w:val="16"/>
-              </w:rPr>
-              <w:t xml:space="preserve">We combine the most favourable and most adverse assumptions. In the bull case a lower g raises value because RONIC is below the WACC. Neither the bull case nor the appraisers' rate reaches the price:</w:t>
-            </w:r>
-          </w:p>
-          <w:tbl>
-            <w:tblPr>
-              <w:tblW w:type="dxa" w:w="6900"/>
-              <w:tblBorders>
-                <w:top w:val="none" w:color="FFFFFF" w:sz="0"/>
-                <w:left w:val="none" w:color="FFFFFF" w:sz="0"/>
-                <w:bottom w:val="none" w:color="FFFFFF" w:sz="0"/>
-                <w:right w:val="none" w:color="FFFFFF" w:sz="0"/>
-                <w:insideH w:val="none" w:color="FFFFFF" w:sz="0"/>
-                <w:insideV w:val="none" w:color="FFFFFF" w:sz="0"/>
-              </w:tblBorders>
-            </w:tblPr>
-            <w:tblGrid>
-              <w:gridCol w:w="1050"/>
-              <w:gridCol w:w="3450"/>
-              <w:gridCol w:w="750"/>
-              <w:gridCol w:w="900"/>
-              <w:gridCol w:w="750"/>
-            </w:tblGrid>
-            <w:tr>
-              <w:trPr>
-                <w:tblHeader/>
-              </w:trPr>
-              <w:tc>
-                <w:tcPr>
-                  <w:tcW w:type="dxa" w:w="1050"/>
-                  <w:tcBorders>
-                    <w:top w:val="none" w:color="FFFFFF" w:sz="0"/>
-                    <w:left w:val="none" w:color="FFFFFF" w:sz="0"/>
-                    <w:bottom w:val="none" w:color="FFFFFF" w:sz="0"/>
-                    <w:right w:val="none" w:color="FFFFFF" w:sz="0"/>
-                  </w:tcBorders>
-                  <w:shd w:fill="14284B" w:color="auto" w:val="clear"/>
-                  <w:tcMar>
-                    <w:top w:type="dxa" w:w="35"/>
-                    <w:left w:type="dxa" w:w="80"/>
-                    <w:bottom w:type="dxa" w:w="35"/>
-                    <w:right w:type="dxa" w:w="80"/>
-                  </w:tcMar>
-                </w:tcPr>
-                <w:p>
-                  <w:pPr>
-                    <w:jc w:val="left"/>
-                  </w:pPr>
-                  <w:r>
-                    <w:rPr>
-                      <w:rFonts w:ascii="Arial" w:cs="Arial" w:eastAsia="Arial" w:hAnsi="Arial"/>
-                      <w:b/>
-                      <w:bCs/>
-                      <w:color w:val="FFFFFF"/>
-                      <w:sz w:val="13"/>
-                      <w:szCs w:val="13"/>
-                    </w:rPr>
-                    <w:t xml:space="preserve">Scenario</w:t>
-                  </w:r>
-                </w:p>
-              </w:tc>
-              <w:tc>
-                <w:tcPr>
-                  <w:tcW w:type="dxa" w:w="3450"/>
-                  <w:tcBorders>
-                    <w:top w:val="none" w:color="FFFFFF" w:sz="0"/>
-                    <w:left w:val="none" w:color="FFFFFF" w:sz="0"/>
-                    <w:bottom w:val="none" w:color="FFFFFF" w:sz="0"/>
-                    <w:right w:val="none" w:color="FFFFFF" w:sz="0"/>
-                  </w:tcBorders>
-                  <w:shd w:fill="14284B" w:color="auto" w:val="clear"/>
-                  <w:tcMar>
-                    <w:top w:type="dxa" w:w="35"/>
-                    <w:left w:type="dxa" w:w="80"/>
-                    <w:bottom w:type="dxa" w:w="35"/>
-                    <w:right w:type="dxa" w:w="80"/>
-                  </w:tcMar>
-                </w:tcPr>
-                <w:p>
-                  <w:pPr>
-                    <w:jc w:val="left"/>
-                  </w:pPr>
-                  <w:r>
-                    <w:rPr>
-                      <w:rFonts w:ascii="Arial" w:cs="Arial" w:eastAsia="Arial" w:hAnsi="Arial"/>
-                      <w:b/>
-                      <w:bCs/>
-                      <w:color w:val="FFFFFF"/>
-                      <w:sz w:val="13"/>
-                      <w:szCs w:val="13"/>
-                    </w:rPr>
-                    <w:t xml:space="preserve">Assumptions</w:t>
-                  </w:r>
-                </w:p>
-              </w:tc>
-              <w:tc>
-                <w:tcPr>
-                  <w:tcW w:type="dxa" w:w="750"/>
-                  <w:tcBorders>
-                    <w:top w:val="none" w:color="FFFFFF" w:sz="0"/>
-                    <w:left w:val="none" w:color="FFFFFF" w:sz="0"/>
-                    <w:bottom w:val="none" w:color="FFFFFF" w:sz="0"/>
-                    <w:right w:val="none" w:color="FFFFFF" w:sz="0"/>
-                  </w:tcBorders>
-                  <w:shd w:fill="14284B" w:color="auto" w:val="clear"/>
-                  <w:tcMar>
-                    <w:top w:type="dxa" w:w="35"/>
-                    <w:left w:type="dxa" w:w="80"/>
-                    <w:bottom w:type="dxa" w:w="35"/>
-                    <w:right w:type="dxa" w:w="80"/>
-                  </w:tcMar>
-                </w:tcPr>
-                <w:p>
-                  <w:pPr>
-                    <w:jc w:val="right"/>
-                  </w:pPr>
-                  <w:r>
-                    <w:rPr>
-                      <w:rFonts w:ascii="Arial" w:cs="Arial" w:eastAsia="Arial" w:hAnsi="Arial"/>
-                      <w:b/>
-                      <w:bCs/>
-                      <w:color w:val="FFFFFF"/>
-                      <w:sz w:val="13"/>
-                      <w:szCs w:val="13"/>
-                    </w:rPr>
-                    <w:t xml:space="preserve">DCF</w:t>
-                  </w:r>
-                </w:p>
-              </w:tc>
-              <w:tc>
-                <w:tcPr>
-                  <w:tcW w:type="dxa" w:w="900"/>
-                  <w:tcBorders>
-                    <w:top w:val="none" w:color="FFFFFF" w:sz="0"/>
-                    <w:left w:val="none" w:color="FFFFFF" w:sz="0"/>
-                    <w:bottom w:val="none" w:color="FFFFFF" w:sz="0"/>
-                    <w:right w:val="none" w:color="FFFFFF" w:sz="0"/>
-                  </w:tcBorders>
-                  <w:shd w:fill="14284B" w:color="auto" w:val="clear"/>
-                  <w:tcMar>
-                    <w:top w:type="dxa" w:w="35"/>
-                    <w:left w:type="dxa" w:w="80"/>
-                    <w:bottom w:type="dxa" w:w="35"/>
-                    <w:right w:type="dxa" w:w="80"/>
-                  </w:tcMar>
-                </w:tcPr>
-                <w:p>
-                  <w:pPr>
-                    <w:jc w:val="right"/>
-                  </w:pPr>
-                  <w:r>
-                    <w:rPr>
-                      <w:rFonts w:ascii="Arial" w:cs="Arial" w:eastAsia="Arial" w:hAnsi="Arial"/>
-                      <w:b/>
-                      <w:bCs/>
-                      <w:color w:val="FFFFFF"/>
-                      <w:sz w:val="13"/>
-                      <w:szCs w:val="13"/>
-                    </w:rPr>
-                    <w:t xml:space="preserve">Target</w:t>
-                  </w:r>
-                </w:p>
-              </w:tc>
-              <w:tc>
-                <w:tcPr>
-                  <w:tcW w:type="dxa" w:w="750"/>
-                  <w:tcBorders>
-                    <w:top w:val="none" w:color="FFFFFF" w:sz="0"/>
-                    <w:left w:val="none" w:color="FFFFFF" w:sz="0"/>
-                    <w:bottom w:val="none" w:color="FFFFFF" w:sz="0"/>
-                    <w:right w:val="none" w:color="FFFFFF" w:sz="0"/>
-                  </w:tcBorders>
-                  <w:shd w:fill="14284B" w:color="auto" w:val="clear"/>
-                  <w:tcMar>
-                    <w:top w:type="dxa" w:w="35"/>
-                    <w:left w:type="dxa" w:w="80"/>
-                    <w:bottom w:type="dxa" w:w="35"/>
-                    <w:right w:type="dxa" w:w="80"/>
-                  </w:tcMar>
-                </w:tcPr>
-                <w:p>
-                  <w:pPr>
-                    <w:jc w:val="right"/>
-                  </w:pPr>
-                  <w:r>
-                    <w:rPr>
-                      <w:rFonts w:ascii="Arial" w:cs="Arial" w:eastAsia="Arial" w:hAnsi="Arial"/>
-                      <w:b/>
-                      <w:bCs/>
-                      <w:color w:val="FFFFFF"/>
-                      <w:sz w:val="13"/>
-                      <w:szCs w:val="13"/>
-                    </w:rPr>
-                    <w:t xml:space="preserve">vs price</w:t>
-                  </w:r>
-                </w:p>
-              </w:tc>
-            </w:tr>
-            <w:tr>
-              <w:tc>
-                <w:tcPr>
-                  <w:tcW w:type="dxa" w:w="1050"/>
-                  <w:tcBorders>
-                    <w:top w:val="none" w:color="FFFFFF" w:sz="0"/>
-                    <w:left w:val="none" w:color="FFFFFF" w:sz="0"/>
-                    <w:bottom w:val="single" w:color="D5D9E0" w:sz="4"/>
-                    <w:right w:val="none" w:color="FFFFFF" w:sz="0"/>
-                  </w:tcBorders>
-                  <w:shd w:fill="F7F8FB" w:color="auto" w:val="clear"/>
-                  <w:tcMar>
-                    <w:top w:type="dxa" w:w="25"/>
-                    <w:left w:type="dxa" w:w="80"/>
-                    <w:bottom w:type="dxa" w:w="25"/>
-                    <w:right w:type="dxa" w:w="80"/>
-                  </w:tcMar>
-                  <w:vAlign w:val="center"/>
-                </w:tcPr>
-                <w:p>
-                  <w:pPr>
-                    <w:spacing w:line="216" w:lineRule="auto"/>
-                    <w:jc w:val="left"/>
-                  </w:pPr>
-                  <w:r>
-                    <w:rPr>
-                      <w:rFonts w:ascii="Arial" w:cs="Arial" w:eastAsia="Arial" w:hAnsi="Arial"/>
-                      <w:b w:val="false"/>
-                      <w:bCs w:val="false"/>
-                      <w:color w:val="1A1A1A"/>
-                      <w:sz w:val="13"/>
-                      <w:szCs w:val="13"/>
-                    </w:rPr>
-                    <w:t xml:space="preserve">Bear</w:t>
-                  </w:r>
-                </w:p>
-              </w:tc>
-              <w:tc>
-                <w:tcPr>
-                  <w:tcW w:type="dxa" w:w="3450"/>
-                  <w:tcBorders>
-                    <w:top w:val="none" w:color="FFFFFF" w:sz="0"/>
-                    <w:left w:val="none" w:color="FFFFFF" w:sz="0"/>
-                    <w:bottom w:val="single" w:color="D5D9E0" w:sz="4"/>
-                    <w:right w:val="none" w:color="FFFFFF" w:sz="0"/>
-                  </w:tcBorders>
-                  <w:shd w:fill="F7F8FB" w:color="auto" w:val="clear"/>
-                  <w:tcMar>
-                    <w:top w:type="dxa" w:w="25"/>
-                    <w:left w:type="dxa" w:w="80"/>
-                    <w:bottom w:type="dxa" w:w="25"/>
-                    <w:right w:type="dxa" w:w="80"/>
-                  </w:tcMar>
-                  <w:vAlign w:val="center"/>
-                </w:tcPr>
-                <w:p>
-                  <w:pPr>
-                    <w:spacing w:line="216" w:lineRule="auto"/>
-                    <w:jc w:val="left"/>
-                  </w:pPr>
-                  <w:r>
-                    <w:rPr>
-                      <w:rFonts w:ascii="Arial" w:cs="Arial" w:eastAsia="Arial" w:hAnsi="Arial"/>
-                      <w:b w:val="false"/>
-                      <w:bCs w:val="false"/>
-                      <w:color w:val="1A1A1A"/>
-                      <w:sz w:val="13"/>
-                      <w:szCs w:val="13"/>
-                    </w:rPr>
-                    <w:t xml:space="preserve">WACC +100 bp; EBITDA margin 75.8% (historical low)</w:t>
-                  </w:r>
-                </w:p>
-              </w:tc>
-              <w:tc>
-                <w:tcPr>
-                  <w:tcW w:type="dxa" w:w="750"/>
-                  <w:tcBorders>
-                    <w:top w:val="none" w:color="FFFFFF" w:sz="0"/>
-                    <w:left w:val="none" w:color="FFFFFF" w:sz="0"/>
-                    <w:bottom w:val="single" w:color="D5D9E0" w:sz="4"/>
-                    <w:right w:val="none" w:color="FFFFFF" w:sz="0"/>
-                  </w:tcBorders>
-                  <w:shd w:fill="F7F8FB" w:color="auto" w:val="clear"/>
-                  <w:tcMar>
-                    <w:top w:type="dxa" w:w="25"/>
-                    <w:left w:type="dxa" w:w="80"/>
-                    <w:bottom w:type="dxa" w:w="25"/>
-                    <w:right w:type="dxa" w:w="80"/>
-                  </w:tcMar>
-                  <w:vAlign w:val="center"/>
-                </w:tcPr>
-                <w:p>
-                  <w:pPr>
-                    <w:spacing w:line="216" w:lineRule="auto"/>
-                    <w:jc w:val="right"/>
-                  </w:pPr>
-                  <w:r>
-                    <w:rPr>
-                      <w:rFonts w:ascii="Arial" w:cs="Arial" w:eastAsia="Arial" w:hAnsi="Arial"/>
-                      <w:b w:val="false"/>
-                      <w:bCs w:val="false"/>
-                      <w:color w:val="1A1A1A"/>
-                      <w:sz w:val="13"/>
-                      <w:szCs w:val="13"/>
-                    </w:rPr>
-                    <w:t xml:space="preserve">1,402</w:t>
-                  </w:r>
-                </w:p>
-              </w:tc>
-              <w:tc>
-                <w:tcPr>
-                  <w:tcW w:type="dxa" w:w="900"/>
-                  <w:tcBorders>
-                    <w:top w:val="none" w:color="FFFFFF" w:sz="0"/>
-                    <w:left w:val="none" w:color="FFFFFF" w:sz="0"/>
-                    <w:bottom w:val="single" w:color="D5D9E0" w:sz="4"/>
-                    <w:right w:val="none" w:color="FFFFFF" w:sz="0"/>
-                  </w:tcBorders>
-                  <w:shd w:fill="F7F8FB" w:color="auto" w:val="clear"/>
-                  <w:tcMar>
-                    <w:top w:type="dxa" w:w="25"/>
-                    <w:left w:type="dxa" w:w="80"/>
-                    <w:bottom w:type="dxa" w:w="25"/>
-                    <w:right w:type="dxa" w:w="80"/>
-                  </w:tcMar>
-                  <w:vAlign w:val="center"/>
-                </w:tcPr>
-                <w:p>
-                  <w:pPr>
-                    <w:spacing w:line="216" w:lineRule="auto"/>
-                    <w:jc w:val="right"/>
-                  </w:pPr>
-                  <w:r>
-                    <w:rPr>
-                      <w:rFonts w:ascii="Arial" w:cs="Arial" w:eastAsia="Arial" w:hAnsi="Arial"/>
-                      <w:b w:val="false"/>
-                      <w:bCs w:val="false"/>
-                      <w:color w:val="1A1A1A"/>
-                      <w:sz w:val="13"/>
-                      <w:szCs w:val="13"/>
-                    </w:rPr>
-                    <w:t xml:space="preserve">1,712</w:t>
-                  </w:r>
-                </w:p>
-              </w:tc>
-              <w:tc>
-                <w:tcPr>
-                  <w:tcW w:type="dxa" w:w="750"/>
-                  <w:tcBorders>
-                    <w:top w:val="none" w:color="FFFFFF" w:sz="0"/>
-                    <w:left w:val="none" w:color="FFFFFF" w:sz="0"/>
-                    <w:bottom w:val="single" w:color="D5D9E0" w:sz="4"/>
-                    <w:right w:val="none" w:color="FFFFFF" w:sz="0"/>
-                  </w:tcBorders>
-                  <w:shd w:fill="F7F8FB" w:color="auto" w:val="clear"/>
-                  <w:tcMar>
-                    <w:top w:type="dxa" w:w="25"/>
-                    <w:left w:type="dxa" w:w="80"/>
-                    <w:bottom w:type="dxa" w:w="25"/>
-                    <w:right w:type="dxa" w:w="80"/>
-                  </w:tcMar>
-                  <w:vAlign w:val="center"/>
-                </w:tcPr>
-                <w:p>
-                  <w:pPr>
-                    <w:spacing w:line="216" w:lineRule="auto"/>
-                    <w:jc w:val="right"/>
-                  </w:pPr>
-                  <w:r>
-                    <w:rPr>
-                      <w:rFonts w:ascii="Arial" w:cs="Arial" w:eastAsia="Arial" w:hAnsi="Arial"/>
-                      <w:b w:val="false"/>
-                      <w:bCs w:val="false"/>
-                      <w:color w:val="1A1A1A"/>
-                      <w:sz w:val="13"/>
-                      <w:szCs w:val="13"/>
-                    </w:rPr>
-                    <w:t xml:space="preserve">−51.9%</w:t>
-                  </w:r>
-                </w:p>
-              </w:tc>
-            </w:tr>
-            <w:tr>
-              <w:tc>
-                <w:tcPr>
-                  <w:tcW w:type="dxa" w:w="1050"/>
-                  <w:tcBorders>
-                    <w:top w:val="none" w:color="FFFFFF" w:sz="0"/>
-                    <w:left w:val="none" w:color="FFFFFF" w:sz="0"/>
-                    <w:bottom w:val="single" w:color="D5D9E0" w:sz="4"/>
-                    <w:right w:val="none" w:color="FFFFFF" w:sz="0"/>
-                  </w:tcBorders>
-                  <w:shd w:fill="FDF1CC" w:color="auto" w:val="clear"/>
-                  <w:tcMar>
-                    <w:top w:type="dxa" w:w="25"/>
-                    <w:left w:type="dxa" w:w="80"/>
-                    <w:bottom w:type="dxa" w:w="25"/>
-                    <w:right w:type="dxa" w:w="80"/>
-                  </w:tcMar>
-                  <w:vAlign w:val="center"/>
-                </w:tcPr>
-                <w:p>
-                  <w:pPr>
-                    <w:spacing w:line="216" w:lineRule="auto"/>
-                    <w:jc w:val="left"/>
-                  </w:pPr>
-                  <w:r>
-                    <w:rPr>
-                      <w:rFonts w:ascii="Arial" w:cs="Arial" w:eastAsia="Arial" w:hAnsi="Arial"/>
-                      <w:b/>
-                      <w:bCs/>
-                      <w:color w:val="1A1A1A"/>
-                      <w:sz w:val="13"/>
-                      <w:szCs w:val="13"/>
-                    </w:rPr>
-                    <w:t xml:space="preserve">Base</w:t>
-                  </w:r>
-                </w:p>
-              </w:tc>
-              <w:tc>
-                <w:tcPr>
-                  <w:tcW w:type="dxa" w:w="3450"/>
-                  <w:tcBorders>
-                    <w:top w:val="none" w:color="FFFFFF" w:sz="0"/>
-                    <w:left w:val="none" w:color="FFFFFF" w:sz="0"/>
-                    <w:bottom w:val="single" w:color="D5D9E0" w:sz="4"/>
-                    <w:right w:val="none" w:color="FFFFFF" w:sz="0"/>
-                  </w:tcBorders>
-                  <w:shd w:fill="FDF1CC" w:color="auto" w:val="clear"/>
-                  <w:tcMar>
-                    <w:top w:type="dxa" w:w="25"/>
-                    <w:left w:type="dxa" w:w="80"/>
-                    <w:bottom w:type="dxa" w:w="25"/>
-                    <w:right w:type="dxa" w:w="80"/>
-                  </w:tcMar>
-                  <w:vAlign w:val="center"/>
-                </w:tcPr>
-                <w:p>
-                  <w:pPr>
-                    <w:spacing w:line="216" w:lineRule="auto"/>
-                    <w:jc w:val="left"/>
-                  </w:pPr>
-                  <w:r>
-                    <w:rPr>
-                      <w:rFonts w:ascii="Arial" w:cs="Arial" w:eastAsia="Arial" w:hAnsi="Arial"/>
-                      <w:b/>
-                      <w:bCs/>
-                      <w:color w:val="1A1A1A"/>
-                      <w:sz w:val="13"/>
-                      <w:szCs w:val="13"/>
-                    </w:rPr>
-                    <w:t xml:space="preserve">Model v2</w:t>
-                  </w:r>
-                </w:p>
-              </w:tc>
-              <w:tc>
-                <w:tcPr>
-                  <w:tcW w:type="dxa" w:w="750"/>
-                  <w:tcBorders>
-                    <w:top w:val="none" w:color="FFFFFF" w:sz="0"/>
-                    <w:left w:val="none" w:color="FFFFFF" w:sz="0"/>
-                    <w:bottom w:val="single" w:color="D5D9E0" w:sz="4"/>
-                    <w:right w:val="none" w:color="FFFFFF" w:sz="0"/>
-                  </w:tcBorders>
-                  <w:shd w:fill="FDF1CC" w:color="auto" w:val="clear"/>
-                  <w:tcMar>
-                    <w:top w:type="dxa" w:w="25"/>
-                    <w:left w:type="dxa" w:w="80"/>
-                    <w:bottom w:type="dxa" w:w="25"/>
-                    <w:right w:type="dxa" w:w="80"/>
-                  </w:tcMar>
-                  <w:vAlign w:val="center"/>
-                </w:tcPr>
-                <w:p>
-                  <w:pPr>
-                    <w:spacing w:line="216" w:lineRule="auto"/>
-                    <w:jc w:val="right"/>
-                  </w:pPr>
-                  <w:r>
-                    <w:rPr>
-                      <w:rFonts w:ascii="Arial" w:cs="Arial" w:eastAsia="Arial" w:hAnsi="Arial"/>
-                      <w:b/>
-                      <w:bCs/>
-                      <w:color w:val="1A1A1A"/>
-                      <w:sz w:val="13"/>
-                      <w:szCs w:val="13"/>
-                    </w:rPr>
-                    <w:t xml:space="preserve">1,857</w:t>
-                  </w:r>
-                </w:p>
-              </w:tc>
-              <w:tc>
-                <w:tcPr>
-                  <w:tcW w:type="dxa" w:w="900"/>
-                  <w:tcBorders>
-                    <w:top w:val="none" w:color="FFFFFF" w:sz="0"/>
-                    <w:left w:val="none" w:color="FFFFFF" w:sz="0"/>
-                    <w:bottom w:val="single" w:color="D5D9E0" w:sz="4"/>
-                    <w:right w:val="none" w:color="FFFFFF" w:sz="0"/>
-                  </w:tcBorders>
-                  <w:shd w:fill="FDF1CC" w:color="auto" w:val="clear"/>
-                  <w:tcMar>
-                    <w:top w:type="dxa" w:w="25"/>
-                    <w:left w:type="dxa" w:w="80"/>
-                    <w:bottom w:type="dxa" w:w="25"/>
-                    <w:right w:type="dxa" w:w="80"/>
-                  </w:tcMar>
-                  <w:vAlign w:val="center"/>
-                </w:tcPr>
-                <w:p>
-                  <w:pPr>
-                    <w:spacing w:line="216" w:lineRule="auto"/>
-                    <w:jc w:val="right"/>
-                  </w:pPr>
-                  <w:r>
-                    <w:rPr>
-                      <w:rFonts w:ascii="Arial" w:cs="Arial" w:eastAsia="Arial" w:hAnsi="Arial"/>
-                      <w:b/>
-                      <w:bCs/>
-                      <w:color w:val="1A1A1A"/>
-                      <w:sz w:val="13"/>
-                      <w:szCs w:val="13"/>
-                    </w:rPr>
-                    <w:t xml:space="preserve">2,076</w:t>
-                  </w:r>
-                </w:p>
-              </w:tc>
-              <w:tc>
-                <w:tcPr>
-                  <w:tcW w:type="dxa" w:w="750"/>
-                  <w:tcBorders>
-                    <w:top w:val="none" w:color="FFFFFF" w:sz="0"/>
-                    <w:left w:val="none" w:color="FFFFFF" w:sz="0"/>
-                    <w:bottom w:val="single" w:color="D5D9E0" w:sz="4"/>
-                    <w:right w:val="none" w:color="FFFFFF" w:sz="0"/>
-                  </w:tcBorders>
-                  <w:shd w:fill="FDF1CC" w:color="auto" w:val="clear"/>
-                  <w:tcMar>
-                    <w:top w:type="dxa" w:w="25"/>
-                    <w:left w:type="dxa" w:w="80"/>
-                    <w:bottom w:type="dxa" w:w="25"/>
-                    <w:right w:type="dxa" w:w="80"/>
-                  </w:tcMar>
-                  <w:vAlign w:val="center"/>
-                </w:tcPr>
-                <w:p>
-                  <w:pPr>
-                    <w:spacing w:line="216" w:lineRule="auto"/>
-                    <w:jc w:val="right"/>
-                  </w:pPr>
-                  <w:r>
-                    <w:rPr>
-                      <w:rFonts w:ascii="Arial" w:cs="Arial" w:eastAsia="Arial" w:hAnsi="Arial"/>
-                      <w:b/>
-                      <w:bCs/>
-                      <w:color w:val="1A1A1A"/>
-                      <w:sz w:val="13"/>
-                      <w:szCs w:val="13"/>
-                    </w:rPr>
-                    <w:t xml:space="preserve">−41.6%</w:t>
-                  </w:r>
-                </w:p>
-              </w:tc>
-            </w:tr>
-            <w:tr>
-              <w:tc>
-                <w:tcPr>
-                  <w:tcW w:type="dxa" w:w="1050"/>
-                  <w:tcBorders>
-                    <w:top w:val="none" w:color="FFFFFF" w:sz="0"/>
-                    <w:left w:val="none" w:color="FFFFFF" w:sz="0"/>
-                    <w:bottom w:val="single" w:color="D5D9E0" w:sz="4"/>
-                    <w:right w:val="none" w:color="FFFFFF" w:sz="0"/>
-                  </w:tcBorders>
-                  <w:shd w:fill="F7F8FB" w:color="auto" w:val="clear"/>
-                  <w:tcMar>
-                    <w:top w:type="dxa" w:w="25"/>
-                    <w:left w:type="dxa" w:w="80"/>
-                    <w:bottom w:type="dxa" w:w="25"/>
-                    <w:right w:type="dxa" w:w="80"/>
-                  </w:tcMar>
-                  <w:vAlign w:val="center"/>
-                </w:tcPr>
-                <w:p>
-                  <w:pPr>
-                    <w:spacing w:line="216" w:lineRule="auto"/>
-                    <w:jc w:val="left"/>
-                  </w:pPr>
-                  <w:r>
-                    <w:rPr>
-                      <w:rFonts w:ascii="Arial" w:cs="Arial" w:eastAsia="Arial" w:hAnsi="Arial"/>
-                      <w:b w:val="false"/>
-                      <w:bCs w:val="false"/>
-                      <w:color w:val="1A1A1A"/>
-                      <w:sz w:val="13"/>
-                      <w:szCs w:val="13"/>
-                    </w:rPr>
-                    <w:t xml:space="preserve">Bull</w:t>
-                  </w:r>
-                </w:p>
-              </w:tc>
-              <w:tc>
-                <w:tcPr>
-                  <w:tcW w:type="dxa" w:w="3450"/>
-                  <w:tcBorders>
-                    <w:top w:val="none" w:color="FFFFFF" w:sz="0"/>
-                    <w:left w:val="none" w:color="FFFFFF" w:sz="0"/>
-                    <w:bottom w:val="single" w:color="D5D9E0" w:sz="4"/>
-                    <w:right w:val="none" w:color="FFFFFF" w:sz="0"/>
-                  </w:tcBorders>
-                  <w:shd w:fill="F7F8FB" w:color="auto" w:val="clear"/>
-                  <w:tcMar>
-                    <w:top w:type="dxa" w:w="25"/>
-                    <w:left w:type="dxa" w:w="80"/>
-                    <w:bottom w:type="dxa" w:w="25"/>
-                    <w:right w:type="dxa" w:w="80"/>
-                  </w:tcMar>
-                  <w:vAlign w:val="center"/>
-                </w:tcPr>
-                <w:p>
-                  <w:pPr>
-                    <w:spacing w:line="216" w:lineRule="auto"/>
-                    <w:jc w:val="left"/>
-                  </w:pPr>
-                  <w:r>
-                    <w:rPr>
-                      <w:rFonts w:ascii="Arial" w:cs="Arial" w:eastAsia="Arial" w:hAnsi="Arial"/>
-                      <w:b w:val="false"/>
-                      <w:bCs w:val="false"/>
-                      <w:color w:val="1A1A1A"/>
-                      <w:sz w:val="13"/>
-                      <w:szCs w:val="13"/>
-                    </w:rPr>
-                    <w:t xml:space="preserve">WACC −100 bp; g 2.5%; margin 81.3% (high); 23% tax in Chile</w:t>
-                  </w:r>
-                </w:p>
-              </w:tc>
-              <w:tc>
-                <w:tcPr>
-                  <w:tcW w:type="dxa" w:w="750"/>
-                  <w:tcBorders>
-                    <w:top w:val="none" w:color="FFFFFF" w:sz="0"/>
-                    <w:left w:val="none" w:color="FFFFFF" w:sz="0"/>
-                    <w:bottom w:val="single" w:color="D5D9E0" w:sz="4"/>
-                    <w:right w:val="none" w:color="FFFFFF" w:sz="0"/>
-                  </w:tcBorders>
-                  <w:shd w:fill="F7F8FB" w:color="auto" w:val="clear"/>
-                  <w:tcMar>
-                    <w:top w:type="dxa" w:w="25"/>
-                    <w:left w:type="dxa" w:w="80"/>
-                    <w:bottom w:type="dxa" w:w="25"/>
-                    <w:right w:type="dxa" w:w="80"/>
-                  </w:tcMar>
-                  <w:vAlign w:val="center"/>
-                </w:tcPr>
-                <w:p>
-                  <w:pPr>
-                    <w:spacing w:line="216" w:lineRule="auto"/>
-                    <w:jc w:val="right"/>
-                  </w:pPr>
-                  <w:r>
-                    <w:rPr>
-                      <w:rFonts w:ascii="Arial" w:cs="Arial" w:eastAsia="Arial" w:hAnsi="Arial"/>
-                      <w:b w:val="false"/>
-                      <w:bCs w:val="false"/>
-                      <w:color w:val="1A1A1A"/>
-                      <w:sz w:val="13"/>
-                      <w:szCs w:val="13"/>
-                    </w:rPr>
-                    <w:t xml:space="preserve">2,506</w:t>
-                  </w:r>
-                </w:p>
-              </w:tc>
-              <w:tc>
-                <w:tcPr>
-                  <w:tcW w:type="dxa" w:w="900"/>
-                  <w:tcBorders>
-                    <w:top w:val="none" w:color="FFFFFF" w:sz="0"/>
-                    <w:left w:val="none" w:color="FFFFFF" w:sz="0"/>
-                    <w:bottom w:val="single" w:color="D5D9E0" w:sz="4"/>
-                    <w:right w:val="none" w:color="FFFFFF" w:sz="0"/>
-                  </w:tcBorders>
-                  <w:shd w:fill="F7F8FB" w:color="auto" w:val="clear"/>
-                  <w:tcMar>
-                    <w:top w:type="dxa" w:w="25"/>
-                    <w:left w:type="dxa" w:w="80"/>
-                    <w:bottom w:type="dxa" w:w="25"/>
-                    <w:right w:type="dxa" w:w="80"/>
-                  </w:tcMar>
-                  <w:vAlign w:val="center"/>
-                </w:tcPr>
-                <w:p>
-                  <w:pPr>
-                    <w:spacing w:line="216" w:lineRule="auto"/>
-                    <w:jc w:val="right"/>
-                  </w:pPr>
-                  <w:r>
-                    <w:rPr>
-                      <w:rFonts w:ascii="Arial" w:cs="Arial" w:eastAsia="Arial" w:hAnsi="Arial"/>
-                      <w:b w:val="false"/>
-                      <w:bCs w:val="false"/>
-                      <w:color w:val="1A1A1A"/>
-                      <w:sz w:val="13"/>
-                      <w:szCs w:val="13"/>
-                    </w:rPr>
-                    <w:t xml:space="preserve">2,595</w:t>
-                  </w:r>
-                </w:p>
-              </w:tc>
-              <w:tc>
-                <w:tcPr>
-                  <w:tcW w:type="dxa" w:w="750"/>
-                  <w:tcBorders>
-                    <w:top w:val="none" w:color="FFFFFF" w:sz="0"/>
-                    <w:left w:val="none" w:color="FFFFFF" w:sz="0"/>
-                    <w:bottom w:val="single" w:color="D5D9E0" w:sz="4"/>
-                    <w:right w:val="none" w:color="FFFFFF" w:sz="0"/>
-                  </w:tcBorders>
-                  <w:shd w:fill="F7F8FB" w:color="auto" w:val="clear"/>
-                  <w:tcMar>
-                    <w:top w:type="dxa" w:w="25"/>
-                    <w:left w:type="dxa" w:w="80"/>
-                    <w:bottom w:type="dxa" w:w="25"/>
-                    <w:right w:type="dxa" w:w="80"/>
-                  </w:tcMar>
-                  <w:vAlign w:val="center"/>
-                </w:tcPr>
-                <w:p>
-                  <w:pPr>
-                    <w:spacing w:line="216" w:lineRule="auto"/>
-                    <w:jc w:val="right"/>
-                  </w:pPr>
-                  <w:r>
-                    <w:rPr>
-                      <w:rFonts w:ascii="Arial" w:cs="Arial" w:eastAsia="Arial" w:hAnsi="Arial"/>
-                      <w:b w:val="false"/>
-                      <w:bCs w:val="false"/>
-                      <w:color w:val="1A1A1A"/>
-                      <w:sz w:val="13"/>
-                      <w:szCs w:val="13"/>
-                    </w:rPr>
-                    <w:t xml:space="preserve">−27.0%</w:t>
-                  </w:r>
-                </w:p>
-              </w:tc>
-            </w:tr>
-            <w:tr>
-              <w:tc>
-                <w:tcPr>
-                  <w:tcW w:type="dxa" w:w="1050"/>
-                  <w:tcBorders>
-                    <w:top w:val="none" w:color="FFFFFF" w:sz="0"/>
-                    <w:left w:val="none" w:color="FFFFFF" w:sz="0"/>
-                    <w:bottom w:val="single" w:color="D5D9E0" w:sz="4"/>
-                    <w:right w:val="none" w:color="FFFFFF" w:sz="0"/>
-                  </w:tcBorders>
-                  <w:shd w:fill="FFFFFF" w:color="auto" w:val="clear"/>
-                  <w:tcMar>
-                    <w:top w:type="dxa" w:w="25"/>
-                    <w:left w:type="dxa" w:w="80"/>
-                    <w:bottom w:type="dxa" w:w="25"/>
-                    <w:right w:type="dxa" w:w="80"/>
-                  </w:tcMar>
-                  <w:vAlign w:val="center"/>
-                </w:tcPr>
-                <w:p>
-                  <w:pPr>
-                    <w:spacing w:line="216" w:lineRule="auto"/>
-                    <w:jc w:val="left"/>
-                  </w:pPr>
-                  <w:r>
-                    <w:rPr>
-                      <w:rFonts w:ascii="Arial" w:cs="Arial" w:eastAsia="Arial" w:hAnsi="Arial"/>
-                      <w:b w:val="false"/>
-                      <w:bCs w:val="false"/>
-                      <w:color w:val="1A1A1A"/>
-                      <w:sz w:val="13"/>
-                      <w:szCs w:val="13"/>
-                    </w:rPr>
-                    <w:t xml:space="preserve">Appraisers</w:t>
-                  </w:r>
-                </w:p>
-              </w:tc>
-              <w:tc>
-                <w:tcPr>
-                  <w:tcW w:type="dxa" w:w="3450"/>
-                  <w:tcBorders>
-                    <w:top w:val="none" w:color="FFFFFF" w:sz="0"/>
-                    <w:left w:val="none" w:color="FFFFFF" w:sz="0"/>
-                    <w:bottom w:val="single" w:color="D5D9E0" w:sz="4"/>
-                    <w:right w:val="none" w:color="FFFFFF" w:sz="0"/>
-                  </w:tcBorders>
-                  <w:shd w:fill="FFFFFF" w:color="auto" w:val="clear"/>
-                  <w:tcMar>
-                    <w:top w:type="dxa" w:w="25"/>
-                    <w:left w:type="dxa" w:w="80"/>
-                    <w:bottom w:type="dxa" w:w="25"/>
-                    <w:right w:type="dxa" w:w="80"/>
-                  </w:tcMar>
-                  <w:vAlign w:val="center"/>
-                </w:tcPr>
-                <w:p>
-                  <w:pPr>
-                    <w:spacing w:line="216" w:lineRule="auto"/>
-                    <w:jc w:val="left"/>
-                  </w:pPr>
-                  <w:r>
-                    <w:rPr>
-                      <w:rFonts w:ascii="Arial" w:cs="Arial" w:eastAsia="Arial" w:hAnsi="Arial"/>
-                      <w:b w:val="false"/>
-                      <w:bCs w:val="false"/>
-                      <w:color w:val="1A1A1A"/>
-                      <w:sz w:val="13"/>
-                      <w:szCs w:val="13"/>
-                    </w:rPr>
-                    <w:t xml:space="preserve">WACC 8.72% (5.55% real, Note 11)</w:t>
-                  </w:r>
-                </w:p>
-              </w:tc>
-              <w:tc>
-                <w:tcPr>
-                  <w:tcW w:type="dxa" w:w="750"/>
-                  <w:tcBorders>
-                    <w:top w:val="none" w:color="FFFFFF" w:sz="0"/>
-                    <w:left w:val="none" w:color="FFFFFF" w:sz="0"/>
-                    <w:bottom w:val="single" w:color="D5D9E0" w:sz="4"/>
-                    <w:right w:val="none" w:color="FFFFFF" w:sz="0"/>
-                  </w:tcBorders>
-                  <w:shd w:fill="FFFFFF" w:color="auto" w:val="clear"/>
-                  <w:tcMar>
-                    <w:top w:type="dxa" w:w="25"/>
-                    <w:left w:type="dxa" w:w="80"/>
-                    <w:bottom w:type="dxa" w:w="25"/>
-                    <w:right w:type="dxa" w:w="80"/>
-                  </w:tcMar>
-                  <w:vAlign w:val="center"/>
-                </w:tcPr>
-                <w:p>
-                  <w:pPr>
-                    <w:spacing w:line="216" w:lineRule="auto"/>
-                    <w:jc w:val="right"/>
-                  </w:pPr>
-                  <w:r>
-                    <w:rPr>
-                      <w:rFonts w:ascii="Arial" w:cs="Arial" w:eastAsia="Arial" w:hAnsi="Arial"/>
-                      <w:b w:val="false"/>
-                      <w:bCs w:val="false"/>
-                      <w:color w:val="1A1A1A"/>
-                      <w:sz w:val="13"/>
-                      <w:szCs w:val="13"/>
-                    </w:rPr>
-                    <w:t xml:space="preserve">2,660</w:t>
-                  </w:r>
-                </w:p>
-              </w:tc>
-              <w:tc>
-                <w:tcPr>
-                  <w:tcW w:type="dxa" w:w="900"/>
-                  <w:tcBorders>
-                    <w:top w:val="none" w:color="FFFFFF" w:sz="0"/>
-                    <w:left w:val="none" w:color="FFFFFF" w:sz="0"/>
-                    <w:bottom w:val="single" w:color="D5D9E0" w:sz="4"/>
-                    <w:right w:val="none" w:color="FFFFFF" w:sz="0"/>
-                  </w:tcBorders>
-                  <w:shd w:fill="FFFFFF" w:color="auto" w:val="clear"/>
-                  <w:tcMar>
-                    <w:top w:type="dxa" w:w="25"/>
-                    <w:left w:type="dxa" w:w="80"/>
-                    <w:bottom w:type="dxa" w:w="25"/>
-                    <w:right w:type="dxa" w:w="80"/>
-                  </w:tcMar>
-                  <w:vAlign w:val="center"/>
-                </w:tcPr>
-                <w:p>
-                  <w:pPr>
-                    <w:spacing w:line="216" w:lineRule="auto"/>
-                    <w:jc w:val="right"/>
-                  </w:pPr>
-                  <w:r>
-                    <w:rPr>
-                      <w:rFonts w:ascii="Arial" w:cs="Arial" w:eastAsia="Arial" w:hAnsi="Arial"/>
-                      <w:b w:val="false"/>
-                      <w:bCs w:val="false"/>
-                      <w:color w:val="1A1A1A"/>
-                      <w:sz w:val="13"/>
-                      <w:szCs w:val="13"/>
-                    </w:rPr>
-                    <w:t xml:space="preserve">2,719</w:t>
-                  </w:r>
-                </w:p>
-              </w:tc>
-              <w:tc>
-                <w:tcPr>
-                  <w:tcW w:type="dxa" w:w="750"/>
-                  <w:tcBorders>
-                    <w:top w:val="none" w:color="FFFFFF" w:sz="0"/>
-                    <w:left w:val="none" w:color="FFFFFF" w:sz="0"/>
-                    <w:bottom w:val="single" w:color="D5D9E0" w:sz="4"/>
-                    <w:right w:val="none" w:color="FFFFFF" w:sz="0"/>
-                  </w:tcBorders>
-                  <w:shd w:fill="FFFFFF" w:color="auto" w:val="clear"/>
-                  <w:tcMar>
-                    <w:top w:type="dxa" w:w="25"/>
-                    <w:left w:type="dxa" w:w="80"/>
-                    <w:bottom w:type="dxa" w:w="25"/>
-                    <w:right w:type="dxa" w:w="80"/>
-                  </w:tcMar>
-                  <w:vAlign w:val="center"/>
-                </w:tcPr>
-                <w:p>
-                  <w:pPr>
-                    <w:spacing w:line="216" w:lineRule="auto"/>
-                    <w:jc w:val="right"/>
-                  </w:pPr>
-                  <w:r>
-                    <w:rPr>
-                      <w:rFonts w:ascii="Arial" w:cs="Arial" w:eastAsia="Arial" w:hAnsi="Arial"/>
-                      <w:b w:val="false"/>
-                      <w:bCs w:val="false"/>
-                      <w:color w:val="1A1A1A"/>
-                      <w:sz w:val="13"/>
-                      <w:szCs w:val="13"/>
-                    </w:rPr>
-                    <w:t xml:space="preserve">−23.5%</w:t>
-                  </w:r>
-                </w:p>
-              </w:tc>
-            </w:tr>
-          </w:tbl>
-          <w:p>
-            <w:pPr>
-              <w:spacing w:after="60"/>
-            </w:pPr>
-          </w:p>
-          <w:p>
-            <w:pPr>
-              <w:spacing w:after="60" w:before="0" w:line="228" w:lineRule="auto"/>
-              <w:jc w:val="both"/>
-            </w:pPr>
-            <w:r>
-              <w:rPr>
-                <w:rFonts w:ascii="Arial" w:cs="Arial" w:eastAsia="Arial" w:hAnsi="Arial"/>
-                <w:b/>
-                <w:bCs/>
-                <w:color w:val="14284B"/>
-                <w:sz w:val="16"/>
-                <w:szCs w:val="16"/>
-              </w:rPr>
-              <w:t xml:space="preserve">Target price. </w:t>
-            </w:r>
-            <w:r>
-              <w:rPr>
-                <w:rFonts w:ascii="Arial" w:cs="Arial" w:eastAsia="Arial" w:hAnsi="Arial"/>
-                <w:color w:val="1A1A1A"/>
-                <w:sz w:val="16"/>
-                <w:szCs w:val="16"/>
-              </w:rPr>
-              <w:t xml:space="preserve">80% × CLP 1,857 + 20% × CLP 2,951 = CLP 2,076, a −41.6% return against CLP 3,555 (30-Sep-26). Rolling the DCF from 30-Jun to 30-Sep-26 would lift it to ~CLP 1,910 and the target to ~CLP 2,118 (−40.4%): the recommendation does not change.</w:t>
-            </w:r>
-          </w:p>
-          <w:p>
-            <w:pPr>
-              <w:spacing w:after="60" w:before="0" w:line="228" w:lineRule="auto"/>
-              <w:jc w:val="both"/>
-            </w:pPr>
-            <w:r>
-              <w:rPr>
-                <w:rFonts w:ascii="Arial" w:cs="Arial" w:eastAsia="Arial" w:hAnsi="Arial"/>
-                <w:b/>
-                <w:bCs/>
-                <w:color w:val="14284B"/>
-                <w:sz w:val="16"/>
-                <w:szCs w:val="16"/>
-              </w:rPr>
-              <w:t xml:space="preserve">Total return and implied metrics. </w:t>
-            </w:r>
-            <w:r>
-              <w:rPr>
-                <w:rFonts w:ascii="Arial" w:cs="Arial" w:eastAsia="Arial" w:hAnsi="Arial"/>
-                <w:color w:val="1A1A1A"/>
-                <w:sz w:val="16"/>
-                <w:szCs w:val="16"/>
-              </w:rPr>
-              <w:t xml:space="preserve">With an expected dividend of ~CLP 69 per share (2.0% yield), the expected total return is −39.7%. The target price implies 10.8x LTM EV/EBITDA, a 9.3% cap rate and 0.94x book value, versus 16.7x, 6.0% and 1.61x at the current price (Figure 32).</w:t>
-            </w:r>
-          </w:p>
-          <w:p>
-            <w:pPr>
-              <w:spacing w:after="60" w:before="0" w:line="228" w:lineRule="auto"/>
-              <w:jc w:val="both"/>
-            </w:pPr>
-            <w:r>
-              <w:rPr>
-                <w:rFonts w:ascii="Arial" w:cs="Arial" w:eastAsia="Arial" w:hAnsi="Arial"/>
-                <w:b/>
-                <w:bCs/>
-                <w:color w:val="14284B"/>
-                <w:sz w:val="16"/>
-                <w:szCs w:val="16"/>
-              </w:rPr>
-              <w:t xml:space="preserve">Catalysts. </w:t>
-            </w:r>
-            <w:r>
-              <w:rPr>
-                <w:rFonts w:ascii="Arial" w:cs="Arial" w:eastAsia="Arial" w:hAnsi="Arial"/>
-                <w:color w:val="1A1A1A"/>
-                <w:sz w:val="16"/>
-                <w:szCs w:val="16"/>
-              </w:rPr>
-              <w:t xml:space="preserve">The 10Y UST at 5.22%, its highest since 2002, and Fed hikes put pressure on market cap rates (Investment Risks, FR1). Each appraisal update at higher rates brings book value closer to our DCF and removes support for the current multiple.</w:t>
-            </w:r>
-          </w:p>
-          <w:p>
-            <w:pPr>
-              <w:spacing w:after="60" w:before="0" w:line="228" w:lineRule="auto"/>
-              <w:jc w:val="both"/>
-            </w:pPr>
-            <w:r>
-              <w:rPr>
-                <w:rFonts w:ascii="Arial" w:cs="Arial" w:eastAsia="Arial" w:hAnsi="Arial"/>
-                <w:b/>
-                <w:bCs/>
-                <w:color w:val="14284B"/>
-                <w:sz w:val="16"/>
-                <w:szCs w:val="16"/>
-              </w:rPr>
-              <w:t xml:space="preserve">Upside risks. </w:t>
-            </w:r>
-            <w:r>
-              <w:rPr>
-                <w:rFonts w:ascii="Arial" w:cs="Arial" w:eastAsia="Arial" w:hAnsi="Arial"/>
-                <w:color w:val="1A1A1A"/>
-                <w:sz w:val="16"/>
-                <w:szCs w:val="16"/>
-              </w:rPr>
-              <w:t xml:space="preserve">A sustained compression of cap rates on stronger institutional demand for defensive assets, or a structural premium for Mallplaza's Tier A assets (see Investment Risks).</w:t>
-            </w:r>
-          </w:p>
-        </w:tc>
-        <w:tc>
-          <w:tcPr>
-            <w:tcW w:type="dxa" w:w="216"/>
-            <w:tcBorders>
-              <w:top w:val="none" w:color="FFFFFF" w:sz="0"/>
-              <w:left w:val="none" w:color="FFFFFF" w:sz="0"/>
-              <w:bottom w:val="none" w:color="FFFFFF" w:sz="0"/>
-              <w:right w:val="none" w:color="FFFFFF" w:sz="0"/>
-            </w:tcBorders>
-            <w:tcMar>
-              <w:top w:type="dxa" w:w="0"/>
-              <w:left w:type="dxa" w:w="0"/>
-              <w:bottom w:type="dxa" w:w="0"/>
-              <w:right w:type="dxa" w:w="0"/>
-            </w:tcMar>
-            <w:vAlign w:val="top"/>
-          </w:tcPr>
-          <w:p/>
-        </w:tc>
-        <w:tc>
-          <w:tcPr>
-            <w:tcW w:type="dxa" w:w="3550"/>
-            <w:tcBorders>
-              <w:top w:val="none" w:color="FFFFFF" w:sz="0"/>
-              <w:left w:val="none" w:color="FFFFFF" w:sz="0"/>
-              <w:bottom w:val="none" w:color="FFFFFF" w:sz="0"/>
-              <w:right w:val="none" w:color="FFFFFF" w:sz="0"/>
-            </w:tcBorders>
-            <w:tcMar>
-              <w:top w:type="dxa" w:w="0"/>
-              <w:left w:type="dxa" w:w="0"/>
-              <w:bottom w:type="dxa" w:w="0"/>
-              <w:right w:type="dxa" w:w="0"/>
-            </w:tcMar>
-            <w:vAlign w:val="top"/>
-          </w:tcPr>
-          <w:p>
-            <w:pPr>
-              <w:spacing w:after="30" w:before="20" w:line="228" w:lineRule="auto"/>
+              <w:t xml:space="preserve">Real bond: 10Y UF (Central Bank of Chile) and NTN-B 2035 (8.08%) at 30-Jun-26. Spread = cap rate (1 / EV/EBITDA) − real bond. IRSA omitted (IAS 29). Source: Bloomberg; Central Bank of Chile; Team analysis.</w:t>
+            </w:r>
+          </w:p>
+          <w:p>
+            <w:pPr>
+              <w:spacing w:after="30" w:before="90" w:line="228" w:lineRule="auto"/>
             </w:pPr>
             <w:r>
               <w:rPr>
@@ -2296,7 +861,7 @@
                 <w:sz w:val="14"/>
                 <w:szCs w:val="14"/>
               </w:rPr>
-              <w:t xml:space="preserve">Figure 32: </w:t>
+              <w:t xml:space="preserve">Figure 31: </w:t>
             </w:r>
             <w:r>
               <w:rPr>
@@ -2305,7 +870,7 @@
                 <w:sz w:val="14"/>
                 <w:szCs w:val="14"/>
               </w:rPr>
-              <w:t xml:space="preserve">The market pays 6.0%; our cash flows are worth 10.1%</w:t>
+              <w:t xml:space="preserve">Value implied by each peer's multiple vs DCF and price (CLP per share)</w:t>
             </w:r>
           </w:p>
           <w:p>
@@ -2315,7 +880,7 @@
             <w:r>
               <w:drawing>
                 <wp:inline distT="0" distB="0" distL="0" distR="0">
-                  <wp:extent cx="2257425" cy="1600200"/>
+                  <wp:extent cx="2257425" cy="1962150"/>
                   <wp:effectExtent t="0" r="0" b="0" l="0"/>
                   <wp:docPr id="1" name="" descr="" title=""/>
                   <wp:cNvGraphicFramePr>
@@ -2340,6 +905,214 @@
                         <pic:spPr bwMode="auto">
                           <a:xfrm>
                             <a:off x="0" y="0"/>
+                            <a:ext cx="2257425" cy="1962150"/>
+                          </a:xfrm>
+                          <a:prstGeom prst="rect">
+                            <a:avLst/>
+                          </a:prstGeom>
+                        </pic:spPr>
+                      </pic:pic>
+                    </a:graphicData>
+                  </a:graphic>
+                </wp:inline>
+              </w:drawing>
+            </w:r>
+          </w:p>
+          <w:p>
+            <w:pPr>
+              <w:spacing w:after="0" w:before="10" w:line="216" w:lineRule="auto"/>
+            </w:pPr>
+            <w:r>
+              <w:rPr>
+                <w:rFonts w:ascii="Arial" w:cs="Arial" w:eastAsia="Arial" w:hAnsi="Arial"/>
+                <w:color w:val="5F5F5F"/>
+                <w:sz w:val="11"/>
+                <w:szCs w:val="11"/>
+              </w:rPr>
+              <w:t xml:space="preserve">Target = 80% DCF + 20% EV/EBITDA LTM. P/E excluded (includes revaluation). Source: Bloomberg (30-Sep-26); Team analysis.</w:t>
+            </w:r>
+          </w:p>
+        </w:tc>
+      </w:tr>
+      <w:tr>
+        <w:trPr>
+          <w:cantSplit/>
+        </w:trPr>
+        <w:tc>
+          <w:tcPr>
+            <w:tcW w:type="dxa" w:w="6900"/>
+            <w:tcBorders>
+              <w:top w:val="none" w:color="FFFFFF" w:sz="0"/>
+              <w:left w:val="none" w:color="FFFFFF" w:sz="0"/>
+              <w:bottom w:val="none" w:color="FFFFFF" w:sz="0"/>
+              <w:right w:val="none" w:color="FFFFFF" w:sz="0"/>
+            </w:tcBorders>
+            <w:tcMar>
+              <w:top w:type="dxa" w:w="0"/>
+              <w:left w:type="dxa" w:w="0"/>
+              <w:bottom w:type="dxa" w:w="0"/>
+              <w:right w:type="dxa" w:w="0"/>
+            </w:tcMar>
+            <w:vAlign w:val="top"/>
+          </w:tcPr>
+          <w:p>
+            <w:pPr>
+              <w:pBdr>
+                <w:bottom w:val="single" w:color="E9004B" w:sz="8" w:space="1"/>
+              </w:pBdr>
+              <w:spacing w:after="50" w:before="90"/>
+            </w:pPr>
+            <w:r>
+              <w:rPr>
+                <w:rFonts w:ascii="Arial" w:cs="Arial" w:eastAsia="Arial" w:hAnsi="Arial"/>
+                <w:b/>
+                <w:bCs/>
+                <w:color w:val="14284B"/>
+                <w:sz w:val="16"/>
+                <w:szCs w:val="16"/>
+              </w:rPr>
+              <w:t xml:space="preserve">WHAT THE MARKET WOULD HAVE TO BELIEVE</w:t>
+            </w:r>
+          </w:p>
+          <w:p>
+            <w:pPr>
+              <w:spacing w:after="60" w:before="0" w:line="228" w:lineRule="auto"/>
+              <w:jc w:val="both"/>
+            </w:pPr>
+            <w:r>
+              <w:rPr>
+                <w:rFonts w:ascii="Arial" w:cs="Arial" w:eastAsia="Arial" w:hAnsi="Arial"/>
+                <w:color w:val="1A1A1A"/>
+                <w:sz w:val="16"/>
+                <w:szCs w:val="16"/>
+              </w:rPr>
+              <w:t xml:space="preserve">The price implies an EV of CLP 9.12 trillion, 69% above ours, and a 6.0% cap rate, against 10.1% in our DCF, 6.4% for Chilean peers and 7.5% at book value (Figure 32). The market pays 1.61x an equity base already at fair value, appraised at a ~5.55% real rate (Note 11): it pays more than the appraisers themselves. To justify CLP 3,555, the WACC would have to be 285 bp lower (Figure 33); even at the appraisers' rate, the DCF would be CLP 2,660.</w:t>
+            </w:r>
+          </w:p>
+          <w:p>
+            <w:pPr>
+              <w:spacing w:after="60" w:before="0" w:line="228" w:lineRule="auto"/>
+              <w:jc w:val="both"/>
+            </w:pPr>
+            <w:r>
+              <w:rPr>
+                <w:rFonts w:ascii="Arial" w:cs="Arial" w:eastAsia="Arial" w:hAnsi="Arial"/>
+                <w:color w:val="1A1A1A"/>
+                <w:sz w:val="16"/>
+                <w:szCs w:val="16"/>
+              </w:rPr>
+              <w:t xml:space="preserve">We pushed the thesis to its extremes. In a bear case (WACC +100 bp and the 75.8% historical-low margin) the target falls to CLP 1,712; in a bull case combining WACC −100 bp, g of 2.5%, the 81.3% peak margin and the cut in corporate tax to 23%, it rises to CLP 2,595, still 27% below the price. APV (CLP 1,894), a peso-bond Rf (~CLP 2,439) and other debt targets (DCF of CLP 1,819 to 1,894) lead to the same conclusion (Appendix [F]).</w:t>
+            </w:r>
+          </w:p>
+          <w:p>
+            <w:pPr>
+              <w:spacing w:after="60" w:before="0" w:line="228" w:lineRule="auto"/>
+              <w:jc w:val="both"/>
+            </w:pPr>
+            <w:r>
+              <w:rPr>
+                <w:rFonts w:ascii="Arial" w:cs="Arial" w:eastAsia="Arial" w:hAnsi="Arial"/>
+                <w:color w:val="1A1A1A"/>
+                <w:sz w:val="16"/>
+                <w:szCs w:val="16"/>
+              </w:rPr>
+              <w:t xml:space="preserve">That brings us to CLP 2,076 (80% × 1,857 + 20% × 2,951): 10.8x EBITDA, a 9.3% cap rate and 0.94x book value. Rolling the DCF to 30-Sep-26 would lift it to ~CLP 2,118 without changing the call. The catalyst is the same force behind the thesis: with the 10Y UST at 5.22%, its highest since 2002, rates pressure cap rates, and each new appraisal moves them toward our value. We would be wrong if cap rates compress further on institutional demand for defensive assets, or if the market sustains a structural premium for Tier A assets (see Investment Risks).</w:t>
+            </w:r>
+          </w:p>
+        </w:tc>
+        <w:tc>
+          <w:tcPr>
+            <w:tcW w:type="dxa" w:w="216"/>
+            <w:tcBorders>
+              <w:top w:val="none" w:color="FFFFFF" w:sz="0"/>
+              <w:left w:val="none" w:color="FFFFFF" w:sz="0"/>
+              <w:bottom w:val="none" w:color="FFFFFF" w:sz="0"/>
+              <w:right w:val="none" w:color="FFFFFF" w:sz="0"/>
+            </w:tcBorders>
+            <w:tcMar>
+              <w:top w:type="dxa" w:w="0"/>
+              <w:left w:type="dxa" w:w="0"/>
+              <w:bottom w:type="dxa" w:w="0"/>
+              <w:right w:type="dxa" w:w="0"/>
+            </w:tcMar>
+            <w:vAlign w:val="top"/>
+          </w:tcPr>
+          <w:p/>
+        </w:tc>
+        <w:tc>
+          <w:tcPr>
+            <w:tcW w:type="dxa" w:w="3550"/>
+            <w:tcBorders>
+              <w:top w:val="none" w:color="FFFFFF" w:sz="0"/>
+              <w:left w:val="none" w:color="FFFFFF" w:sz="0"/>
+              <w:bottom w:val="none" w:color="FFFFFF" w:sz="0"/>
+              <w:right w:val="none" w:color="FFFFFF" w:sz="0"/>
+            </w:tcBorders>
+            <w:tcMar>
+              <w:top w:type="dxa" w:w="0"/>
+              <w:left w:type="dxa" w:w="0"/>
+              <w:bottom w:type="dxa" w:w="0"/>
+              <w:right w:type="dxa" w:w="0"/>
+            </w:tcMar>
+            <w:vAlign w:val="top"/>
+          </w:tcPr>
+          <w:p>
+            <w:pPr>
+              <w:spacing w:after="30" w:before="20" w:line="228" w:lineRule="auto"/>
+            </w:pPr>
+            <w:r>
+              <w:rPr>
+                <w:rFonts w:ascii="Arial" w:cs="Arial" w:eastAsia="Arial" w:hAnsi="Arial"/>
+                <w:b/>
+                <w:bCs/>
+                <w:color w:val="14284B"/>
+                <w:sz w:val="14"/>
+                <w:szCs w:val="14"/>
+              </w:rPr>
+              <w:t xml:space="preserve">Figure 32: </w:t>
+            </w:r>
+            <w:r>
+              <w:rPr>
+                <w:rFonts w:ascii="Arial" w:cs="Arial" w:eastAsia="Arial" w:hAnsi="Arial"/>
+                <w:color w:val="14284B"/>
+                <w:sz w:val="14"/>
+                <w:szCs w:val="14"/>
+              </w:rPr>
+              <w:t xml:space="preserve">The market pays 6.0%; our cash flows are worth 10.1%</w:t>
+            </w:r>
+          </w:p>
+          <w:p>
+            <w:pPr>
+              <w:spacing w:after="20" w:before="0" w:line="240" w:lineRule="auto"/>
+            </w:pPr>
+            <w:r>
+              <w:drawing>
+                <wp:inline distT="0" distB="0" distL="0" distR="0">
+                  <wp:extent cx="2257425" cy="1600200"/>
+                  <wp:effectExtent t="0" r="0" b="0" l="0"/>
+                  <wp:docPr id="1" name="" descr="" title=""/>
+                  <wp:cNvGraphicFramePr>
+                    <a:graphicFrameLocks xmlns:a="http://schemas.openxmlformats.org/drawingml/2006/main" noChangeAspect="1"/>
+                  </wp:cNvGraphicFramePr>
+                  <a:graphic xmlns:a="http://schemas.openxmlformats.org/drawingml/2006/main">
+                    <a:graphicData uri="http://schemas.openxmlformats.org/drawingml/2006/picture">
+                      <pic:pic xmlns:pic="http://schemas.openxmlformats.org/drawingml/2006/picture">
+                        <pic:nvPicPr>
+                          <pic:cNvPr id="0" name="" descr=""/>
+                          <pic:cNvPicPr>
+                            <a:picLocks noChangeAspect="1" noChangeArrowheads="1"/>
+                          </pic:cNvPicPr>
+                        </pic:nvPicPr>
+                        <pic:blipFill>
+                          <a:blip r:embed="rId16" cstate="none"/>
+                          <a:srcRect/>
+                          <a:stretch>
+                            <a:fillRect/>
+                          </a:stretch>
+                        </pic:blipFill>
+                        <pic:spPr bwMode="auto">
+                          <a:xfrm>
+                            <a:off x="0" y="0"/>
                             <a:ext cx="2257425" cy="1600200"/>
                           </a:xfrm>
                           <a:prstGeom prst="rect">
@@ -2415,7 +1188,7 @@
                           </pic:cNvPicPr>
                         </pic:nvPicPr>
                         <pic:blipFill>
-                          <a:blip r:embed="rId16" cstate="none"/>
+                          <a:blip r:embed="rId17" cstate="none"/>
                           <a:srcRect/>
                           <a:stretch>
                             <a:fillRect/>
@@ -9867,7 +8640,7 @@
                           </pic:cNvPicPr>
                         </pic:nvPicPr>
                         <pic:blipFill>
-                          <a:blip r:embed="rId17" cstate="none"/>
+                          <a:blip r:embed="rId18" cstate="none"/>
                           <a:srcRect/>
                           <a:stretch>
                             <a:fillRect/>

</xml_diff>

<commit_message>
Valuation: fill both pages with narrative content from earlier drafts (operations, peer selection, macro, robustness, watch list)
Co-Authored-By: Claude Opus 5.5 <noreply@anthropic.com>
Claude-Session: https://claude.ai/code/session_0188QZHBkA8n5QL7BtmFakQg
</commit_message>
<xml_diff>
--- a/informe/Mallplaza_Valuacion_EN.docx
+++ b/informe/Mallplaza_Valuacion_EN.docx
@@ -109,6 +109,21 @@
               <w:t xml:space="preserve">In twelve months the stock rose from CLP 2,470 to 4,700 and now trades at CLP 3,555. None of our methods reaches that price: the DCF ranges from CLP 1,379 to 2,329 even with WACC ±100 bp and g between 2.5% and 4.0%, and the most favourable multiples fall short too (Figure 27). We give the DCF an 80% weight because Mallplaza is, at heart, a rent collector: 81.4% of revenue is rent and 93% of that is fixed. The 20% on multiples tests the model against what the market pays today, but with caution: Chile has only two direct peers, and neither captures the company's expansion plan or debt path.</w:t>
             </w:r>
           </w:p>
+          <w:p>
+            <w:pPr>
+              <w:spacing w:after="60" w:before="0" w:line="228" w:lineRule="auto"/>
+              <w:jc w:val="both"/>
+            </w:pPr>
+            <w:r>
+              <w:rPr>
+                <w:rFonts w:ascii="Arial" w:cs="Arial" w:eastAsia="Arial" w:hAnsi="Arial"/>
+                <w:color w:val="1A1A1A"/>
+                <w:sz w:val="16"/>
+                <w:szCs w:val="16"/>
+              </w:rPr>
+              <w:t xml:space="preserve">Figure 27 sums up the thesis in one picture. APV, which values the firm unlevered and adds the tax shields separately, gives CLP 1,894, just 2% above the DCF: the result does not depend on how we model financing. Multiples range from CLP 2,152 (common-set median) to 3,294 (Chilean median), and EV/EBITDA NTM and EV/EBIT sit between CLP 2,914 and 3,098. Everything falls to the left of the price; the only thing that reaches it is the stock's own trading range over the past year.</w:t>
+            </w:r>
+          </w:p>
         </w:tc>
         <w:tc>
           <w:tcPr>
@@ -507,6 +522,21 @@
                 <w:sz w:val="16"/>
                 <w:szCs w:val="16"/>
               </w:rPr>
+              <w:t xml:space="preserve">Capex follows the company's plan: the pipeline and maintenance (5.5% of revenue) take base capex to a peak of CLP 240,660 million in 2027, and continuous expansion adds CLP 95,000–104,000 million a year from 2028, at the cost of the identified pipeline (USD 3,603 per m²) with a 35%, 90% and 100% revenue ramp. Working capital, at 15.6% of revenue, requires only CLP 7,100–9,900 million a year and moves the price by ±1.2%. These are assumptions the team can defend line by line (Appendix [C]).</w:t>
+            </w:r>
+          </w:p>
+          <w:p>
+            <w:pPr>
+              <w:spacing w:after="60" w:before="0" w:line="228" w:lineRule="auto"/>
+              <w:jc w:val="both"/>
+            </w:pPr>
+            <w:r>
+              <w:rPr>
+                <w:rFonts w:ascii="Arial" w:cs="Arial" w:eastAsia="Arial" w:hAnsi="Arial"/>
+                <w:color w:val="1A1A1A"/>
+                <w:sz w:val="16"/>
+                <w:szCs w:val="16"/>
+              </w:rPr>
               <w:t xml:space="preserve">The problem is the return on growth. Each new m² yields 6.9% on cost, a 5.0% real RONIC after tax, below a 7.2% real WACC. Expansion adds revenue but not value, so terminal value grows only with inflation (g of 3.0% nominal, 0% real) and a higher g lowers value (Figure 29). Assuming more growth would not close the gap with the price; it would widen it.</w:t>
             </w:r>
           </w:p>
@@ -724,7 +754,52 @@
                 <w:sz w:val="16"/>
                 <w:szCs w:val="16"/>
               </w:rPr>
+              <w:t xml:space="preserve">Macro explains the difference. At 30-Jun-26 Brazil had a 14.25% Selic, a 14.34% nominal 10-year bond and 5.3% expected 2026 inflation, against a 4.5% policy rate, a 5.43% nominal bond and 4.1% inflation in Chile, with similar growth (2.0% and 1.6%). An investor in Brazil demands more from every asset, not just shopping malls; applying that discount to Mallplaza, which earns 71.8% of revenue in Chile, would penalise it for a risk it does not carry.</w:t>
+            </w:r>
+          </w:p>
+          <w:p>
+            <w:pPr>
+              <w:spacing w:after="60" w:before="0" w:line="228" w:lineRule="auto"/>
+              <w:jc w:val="both"/>
+            </w:pPr>
+            <w:r>
+              <w:rPr>
+                <w:rFonts w:ascii="Arial" w:cs="Arial" w:eastAsia="Arial" w:hAnsi="Arial"/>
+                <w:color w:val="1A1A1A"/>
+                <w:sz w:val="16"/>
+                <w:szCs w:val="16"/>
+              </w:rPr>
+              <w:t xml:space="preserve">We chose the set on the same basis as the beta. IRSA is kept with caution, since it reports under IAS 29 and its NTM consensus has a single analyst; Fibra Danhos is excluded because, as a FIBRA, it must distribute 95% of its taxable income and has no beta in the WACC. We use EV/EBITDA because it is neutral to leverage and to revaluation (IAS 40), and we measure everyone with Bloomberg net debt (CLP 1,311,569 million for Mallplaza, close to the CLP 1,285,740 million of net financial debt used in the DCF).</w:t>
+            </w:r>
+          </w:p>
+          <w:p>
+            <w:pPr>
+              <w:spacing w:after="60" w:before="0" w:line="228" w:lineRule="auto"/>
+              <w:jc w:val="both"/>
+            </w:pPr>
+            <w:r>
+              <w:rPr>
+                <w:rFonts w:ascii="Arial" w:cs="Arial" w:eastAsia="Arial" w:hAnsi="Arial"/>
+                <w:color w:val="1A1A1A"/>
+                <w:sz w:val="16"/>
+                <w:szCs w:val="16"/>
+              </w:rPr>
               <w:t xml:space="preserve">Nor does quality justify the premium. Mallplaza trades 29% above Cencosud Shopping, yet its EBITDA per m² is only 1.8% higher (see Industry); only at Parque Arauco's multiple (18.4x), with 5.7x leverage, would it be worth more than its price. Every multiple, from EV/EBITDA NTM (CLP 2,914) to P/BV (CLP 3,171), sits below the price (Figure 31): multiples confirm the stock is expensive, and the DCF sets the size of the gap. We exclude P/E (CLP 8,644), distorted by property revaluation.</w:t>
+            </w:r>
+          </w:p>
+          <w:p>
+            <w:pPr>
+              <w:spacing w:after="60" w:before="0" w:line="228" w:lineRule="auto"/>
+              <w:jc w:val="both"/>
+            </w:pPr>
+            <w:r>
+              <w:rPr>
+                <w:rFonts w:ascii="Arial" w:cs="Arial" w:eastAsia="Arial" w:hAnsi="Arial"/>
+                <w:color w:val="1A1A1A"/>
+                <w:sz w:val="16"/>
+                <w:szCs w:val="16"/>
+              </w:rPr>
+              <w:t xml:space="preserve">In price terms: at the Chilean median alone the stock would be worth CLP 3,294 (−7%); at Cencosud's multiple, CLP 2,621; and only at Parque Arauco's, CLP 3,967. Defending CLP 3,555 with multiples requires assuming Mallplaza deserves the valuation of the most leveraged peer in the group.</w:t>
             </w:r>
           </w:p>
         </w:tc>
@@ -1016,7 +1091,37 @@
                 <w:sz w:val="16"/>
                 <w:szCs w:val="16"/>
               </w:rPr>
+              <w:t xml:space="preserve">Calendar details do not change the outcome either. With an expected dividend of ~CLP 69 per share (2.0%), the expected total return is −39.7%. And since the DCF is dated 30-Jun-26 and the price 30-Sep-26, the comparison slightly favours the market: if the balance of the 2026 dividend (~CLP 27 per share) was already paid before that date, our value would be somewhat overstated, not understated.</w:t>
+            </w:r>
+          </w:p>
+          <w:p>
+            <w:pPr>
+              <w:spacing w:after="60" w:before="0" w:line="228" w:lineRule="auto"/>
+              <w:jc w:val="both"/>
+            </w:pPr>
+            <w:r>
+              <w:rPr>
+                <w:rFonts w:ascii="Arial" w:cs="Arial" w:eastAsia="Arial" w:hAnsi="Arial"/>
+                <w:color w:val="1A1A1A"/>
+                <w:sz w:val="16"/>
+                <w:szCs w:val="16"/>
+              </w:rPr>
               <w:t xml:space="preserve">That brings us to CLP 2,076 (80% × 1,857 + 20% × 2,951): 10.8x EBITDA, a 9.3% cap rate and 0.94x book value. Rolling the DCF to 30-Sep-26 would lift it to ~CLP 2,118 without changing the call. The catalyst is the same force behind the thesis: with the 10Y UST at 5.22%, its highest since 2002, rates pressure cap rates, and each new appraisal moves them toward our value. We would be wrong if cap rates compress further on institutional demand for defensive assets, or if the market sustains a structural premium for Tier A assets (see Investment Risks).</w:t>
+            </w:r>
+          </w:p>
+          <w:p>
+            <w:pPr>
+              <w:spacing w:after="60" w:before="0" w:line="228" w:lineRule="auto"/>
+              <w:jc w:val="both"/>
+            </w:pPr>
+            <w:r>
+              <w:rPr>
+                <w:rFonts w:ascii="Arial" w:cs="Arial" w:eastAsia="Arial" w:hAnsi="Arial"/>
+                <w:color w:val="1A1A1A"/>
+                <w:sz w:val="16"/>
+                <w:szCs w:val="16"/>
+              </w:rPr>
+              <w:t xml:space="preserve">What we will watch: the Note 11 appraisal at each reporting date (the real discount rate is the bridge between our value and book), the spread of the company's UF bonds over their 3.6% coupon (at the latest issue's 4.33% effective rate, the WACC would rise 12 bp and the target would fall to CLP 2,042), the cut in corporate tax to 23% (+3.9% on the target, not yet included) and the AAA rating, which would likely come under pressure at 3.5x net debt/EBITDA.</w:t>
             </w:r>
           </w:p>
         </w:tc>

</xml_diff>

<commit_message>
Valuation: complete both pages with the team draft's content (Ke build-up, tax, working capital, post-2032, NTM multiples)
Co-Authored-By: Claude Opus 5.5 <noreply@anthropic.com>
Claude-Session: https://claude.ai/code/session_0188QZHBkA8n5QL7BtmFakQg
</commit_message>
<xml_diff>
--- a/informe/Mallplaza_Valuacion_EN.docx
+++ b/informe/Mallplaza_Valuacion_EN.docx
@@ -121,7 +121,7 @@
                 <w:sz w:val="16"/>
                 <w:szCs w:val="16"/>
               </w:rPr>
-              <w:t xml:space="preserve">Figure 27 sums up the thesis in one picture. APV, which values the firm unlevered and adds the tax shields separately, gives CLP 1,894, just 2% above the DCF: the result does not depend on how we model financing. Multiples range from CLP 2,152 (common-set median) to 3,294 (Chilean median), and EV/EBITDA NTM and EV/EBIT sit between CLP 2,914 and 3,098. Everything falls to the left of the price; the only thing that reaches it is the stock's own trading range over the past year.</w:t>
+              <w:t xml:space="preserve">Figure 27 sums up the thesis in one picture. APV, which values the firm unlevered and adds the tax shields separately, gives CLP 1,894, just 2% above the DCF: the result does not depend on how we model financing. Multiples range from CLP 2,152 (common-set median) to 3,294 (Chilean median), and EV/EBITDA NTM and EV/EBIT sit between CLP 2,914 and 3,098. Everything falls to the left of the price; the only thing that reaches it is the stock's own trading range over the past year. Even the Chilean median multiple, the most favourable case for the stock, sits 7% below the price.</w:t>
             </w:r>
           </w:p>
         </w:tc>
@@ -329,6 +329,21 @@
                 <w:sz w:val="16"/>
                 <w:szCs w:val="16"/>
               </w:rPr>
+              <w:t xml:space="preserve">We build Ke in dollars because its three inputs are in that currency: the US Treasury Rf, the implied equity risk premium published by Damodaran and country risk, which we weight by revenue (71.8% Chile, 17.7% Peru and 10.5% Colombia). We then convert it to pesos with the gap between expected inflation in Chile (3.0%, the central bank's target) and in the US (2.24%, 10-year breakeven). The beta starts from unlevering six regional peers with Hamada and is relevered each period with Mallplaza's structure, which is why it moves from 1.09 in 2H26E to 1.14 in the terminal period.</w:t>
+            </w:r>
+          </w:p>
+          <w:p>
+            <w:pPr>
+              <w:spacing w:after="60" w:before="0" w:line="228" w:lineRule="auto"/>
+              <w:jc w:val="both"/>
+            </w:pPr>
+            <w:r>
+              <w:rPr>
+                <w:rFonts w:ascii="Arial" w:cs="Arial" w:eastAsia="Arial" w:hAnsi="Arial"/>
+                <w:color w:val="1A1A1A"/>
+                <w:sz w:val="16"/>
+                <w:szCs w:val="16"/>
+              </w:rPr>
               <w:t xml:space="preserve">Here the first signal appears: at CLP 3,555, equity yields ~4.4% real, just 80 bp above the company's own real cost of debt (Figure 28). The market is pricing the stock almost as if it were a bond.</w:t>
             </w:r>
           </w:p>
@@ -537,7 +552,37 @@
                 <w:sz w:val="16"/>
                 <w:szCs w:val="16"/>
               </w:rPr>
+              <w:t xml:space="preserve">Two assumptions deserve explanation. The cash tax rate starts at 16.8% because the company currently uses tax goodwill and loss carry-forwards; we assume those shields run off and the rate reaches 27% by 2030, so as not to overstate value. And working capital is positive because tenant receivables (CLP 122,370 million) exceed rents collected in advance (CLP 20,247 million): it grows with revenue, not with new m².</w:t>
+            </w:r>
+          </w:p>
+          <w:p>
+            <w:pPr>
+              <w:spacing w:after="60" w:before="0" w:line="228" w:lineRule="auto"/>
+              <w:jc w:val="both"/>
+            </w:pPr>
+            <w:r>
+              <w:rPr>
+                <w:rFonts w:ascii="Arial" w:cs="Arial" w:eastAsia="Arial" w:hAnsi="Arial"/>
+                <w:color w:val="1A1A1A"/>
+                <w:sz w:val="16"/>
+                <w:szCs w:val="16"/>
+              </w:rPr>
               <w:t xml:space="preserve">The problem is the return on growth. Each new m² yields 6.9% on cost, a 5.0% real RONIC after tax, below a 7.2% real WACC. Expansion adds revenue but not value, so terminal value grows only with inflation (g of 3.0% nominal, 0% real) and a higher g lowers value (Figure 29). Assuming more growth would not close the gap with the price; it would widen it.</w:t>
+            </w:r>
+          </w:p>
+          <w:p>
+            <w:pPr>
+              <w:spacing w:after="60" w:before="0" w:line="228" w:lineRule="auto"/>
+              <w:jc w:val="both"/>
+            </w:pPr>
+            <w:r>
+              <w:rPr>
+                <w:rFonts w:ascii="Arial" w:cs="Arial" w:eastAsia="Arial" w:hAnsi="Arial"/>
+                <w:color w:val="1A1A1A"/>
+                <w:sz w:val="16"/>
+                <w:szCs w:val="16"/>
+              </w:rPr>
+              <w:t xml:space="preserve">That is why the explicit horizon includes the capex and ramp-up of projects opening through 2032 (108,301 m² of mature GLA in the terminal year), but from then on the model adds no new malls: terminal capex covers maintenance only (5.5% of revenue). This is not a conservative assumption against the company; at these returns, growing more would reduce its value.</w:t>
             </w:r>
           </w:p>
         </w:tc>
@@ -754,7 +799,7 @@
                 <w:sz w:val="16"/>
                 <w:szCs w:val="16"/>
               </w:rPr>
-              <w:t xml:space="preserve">Macro explains the difference. At 30-Jun-26 Brazil had a 14.25% Selic, a 14.34% nominal 10-year bond and 5.3% expected 2026 inflation, against a 4.5% policy rate, a 5.43% nominal bond and 4.1% inflation in Chile, with similar growth (2.0% and 1.6%). An investor in Brazil demands more from every asset, not just shopping malls; applying that discount to Mallplaza, which earns 71.8% of revenue in Chile, would penalise it for a risk it does not carry.</w:t>
+              <w:t xml:space="preserve">Macro explains the difference. At 30-Jun-26 Brazil had a 14.25% Selic, a 14.34% nominal 10-year bond and 5.3% expected 2026 inflation, against a 4.5% policy rate, a 5.43% nominal bond and 4.1% inflation in Chile, with similar growth (2.0% and 1.6%). An investor in Brazil demands more from every asset, not just shopping malls; applying that discount to Mallplaza, which earns 71.8% of revenue in Chile, would penalise it for a risk it does not carry. Mallplaza's own spread (346 bp) is in fact tighter than the Chilean median (385 bp): investors already pay it a premium within Chile.</w:t>
             </w:r>
           </w:p>
           <w:p>
@@ -799,7 +844,7 @@
                 <w:sz w:val="16"/>
                 <w:szCs w:val="16"/>
               </w:rPr>
-              <w:t xml:space="preserve">In price terms: at the Chilean median alone the stock would be worth CLP 3,294 (−7%); at Cencosud's multiple, CLP 2,621; and only at Parque Arauco's, CLP 3,967. Defending CLP 3,555 with multiples requires assuming Mallplaza deserves the valuation of the most leveraged peer in the group.</w:t>
+              <w:t xml:space="preserve">In price terms: at the Chilean median alone the stock would be worth CLP 3,294 (−7%); at Cencosud's multiple, CLP 2,621; and only at Parque Arauco's, CLP 3,967. Defending CLP 3,555 with multiples requires assuming Mallplaza deserves the valuation of the most leveraged peer in the group. The forward view tells the same story: Mallplaza trades at 14.8x consensus NTM EBITDA against a 12.5x weighted peer multiple. We keep Brazil at 30% rather than zero because the Chilean median rests on only two companies.</w:t>
             </w:r>
           </w:p>
         </w:tc>
@@ -1121,7 +1166,7 @@
                 <w:sz w:val="16"/>
                 <w:szCs w:val="16"/>
               </w:rPr>
-              <w:t xml:space="preserve">What we will watch: the Note 11 appraisal at each reporting date (the real discount rate is the bridge between our value and book), the spread of the company's UF bonds over their 3.6% coupon (at the latest issue's 4.33% effective rate, the WACC would rise 12 bp and the target would fall to CLP 2,042), the cut in corporate tax to 23% (+3.9% on the target, not yet included) and the AAA rating, which would likely come under pressure at 3.5x net debt/EBITDA.</w:t>
+              <w:t xml:space="preserve">What we will watch: the Note 11 appraisal at each reporting date (the real discount rate is the bridge between our value and book), the spread of the company's UF bonds over their 3.6% coupon (at the latest issue's 4.33% effective rate, the WACC would rise 12 bp and the target would fall to CLP 2,042), the cut in corporate tax to 23% (+3.9% on the target, not yet included) and the AAA rating, which would likely come under pressure at 3.5x net debt/EBITDA. In short, the operating story is sound; it is the price of that story that no longer adds up.</w:t>
             </w:r>
           </w:p>
         </w:tc>

</xml_diff>

<commit_message>
Valuation: continuous two-page layout filled with the full argument; institutional colors only in valuation and financial-analysis charts
Co-Authored-By: Claude Opus 5.5 <noreply@anthropic.com>
Claude-Session: https://claude.ai/code/session_0188QZHBkA8n5QL7BtmFakQg
</commit_message>
<xml_diff>
--- a/informe/Mallplaza_Valuacion_EN.docx
+++ b/informe/Mallplaza_Valuacion_EN.docx
@@ -124,6 +124,179 @@
               <w:t xml:space="preserve">Figure 27 sums up the thesis in one picture. APV, which values the firm unlevered and adds the tax shields separately, gives CLP 1,894, just 2% above the DCF: the result does not depend on how we model financing. Multiples range from CLP 2,152 (common-set median) to 3,294 (Chilean median), and EV/EBITDA NTM and EV/EBIT sit between CLP 2,914 and 3,098. Everything falls to the left of the price; the only thing that reaches it is the stock's own trading range over the past year. Even the Chilean median multiple, the most favourable case for the stock, sits 7% below the price.</w:t>
             </w:r>
           </w:p>
+          <w:p>
+            <w:pPr>
+              <w:pBdr>
+                <w:bottom w:val="single" w:color="E9004B" w:sz="8" w:space="1"/>
+              </w:pBdr>
+              <w:spacing w:after="50" w:before="90"/>
+            </w:pPr>
+            <w:r>
+              <w:rPr>
+                <w:rFonts w:ascii="Arial" w:cs="Arial" w:eastAsia="Arial" w:hAnsi="Arial"/>
+                <w:b/>
+                <w:bCs/>
+                <w:color w:val="14284B"/>
+                <w:sz w:val="16"/>
+                <w:szCs w:val="16"/>
+              </w:rPr>
+              <w:t xml:space="preserve">THE STORY IS IN THE RATE</w:t>
+            </w:r>
+          </w:p>
+          <w:p>
+            <w:pPr>
+              <w:spacing w:after="60" w:before="0" w:line="228" w:lineRule="auto"/>
+              <w:jc w:val="both"/>
+            </w:pPr>
+            <w:r>
+              <w:rPr>
+                <w:rFonts w:ascii="Arial" w:cs="Arial" w:eastAsia="Arial" w:hAnsi="Arial"/>
+                <w:color w:val="1A1A1A"/>
+                <w:sz w:val="16"/>
+                <w:szCs w:val="16"/>
+              </w:rPr>
+              <w:t xml:space="preserve">We project free cash flow to the firm in nominal CLP from 30-Jun-26, with an explicit horizon to 2031E and a terminal value that accounts for 76% of EV (Appendix [B]). The CLP 1,857 per share is CLP 583 of explicit cash flows and CLP 1,884 of terminal value, less CLP 610 of debt and minorities: the result depends, above all, on the discount rate.</w:t>
+            </w:r>
+          </w:p>
+          <w:p>
+            <w:pPr>
+              <w:spacing w:after="60" w:before="0" w:line="228" w:lineRule="auto"/>
+              <w:jc w:val="both"/>
+            </w:pPr>
+            <w:r>
+              <w:rPr>
+                <w:rFonts w:ascii="Arial" w:cs="Arial" w:eastAsia="Arial" w:hAnsi="Arial"/>
+                <w:color w:val="1A1A1A"/>
+                <w:sz w:val="16"/>
+                <w:szCs w:val="16"/>
+              </w:rPr>
+              <w:t xml:space="preserve">That rate moves with the capital structure. Mallplaza uses its debt capacity to grow, as in 2024 after buying Open Plaza Peru (3.78x): we assume net debt/EBITDA rises from 2.36x to 3.5x by 2031, with 25 bp more real cost per turn, and that new debt (CLP 1.40 trillion) funds all capex while operating cash is distributed to shareholders. The nominal WACC thus moves from 10.54% in 2H26E to 10.41% in the terminal period (7.20% real): an 11.93% Ke (Rf 4.98%, relevered beta of 1.14 from a six-peer median of 0.94, ERP 4.14% and a 1.41% revenue-weighted CRP) and a 5.11% after-tax Kd based on the 3.6% real coupon of the latest bond (Appendix [Z]).</w:t>
+            </w:r>
+          </w:p>
+          <w:p>
+            <w:pPr>
+              <w:spacing w:after="60" w:before="0" w:line="228" w:lineRule="auto"/>
+              <w:jc w:val="both"/>
+            </w:pPr>
+            <w:r>
+              <w:rPr>
+                <w:rFonts w:ascii="Arial" w:cs="Arial" w:eastAsia="Arial" w:hAnsi="Arial"/>
+                <w:color w:val="1A1A1A"/>
+                <w:sz w:val="16"/>
+                <w:szCs w:val="16"/>
+              </w:rPr>
+              <w:t xml:space="preserve">We build Ke in dollars because its three inputs are in that currency: the US Treasury Rf, the implied equity risk premium published by Damodaran and country risk, which we weight by revenue (71.8% Chile, 17.7% Peru and 10.5% Colombia). We then convert it to pesos with the gap between expected inflation in Chile (3.0%, the central bank's target) and in the US (2.24%, 10-year breakeven). The beta starts from unlevering six regional peers with Hamada and is relevered each period with Mallplaza's structure, which is why it moves from 1.09 in 2H26E to 1.14 in the terminal period.</w:t>
+            </w:r>
+          </w:p>
+          <w:p>
+            <w:pPr>
+              <w:spacing w:after="60" w:before="0" w:line="228" w:lineRule="auto"/>
+              <w:jc w:val="both"/>
+            </w:pPr>
+            <w:r>
+              <w:rPr>
+                <w:rFonts w:ascii="Arial" w:cs="Arial" w:eastAsia="Arial" w:hAnsi="Arial"/>
+                <w:color w:val="1A1A1A"/>
+                <w:sz w:val="16"/>
+                <w:szCs w:val="16"/>
+              </w:rPr>
+              <w:t xml:space="preserve">Here the first signal appears: at CLP 3,555, equity yields ~4.4% real, just 80 bp above the company's own real cost of debt (Figure 28). The market is pricing the stock almost as if it were a bond.</w:t>
+            </w:r>
+          </w:p>
+          <w:p>
+            <w:pPr>
+              <w:pBdr>
+                <w:bottom w:val="single" w:color="E9004B" w:sz="8" w:space="1"/>
+              </w:pBdr>
+              <w:spacing w:after="50" w:before="90"/>
+            </w:pPr>
+            <w:r>
+              <w:rPr>
+                <w:rFonts w:ascii="Arial" w:cs="Arial" w:eastAsia="Arial" w:hAnsi="Arial"/>
+                <w:b/>
+                <w:bCs/>
+                <w:color w:val="14284B"/>
+                <w:sz w:val="16"/>
+                <w:szCs w:val="16"/>
+              </w:rPr>
+              <w:t xml:space="preserve">GROWTH DOES NOT RESCUE THE PRICE</w:t>
+            </w:r>
+          </w:p>
+          <w:p>
+            <w:pPr>
+              <w:spacing w:after="60" w:before="0" w:line="228" w:lineRule="auto"/>
+              <w:jc w:val="both"/>
+            </w:pPr>
+            <w:r>
+              <w:rPr>
+                <w:rFonts w:ascii="Arial" w:cs="Arial" w:eastAsia="Arial" w:hAnsi="Arial"/>
+                <w:color w:val="1A1A1A"/>
+                <w:sz w:val="16"/>
+                <w:szCs w:val="16"/>
+              </w:rPr>
+              <w:t xml:space="preserve">This is not pessimism about operations. We forecast a 79.7% EBITDA margin in 2026E (excluding revaluation, below the 80.5% LTM), a tax rate converging from 16.8% to 27%, the announced pipeline (USD 613 million and 170,200 m²) and, from 2029, 27,075 m² of new GLA a year at the historical pace. The 13-analyst consensus expects NTM EBITDA only ~3% above ours: the disagreement with the market is not about cash flows.</w:t>
+            </w:r>
+          </w:p>
+          <w:p>
+            <w:pPr>
+              <w:spacing w:after="60" w:before="0" w:line="228" w:lineRule="auto"/>
+              <w:jc w:val="both"/>
+            </w:pPr>
+            <w:r>
+              <w:rPr>
+                <w:rFonts w:ascii="Arial" w:cs="Arial" w:eastAsia="Arial" w:hAnsi="Arial"/>
+                <w:color w:val="1A1A1A"/>
+                <w:sz w:val="16"/>
+                <w:szCs w:val="16"/>
+              </w:rPr>
+              <w:t xml:space="preserve">Capex follows the company's plan: the pipeline and maintenance (5.5% of revenue) take base capex to a peak of CLP 240,660 million in 2027, and continuous expansion adds CLP 95,000–104,000 million a year from 2028, at the cost of the identified pipeline (USD 3,603 per m²) with a 35%, 90% and 100% revenue ramp. Working capital, at 15.6% of revenue, requires only CLP 7,100–9,900 million a year and moves the price by ±1.2% (Figure 29). These are assumptions the team can defend line by line (Appendix [C]).</w:t>
+            </w:r>
+          </w:p>
+          <w:p>
+            <w:pPr>
+              <w:spacing w:after="60" w:before="0" w:line="228" w:lineRule="auto"/>
+              <w:jc w:val="both"/>
+            </w:pPr>
+            <w:r>
+              <w:rPr>
+                <w:rFonts w:ascii="Arial" w:cs="Arial" w:eastAsia="Arial" w:hAnsi="Arial"/>
+                <w:color w:val="1A1A1A"/>
+                <w:sz w:val="16"/>
+                <w:szCs w:val="16"/>
+              </w:rPr>
+              <w:t xml:space="preserve">Two assumptions deserve explanation. The cash tax rate starts at 16.8% because the company currently uses tax goodwill and loss carry-forwards; we assume those shields run off and the rate reaches 27% by 2030, so as not to overstate value. And working capital is positive because tenant receivables (CLP 122,370 million) exceed rents collected in advance (CLP 20,247 million): it grows with revenue, not with new m².</w:t>
+            </w:r>
+          </w:p>
+          <w:p>
+            <w:pPr>
+              <w:spacing w:after="60" w:before="0" w:line="228" w:lineRule="auto"/>
+              <w:jc w:val="both"/>
+            </w:pPr>
+            <w:r>
+              <w:rPr>
+                <w:rFonts w:ascii="Arial" w:cs="Arial" w:eastAsia="Arial" w:hAnsi="Arial"/>
+                <w:color w:val="1A1A1A"/>
+                <w:sz w:val="16"/>
+                <w:szCs w:val="16"/>
+              </w:rPr>
+              <w:t xml:space="preserve">The problem is the return on growth. Each new m² yields 6.9% on cost, a 5.0% real RONIC after tax, below a 7.2% real WACC. Expansion adds revenue but not value, so terminal value grows only with inflation (g of 3.0% nominal, 0% real) and a higher g lowers value (Figure 30). Assuming more growth would not close the gap with the price; it would widen it.</w:t>
+            </w:r>
+          </w:p>
+          <w:p>
+            <w:pPr>
+              <w:spacing w:after="60" w:before="0" w:line="228" w:lineRule="auto"/>
+              <w:jc w:val="both"/>
+            </w:pPr>
+            <w:r>
+              <w:rPr>
+                <w:rFonts w:ascii="Arial" w:cs="Arial" w:eastAsia="Arial" w:hAnsi="Arial"/>
+                <w:color w:val="1A1A1A"/>
+                <w:sz w:val="16"/>
+                <w:szCs w:val="16"/>
+              </w:rPr>
+              <w:t xml:space="preserve">That is why the explicit horizon includes the capex and ramp-up of projects opening through 2032 (108,301 m² of mature GLA in the terminal year), but from then on the model adds no new malls: terminal capex covers maintenance only (5.5% of revenue). This is not a conservative assumption against the company; at these returns, growing more would reduce its value.</w:t>
+            </w:r>
+          </w:p>
         </w:tc>
         <w:tc>
           <w:tcPr>
@@ -193,7 +366,7 @@
             <w:r>
               <w:drawing>
                 <wp:inline distT="0" distB="0" distL="0" distR="0">
-                  <wp:extent cx="2257425" cy="1828800"/>
+                  <wp:extent cx="2257425" cy="1695450"/>
                   <wp:effectExtent t="0" r="0" b="0" l="0"/>
                   <wp:docPr id="1" name="" descr="" title=""/>
                   <wp:cNvGraphicFramePr>
@@ -218,7 +391,7 @@
                         <pic:spPr bwMode="auto">
                           <a:xfrm>
                             <a:off x="0" y="0"/>
-                            <a:ext cx="2257425" cy="1828800"/>
+                            <a:ext cx="2257425" cy="1695450"/>
                           </a:xfrm>
                           <a:prstGeom prst="rect">
                             <a:avLst/>
@@ -245,148 +418,9 @@
               <w:t xml:space="preserve">52-week intraday range (1-Oct-25 to 30-Sep-26; low 10-Oct-25, high 27-Apr-26). Source: Team analysis; Bloomberg.</w:t>
             </w:r>
           </w:p>
-        </w:tc>
-      </w:tr>
-      <w:tr>
-        <w:trPr>
-          <w:cantSplit/>
-        </w:trPr>
-        <w:tc>
-          <w:tcPr>
-            <w:tcW w:type="dxa" w:w="6900"/>
-            <w:tcBorders>
-              <w:top w:val="none" w:color="FFFFFF" w:sz="0"/>
-              <w:left w:val="none" w:color="FFFFFF" w:sz="0"/>
-              <w:bottom w:val="none" w:color="FFFFFF" w:sz="0"/>
-              <w:right w:val="none" w:color="FFFFFF" w:sz="0"/>
-            </w:tcBorders>
-            <w:tcMar>
-              <w:top w:type="dxa" w:w="0"/>
-              <w:left w:type="dxa" w:w="0"/>
-              <w:bottom w:type="dxa" w:w="0"/>
-              <w:right w:type="dxa" w:w="0"/>
-            </w:tcMar>
-            <w:vAlign w:val="top"/>
-          </w:tcPr>
-          <w:p>
-            <w:pPr>
-              <w:pBdr>
-                <w:bottom w:val="single" w:color="E9004B" w:sz="8" w:space="1"/>
-              </w:pBdr>
-              <w:spacing w:after="50" w:before="90"/>
-            </w:pPr>
-            <w:r>
-              <w:rPr>
-                <w:rFonts w:ascii="Arial" w:cs="Arial" w:eastAsia="Arial" w:hAnsi="Arial"/>
-                <w:b/>
-                <w:bCs/>
-                <w:color w:val="14284B"/>
-                <w:sz w:val="16"/>
-                <w:szCs w:val="16"/>
-              </w:rPr>
-              <w:t xml:space="preserve">THE STORY IS IN THE RATE</w:t>
-            </w:r>
-          </w:p>
-          <w:p>
-            <w:pPr>
-              <w:spacing w:after="60" w:before="0" w:line="228" w:lineRule="auto"/>
-              <w:jc w:val="both"/>
-            </w:pPr>
-            <w:r>
-              <w:rPr>
-                <w:rFonts w:ascii="Arial" w:cs="Arial" w:eastAsia="Arial" w:hAnsi="Arial"/>
-                <w:color w:val="1A1A1A"/>
-                <w:sz w:val="16"/>
-                <w:szCs w:val="16"/>
-              </w:rPr>
-              <w:t xml:space="preserve">We project free cash flow to the firm in nominal CLP from 30-Jun-26, with an explicit horizon to 2031E and a terminal value that accounts for 76% of EV (Appendix [B]). The CLP 1,857 per share is CLP 583 of explicit cash flows and CLP 1,884 of terminal value, less CLP 610 of debt and minorities: the result depends, above all, on the discount rate.</w:t>
-            </w:r>
-          </w:p>
-          <w:p>
-            <w:pPr>
-              <w:spacing w:after="60" w:before="0" w:line="228" w:lineRule="auto"/>
-              <w:jc w:val="both"/>
-            </w:pPr>
-            <w:r>
-              <w:rPr>
-                <w:rFonts w:ascii="Arial" w:cs="Arial" w:eastAsia="Arial" w:hAnsi="Arial"/>
-                <w:color w:val="1A1A1A"/>
-                <w:sz w:val="16"/>
-                <w:szCs w:val="16"/>
-              </w:rPr>
-              <w:t xml:space="preserve">That rate moves with the capital structure. Mallplaza uses its debt capacity to grow, as in 2024 after buying Open Plaza Peru (3.78x): we assume net debt/EBITDA rises from 2.36x to 3.5x by 2031, with 25 bp more real cost per turn, and that new debt (CLP 1.40 trillion) funds all capex while operating cash is distributed to shareholders. The nominal WACC thus moves from 10.54% in 2H26E to 10.41% in the terminal period (7.20% real): an 11.93% Ke (Rf 4.98%, relevered beta of 1.14 from a six-peer median of 0.94, ERP 4.14% and a 1.41% revenue-weighted CRP) and a 5.11% after-tax Kd based on the 3.6% real coupon of the latest bond (Appendix [Z]).</w:t>
-            </w:r>
-          </w:p>
-          <w:p>
-            <w:pPr>
-              <w:spacing w:after="60" w:before="0" w:line="228" w:lineRule="auto"/>
-              <w:jc w:val="both"/>
-            </w:pPr>
-            <w:r>
-              <w:rPr>
-                <w:rFonts w:ascii="Arial" w:cs="Arial" w:eastAsia="Arial" w:hAnsi="Arial"/>
-                <w:color w:val="1A1A1A"/>
-                <w:sz w:val="16"/>
-                <w:szCs w:val="16"/>
-              </w:rPr>
-              <w:t xml:space="preserve">We build Ke in dollars because its three inputs are in that currency: the US Treasury Rf, the implied equity risk premium published by Damodaran and country risk, which we weight by revenue (71.8% Chile, 17.7% Peru and 10.5% Colombia). We then convert it to pesos with the gap between expected inflation in Chile (3.0%, the central bank's target) and in the US (2.24%, 10-year breakeven). The beta starts from unlevering six regional peers with Hamada and is relevered each period with Mallplaza's structure, which is why it moves from 1.09 in 2H26E to 1.14 in the terminal period.</w:t>
-            </w:r>
-          </w:p>
-          <w:p>
-            <w:pPr>
-              <w:spacing w:after="60" w:before="0" w:line="228" w:lineRule="auto"/>
-              <w:jc w:val="both"/>
-            </w:pPr>
-            <w:r>
-              <w:rPr>
-                <w:rFonts w:ascii="Arial" w:cs="Arial" w:eastAsia="Arial" w:hAnsi="Arial"/>
-                <w:color w:val="1A1A1A"/>
-                <w:sz w:val="16"/>
-                <w:szCs w:val="16"/>
-              </w:rPr>
-              <w:t xml:space="preserve">Here the first signal appears: at CLP 3,555, equity yields ~4.4% real, just 80 bp above the company's own real cost of debt (Figure 28). The market is pricing the stock almost as if it were a bond.</w:t>
-            </w:r>
-          </w:p>
-        </w:tc>
-        <w:tc>
-          <w:tcPr>
-            <w:tcW w:type="dxa" w:w="216"/>
-            <w:tcBorders>
-              <w:top w:val="none" w:color="FFFFFF" w:sz="0"/>
-              <w:left w:val="none" w:color="FFFFFF" w:sz="0"/>
-              <w:bottom w:val="none" w:color="FFFFFF" w:sz="0"/>
-              <w:right w:val="none" w:color="FFFFFF" w:sz="0"/>
-            </w:tcBorders>
-            <w:tcMar>
-              <w:top w:type="dxa" w:w="0"/>
-              <w:left w:type="dxa" w:w="0"/>
-              <w:bottom w:type="dxa" w:w="0"/>
-              <w:right w:type="dxa" w:w="0"/>
-            </w:tcMar>
-            <w:vAlign w:val="top"/>
-          </w:tcPr>
-          <w:p/>
-        </w:tc>
-        <w:tc>
-          <w:tcPr>
-            <w:tcW w:type="dxa" w:w="3550"/>
-            <w:tcBorders>
-              <w:top w:val="none" w:color="FFFFFF" w:sz="0"/>
-              <w:left w:val="none" w:color="FFFFFF" w:sz="0"/>
-              <w:bottom w:val="none" w:color="FFFFFF" w:sz="0"/>
-              <w:right w:val="none" w:color="FFFFFF" w:sz="0"/>
-            </w:tcBorders>
-            <w:tcMar>
-              <w:top w:type="dxa" w:w="0"/>
-              <w:left w:type="dxa" w:w="0"/>
-              <w:bottom w:type="dxa" w:w="0"/>
-              <w:right w:type="dxa" w:w="0"/>
-            </w:tcMar>
-            <w:vAlign w:val="top"/>
-          </w:tcPr>
-          <w:p>
-            <w:pPr>
-              <w:spacing w:after="30" w:before="20" w:line="228" w:lineRule="auto"/>
+          <w:p>
+            <w:pPr>
+              <w:spacing w:after="30" w:before="90" w:line="228" w:lineRule="auto"/>
             </w:pPr>
             <w:r>
               <w:rPr>
@@ -416,7 +450,7 @@
             <w:r>
               <w:drawing>
                 <wp:inline distT="0" distB="0" distL="0" distR="0">
-                  <wp:extent cx="2257425" cy="1733550"/>
+                  <wp:extent cx="2257425" cy="1552575"/>
                   <wp:effectExtent t="0" r="0" b="0" l="0"/>
                   <wp:docPr id="1" name="" descr="" title=""/>
                   <wp:cNvGraphicFramePr>
@@ -441,7 +475,7 @@
                         <pic:spPr bwMode="auto">
                           <a:xfrm>
                             <a:off x="0" y="0"/>
-                            <a:ext cx="2257425" cy="1733550"/>
+                            <a:ext cx="2257425" cy="1552575"/>
                           </a:xfrm>
                           <a:prstGeom prst="rect">
                             <a:avLst/>
@@ -468,163 +502,9 @@
               <w:t xml:space="preserve">Real rates in UF. Source: Central Bank of Chile (30-Jun-26); Mallplaza; Team analysis.</w:t>
             </w:r>
           </w:p>
-        </w:tc>
-      </w:tr>
-      <w:tr>
-        <w:trPr>
-          <w:cantSplit/>
-        </w:trPr>
-        <w:tc>
-          <w:tcPr>
-            <w:tcW w:type="dxa" w:w="6900"/>
-            <w:tcBorders>
-              <w:top w:val="none" w:color="FFFFFF" w:sz="0"/>
-              <w:left w:val="none" w:color="FFFFFF" w:sz="0"/>
-              <w:bottom w:val="none" w:color="FFFFFF" w:sz="0"/>
-              <w:right w:val="none" w:color="FFFFFF" w:sz="0"/>
-            </w:tcBorders>
-            <w:tcMar>
-              <w:top w:type="dxa" w:w="0"/>
-              <w:left w:type="dxa" w:w="0"/>
-              <w:bottom w:type="dxa" w:w="0"/>
-              <w:right w:type="dxa" w:w="0"/>
-            </w:tcMar>
-            <w:vAlign w:val="top"/>
-          </w:tcPr>
-          <w:p>
-            <w:pPr>
-              <w:pBdr>
-                <w:bottom w:val="single" w:color="E9004B" w:sz="8" w:space="1"/>
-              </w:pBdr>
-              <w:spacing w:after="50" w:before="90"/>
-            </w:pPr>
-            <w:r>
-              <w:rPr>
-                <w:rFonts w:ascii="Arial" w:cs="Arial" w:eastAsia="Arial" w:hAnsi="Arial"/>
-                <w:b/>
-                <w:bCs/>
-                <w:color w:val="14284B"/>
-                <w:sz w:val="16"/>
-                <w:szCs w:val="16"/>
-              </w:rPr>
-              <w:t xml:space="preserve">GROWTH DOES NOT RESCUE THE PRICE</w:t>
-            </w:r>
-          </w:p>
-          <w:p>
-            <w:pPr>
-              <w:spacing w:after="60" w:before="0" w:line="228" w:lineRule="auto"/>
-              <w:jc w:val="both"/>
-            </w:pPr>
-            <w:r>
-              <w:rPr>
-                <w:rFonts w:ascii="Arial" w:cs="Arial" w:eastAsia="Arial" w:hAnsi="Arial"/>
-                <w:color w:val="1A1A1A"/>
-                <w:sz w:val="16"/>
-                <w:szCs w:val="16"/>
-              </w:rPr>
-              <w:t xml:space="preserve">This is not pessimism about operations. We forecast a 79.7% EBITDA margin in 2026E (excluding revaluation, below the 80.5% LTM), a tax rate converging from 16.8% to 27%, the announced pipeline (USD 613 million and 170,200 m²) and, from 2029, 27,075 m² of new GLA a year at the historical pace. The 13-analyst consensus expects NTM EBITDA only ~3% above ours: the disagreement with the market is not about cash flows.</w:t>
-            </w:r>
-          </w:p>
-          <w:p>
-            <w:pPr>
-              <w:spacing w:after="60" w:before="0" w:line="228" w:lineRule="auto"/>
-              <w:jc w:val="both"/>
-            </w:pPr>
-            <w:r>
-              <w:rPr>
-                <w:rFonts w:ascii="Arial" w:cs="Arial" w:eastAsia="Arial" w:hAnsi="Arial"/>
-                <w:color w:val="1A1A1A"/>
-                <w:sz w:val="16"/>
-                <w:szCs w:val="16"/>
-              </w:rPr>
-              <w:t xml:space="preserve">Capex follows the company's plan: the pipeline and maintenance (5.5% of revenue) take base capex to a peak of CLP 240,660 million in 2027, and continuous expansion adds CLP 95,000–104,000 million a year from 2028, at the cost of the identified pipeline (USD 3,603 per m²) with a 35%, 90% and 100% revenue ramp. Working capital, at 15.6% of revenue, requires only CLP 7,100–9,900 million a year and moves the price by ±1.2%. These are assumptions the team can defend line by line (Appendix [C]).</w:t>
-            </w:r>
-          </w:p>
-          <w:p>
-            <w:pPr>
-              <w:spacing w:after="60" w:before="0" w:line="228" w:lineRule="auto"/>
-              <w:jc w:val="both"/>
-            </w:pPr>
-            <w:r>
-              <w:rPr>
-                <w:rFonts w:ascii="Arial" w:cs="Arial" w:eastAsia="Arial" w:hAnsi="Arial"/>
-                <w:color w:val="1A1A1A"/>
-                <w:sz w:val="16"/>
-                <w:szCs w:val="16"/>
-              </w:rPr>
-              <w:t xml:space="preserve">Two assumptions deserve explanation. The cash tax rate starts at 16.8% because the company currently uses tax goodwill and loss carry-forwards; we assume those shields run off and the rate reaches 27% by 2030, so as not to overstate value. And working capital is positive because tenant receivables (CLP 122,370 million) exceed rents collected in advance (CLP 20,247 million): it grows with revenue, not with new m².</w:t>
-            </w:r>
-          </w:p>
-          <w:p>
-            <w:pPr>
-              <w:spacing w:after="60" w:before="0" w:line="228" w:lineRule="auto"/>
-              <w:jc w:val="both"/>
-            </w:pPr>
-            <w:r>
-              <w:rPr>
-                <w:rFonts w:ascii="Arial" w:cs="Arial" w:eastAsia="Arial" w:hAnsi="Arial"/>
-                <w:color w:val="1A1A1A"/>
-                <w:sz w:val="16"/>
-                <w:szCs w:val="16"/>
-              </w:rPr>
-              <w:t xml:space="preserve">The problem is the return on growth. Each new m² yields 6.9% on cost, a 5.0% real RONIC after tax, below a 7.2% real WACC. Expansion adds revenue but not value, so terminal value grows only with inflation (g of 3.0% nominal, 0% real) and a higher g lowers value (Figure 29). Assuming more growth would not close the gap with the price; it would widen it.</w:t>
-            </w:r>
-          </w:p>
-          <w:p>
-            <w:pPr>
-              <w:spacing w:after="60" w:before="0" w:line="228" w:lineRule="auto"/>
-              <w:jc w:val="both"/>
-            </w:pPr>
-            <w:r>
-              <w:rPr>
-                <w:rFonts w:ascii="Arial" w:cs="Arial" w:eastAsia="Arial" w:hAnsi="Arial"/>
-                <w:color w:val="1A1A1A"/>
-                <w:sz w:val="16"/>
-                <w:szCs w:val="16"/>
-              </w:rPr>
-              <w:t xml:space="preserve">That is why the explicit horizon includes the capex and ramp-up of projects opening through 2032 (108,301 m² of mature GLA in the terminal year), but from then on the model adds no new malls: terminal capex covers maintenance only (5.5% of revenue). This is not a conservative assumption against the company; at these returns, growing more would reduce its value.</w:t>
-            </w:r>
-          </w:p>
-        </w:tc>
-        <w:tc>
-          <w:tcPr>
-            <w:tcW w:type="dxa" w:w="216"/>
-            <w:tcBorders>
-              <w:top w:val="none" w:color="FFFFFF" w:sz="0"/>
-              <w:left w:val="none" w:color="FFFFFF" w:sz="0"/>
-              <w:bottom w:val="none" w:color="FFFFFF" w:sz="0"/>
-              <w:right w:val="none" w:color="FFFFFF" w:sz="0"/>
-            </w:tcBorders>
-            <w:tcMar>
-              <w:top w:type="dxa" w:w="0"/>
-              <w:left w:type="dxa" w:w="0"/>
-              <w:bottom w:type="dxa" w:w="0"/>
-              <w:right w:type="dxa" w:w="0"/>
-            </w:tcMar>
-            <w:vAlign w:val="top"/>
-          </w:tcPr>
-          <w:p/>
-        </w:tc>
-        <w:tc>
-          <w:tcPr>
-            <w:tcW w:type="dxa" w:w="3550"/>
-            <w:tcBorders>
-              <w:top w:val="none" w:color="FFFFFF" w:sz="0"/>
-              <w:left w:val="none" w:color="FFFFFF" w:sz="0"/>
-              <w:bottom w:val="none" w:color="FFFFFF" w:sz="0"/>
-              <w:right w:val="none" w:color="FFFFFF" w:sz="0"/>
-            </w:tcBorders>
-            <w:tcMar>
-              <w:top w:type="dxa" w:w="0"/>
-              <w:left w:type="dxa" w:w="0"/>
-              <w:bottom w:type="dxa" w:w="0"/>
-              <w:right w:type="dxa" w:w="0"/>
-            </w:tcMar>
-            <w:vAlign w:val="top"/>
-          </w:tcPr>
-          <w:p>
-            <w:pPr>
-              <w:spacing w:after="30" w:before="20" w:line="228" w:lineRule="auto"/>
+          <w:p>
+            <w:pPr>
+              <w:spacing w:after="30" w:before="90" w:line="228" w:lineRule="auto"/>
             </w:pPr>
             <w:r>
               <w:rPr>
@@ -644,7 +524,7 @@
                 <w:sz w:val="14"/>
                 <w:szCs w:val="14"/>
               </w:rPr>
-              <w:t xml:space="preserve">Growing below the WACC destroys value: real g = 0%</w:t>
+              <w:t xml:space="preserve">Working capital: an assumption that does not move the price (±1.2%)</w:t>
             </w:r>
           </w:p>
           <w:p>
@@ -654,7 +534,7 @@
             <w:r>
               <w:drawing>
                 <wp:inline distT="0" distB="0" distL="0" distR="0">
-                  <wp:extent cx="2257425" cy="2152650"/>
+                  <wp:extent cx="2257425" cy="1647825"/>
                   <wp:effectExtent t="0" r="0" b="0" l="0"/>
                   <wp:docPr id="1" name="" descr="" title=""/>
                   <wp:cNvGraphicFramePr>
@@ -679,7 +559,91 @@
                         <pic:spPr bwMode="auto">
                           <a:xfrm>
                             <a:off x="0" y="0"/>
-                            <a:ext cx="2257425" cy="2152650"/>
+                            <a:ext cx="2257425" cy="1647825"/>
+                          </a:xfrm>
+                          <a:prstGeom prst="rect">
+                            <a:avLst/>
+                          </a:prstGeom>
+                        </pic:spPr>
+                      </pic:pic>
+                    </a:graphicData>
+                  </a:graphic>
+                </wp:inline>
+              </w:drawing>
+            </w:r>
+          </w:p>
+          <w:p>
+            <w:pPr>
+              <w:spacing w:after="0" w:before="10" w:line="216" w:lineRule="auto"/>
+            </w:pPr>
+            <w:r>
+              <w:rPr>
+                <w:rFonts w:ascii="Arial" w:cs="Arial" w:eastAsia="Arial" w:hAnsi="Arial"/>
+                <w:color w:val="5F5F5F"/>
+                <w:sz w:val="11"/>
+                <w:szCs w:val="11"/>
+              </w:rPr>
+              <w:t xml:space="preserve">Source: Mallplaza financial statements; Team analysis.</w:t>
+            </w:r>
+          </w:p>
+          <w:p>
+            <w:pPr>
+              <w:spacing w:after="30" w:before="90" w:line="228" w:lineRule="auto"/>
+            </w:pPr>
+            <w:r>
+              <w:rPr>
+                <w:rFonts w:ascii="Arial" w:cs="Arial" w:eastAsia="Arial" w:hAnsi="Arial"/>
+                <w:b/>
+                <w:bCs/>
+                <w:color w:val="14284B"/>
+                <w:sz w:val="14"/>
+                <w:szCs w:val="14"/>
+              </w:rPr>
+              <w:t xml:space="preserve">Figure 30: </w:t>
+            </w:r>
+            <w:r>
+              <w:rPr>
+                <w:rFonts w:ascii="Arial" w:cs="Arial" w:eastAsia="Arial" w:hAnsi="Arial"/>
+                <w:color w:val="14284B"/>
+                <w:sz w:val="14"/>
+                <w:szCs w:val="14"/>
+              </w:rPr>
+              <w:t xml:space="preserve">Growing below the WACC destroys value: real g = 0%</w:t>
+            </w:r>
+          </w:p>
+          <w:p>
+            <w:pPr>
+              <w:spacing w:after="20" w:before="0" w:line="240" w:lineRule="auto"/>
+            </w:pPr>
+            <w:r>
+              <w:drawing>
+                <wp:inline distT="0" distB="0" distL="0" distR="0">
+                  <wp:extent cx="2257425" cy="1876425"/>
+                  <wp:effectExtent t="0" r="0" b="0" l="0"/>
+                  <wp:docPr id="1" name="" descr="" title=""/>
+                  <wp:cNvGraphicFramePr>
+                    <a:graphicFrameLocks xmlns:a="http://schemas.openxmlformats.org/drawingml/2006/main" noChangeAspect="1"/>
+                  </wp:cNvGraphicFramePr>
+                  <a:graphic xmlns:a="http://schemas.openxmlformats.org/drawingml/2006/main">
+                    <a:graphicData uri="http://schemas.openxmlformats.org/drawingml/2006/picture">
+                      <pic:pic xmlns:pic="http://schemas.openxmlformats.org/drawingml/2006/picture">
+                        <pic:nvPicPr>
+                          <pic:cNvPr id="0" name="" descr=""/>
+                          <pic:cNvPicPr>
+                            <a:picLocks noChangeAspect="1" noChangeArrowheads="1"/>
+                          </pic:cNvPicPr>
+                        </pic:nvPicPr>
+                        <pic:blipFill>
+                          <a:blip r:embed="rId14" cstate="none"/>
+                          <a:srcRect/>
+                          <a:stretch>
+                            <a:fillRect/>
+                          </a:stretch>
+                        </pic:blipFill>
+                        <pic:spPr bwMode="auto">
+                          <a:xfrm>
+                            <a:off x="0" y="0"/>
+                            <a:ext cx="2257425" cy="1876425"/>
                           </a:xfrm>
                           <a:prstGeom prst="rect">
                             <a:avLst/>
@@ -784,7 +748,7 @@
                 <w:sz w:val="16"/>
                 <w:szCs w:val="16"/>
               </w:rPr>
-              <w:t xml:space="preserve">Mallplaza trades at 16.8x EV/EBITDA, above the Chilean median (15.7x) and far above Brazilian peers (9.0x). The gap with Brazil is about rates, not quality: with local real bonds at 2.5% in Chile and 8.1% in Brazil (NTN-B), the cap-rate spread over the local rate is similar in both countries, 385 bp in Chile and 302 bp in Brazil (Figure 30). We therefore weight the Chilean median at 70% and the common-set median at 30% (which includes IRSA; we exclude Fibra Danhos for its FIBRA regime): 14.4x, giving CLP 2,951 per share. The weighting matters little: between 0% and 100% Chile, the target price only moves from CLP 1,916 to 2,144 (Appendix [E]).</w:t>
+              <w:t xml:space="preserve">Mallplaza trades at 16.8x EV/EBITDA, above the Chilean median (15.7x) and far above Brazilian peers (9.0x). The gap with Brazil is about rates, not quality: with local real bonds at 2.5% in Chile and 8.1% in Brazil (NTN-B), the cap-rate spread over the local rate is similar in both countries, 385 bp in Chile and 302 bp in Brazil (Figure 31). We therefore weight the Chilean median at 70% and the common-set median at 30% (which includes IRSA; we exclude Fibra Danhos for its FIBRA regime): 14.4x, giving CLP 2,951 per share. The weighting matters little: between 0% and 100% Chile, the target price only moves from CLP 1,916 to 2,144 (Appendix [E]).</w:t>
             </w:r>
           </w:p>
           <w:p>
@@ -829,7 +793,7 @@
                 <w:sz w:val="16"/>
                 <w:szCs w:val="16"/>
               </w:rPr>
-              <w:t xml:space="preserve">Nor does quality justify the premium. Mallplaza trades 29% above Cencosud Shopping, yet its EBITDA per m² is only 1.8% higher (see Industry); only at Parque Arauco's multiple (18.4x), with 5.7x leverage, would it be worth more than its price. Every multiple, from EV/EBITDA NTM (CLP 2,914) to P/BV (CLP 3,171), sits below the price (Figure 31): multiples confirm the stock is expensive, and the DCF sets the size of the gap. We exclude P/E (CLP 8,644), distorted by property revaluation.</w:t>
+              <w:t xml:space="preserve">Nor does quality justify the premium. Mallplaza trades 29% above Cencosud Shopping, yet its EBITDA per m² is only 1.8% higher (see Industry); only at Parque Arauco's multiple (18.4x), with 5.7x leverage, would it be worth more than its price. Every multiple, from EV/EBITDA NTM (CLP 2,914) to P/BV (CLP 3,171), sits below the price (Figure 32): multiples confirm the stock is expensive, and the DCF sets the size of the gap. We exclude P/E (CLP 8,644), distorted by property revaluation.</w:t>
             </w:r>
           </w:p>
           <w:p>
@@ -845,6 +809,115 @@
                 <w:szCs w:val="16"/>
               </w:rPr>
               <w:t xml:space="preserve">In price terms: at the Chilean median alone the stock would be worth CLP 3,294 (−7%); at Cencosud's multiple, CLP 2,621; and only at Parque Arauco's, CLP 3,967. Defending CLP 3,555 with multiples requires assuming Mallplaza deserves the valuation of the most leveraged peer in the group. The forward view tells the same story: Mallplaza trades at 14.8x consensus NTM EBITDA against a 12.5x weighted peer multiple. We keep Brazil at 30% rather than zero because the Chilean median rests on only two companies.</w:t>
+            </w:r>
+          </w:p>
+          <w:p>
+            <w:pPr>
+              <w:pBdr>
+                <w:bottom w:val="single" w:color="E9004B" w:sz="8" w:space="1"/>
+              </w:pBdr>
+              <w:spacing w:after="50" w:before="90"/>
+            </w:pPr>
+            <w:r>
+              <w:rPr>
+                <w:rFonts w:ascii="Arial" w:cs="Arial" w:eastAsia="Arial" w:hAnsi="Arial"/>
+                <w:b/>
+                <w:bCs/>
+                <w:color w:val="14284B"/>
+                <w:sz w:val="16"/>
+                <w:szCs w:val="16"/>
+              </w:rPr>
+              <w:t xml:space="preserve">WHAT THE MARKET WOULD HAVE TO BELIEVE</w:t>
+            </w:r>
+          </w:p>
+          <w:p>
+            <w:pPr>
+              <w:spacing w:after="60" w:before="0" w:line="228" w:lineRule="auto"/>
+              <w:jc w:val="both"/>
+            </w:pPr>
+            <w:r>
+              <w:rPr>
+                <w:rFonts w:ascii="Arial" w:cs="Arial" w:eastAsia="Arial" w:hAnsi="Arial"/>
+                <w:color w:val="1A1A1A"/>
+                <w:sz w:val="16"/>
+                <w:szCs w:val="16"/>
+              </w:rPr>
+              <w:t xml:space="preserve">The price implies an EV of CLP 9.12 trillion, 69% above ours, and a 6.0% cap rate, against 10.1% in our DCF, 6.4% for Chilean peers and 7.5% at book value (Figure 33). The market pays 1.61x an equity base already at fair value, appraised at a ~5.55% real rate (Note 11): it pays more than the appraisers themselves. To justify CLP 3,555, the WACC would have to be 285 bp lower (Figure 34); even at the appraisers' rate, the DCF would be CLP 2,660.</w:t>
+            </w:r>
+          </w:p>
+          <w:p>
+            <w:pPr>
+              <w:spacing w:after="60" w:before="0" w:line="228" w:lineRule="auto"/>
+              <w:jc w:val="both"/>
+            </w:pPr>
+            <w:r>
+              <w:rPr>
+                <w:rFonts w:ascii="Arial" w:cs="Arial" w:eastAsia="Arial" w:hAnsi="Arial"/>
+                <w:color w:val="1A1A1A"/>
+                <w:sz w:val="16"/>
+                <w:szCs w:val="16"/>
+              </w:rPr>
+              <w:t xml:space="preserve">We pushed the thesis to its extremes. In a bear case (WACC +100 bp and the 75.8% historical-low margin) the target falls to CLP 1,712; in a bull case combining WACC −100 bp, g of 2.5%, the 81.3% peak margin and the cut in corporate tax to 23%, it rises to CLP 2,595, still 27% below the price. APV (CLP 1,894), a peso-bond Rf (~CLP 2,439) and other debt targets (DCF of CLP 1,819 to 1,894) lead to the same conclusion (Appendix [F]).</w:t>
+            </w:r>
+          </w:p>
+          <w:p>
+            <w:pPr>
+              <w:spacing w:after="60" w:before="0" w:line="228" w:lineRule="auto"/>
+              <w:jc w:val="both"/>
+            </w:pPr>
+            <w:r>
+              <w:rPr>
+                <w:rFonts w:ascii="Arial" w:cs="Arial" w:eastAsia="Arial" w:hAnsi="Arial"/>
+                <w:color w:val="1A1A1A"/>
+                <w:sz w:val="16"/>
+                <w:szCs w:val="16"/>
+              </w:rPr>
+              <w:t xml:space="preserve">APV also shows what the debt is really worth. Of its CLP 1,894 per share, CLP 1,632 is the unlevered firm and CLP 261 the tax shields of projected debt: levering up to 3.5x adds value, but even with it the price is far away. And our risk-free choice is the conservative one: using the peso bond (5.43%) and then adding country risk would count Chile risk twice, and even so the target price would only rise to ~CLP 2,439, 31% below the price. In other words, no reasonable choice of inputs rescues the current valuation; the gap is too wide to be a modelling artefact.</w:t>
+            </w:r>
+          </w:p>
+          <w:p>
+            <w:pPr>
+              <w:spacing w:after="60" w:before="0" w:line="228" w:lineRule="auto"/>
+              <w:jc w:val="both"/>
+            </w:pPr>
+            <w:r>
+              <w:rPr>
+                <w:rFonts w:ascii="Arial" w:cs="Arial" w:eastAsia="Arial" w:hAnsi="Arial"/>
+                <w:color w:val="1A1A1A"/>
+                <w:sz w:val="16"/>
+                <w:szCs w:val="16"/>
+              </w:rPr>
+              <w:t xml:space="preserve">Calendar details do not change the outcome either. With an expected dividend of ~CLP 69 per share (2.0%), the expected total return is −39.7%. And since the DCF is dated 30-Jun-26 and the price 30-Sep-26, the comparison slightly favours the market: if the balance of the 2026 dividend (~CLP 27 per share) was already paid before that date, our value would be somewhat overstated, not understated.</w:t>
+            </w:r>
+          </w:p>
+          <w:p>
+            <w:pPr>
+              <w:spacing w:after="60" w:before="0" w:line="228" w:lineRule="auto"/>
+              <w:jc w:val="both"/>
+            </w:pPr>
+            <w:r>
+              <w:rPr>
+                <w:rFonts w:ascii="Arial" w:cs="Arial" w:eastAsia="Arial" w:hAnsi="Arial"/>
+                <w:color w:val="1A1A1A"/>
+                <w:sz w:val="16"/>
+                <w:szCs w:val="16"/>
+              </w:rPr>
+              <w:t xml:space="preserve">That brings us to CLP 2,076 (80% × 1,857 + 20% × 2,951): 10.8x EBITDA, a 9.3% cap rate and 0.94x book value. Rolling the DCF to 30-Sep-26 would lift it to ~CLP 2,118 without changing the call. The catalyst is the same force behind the thesis: with the 10Y UST at 5.22%, its highest since 2002, rates pressure cap rates, and each new appraisal moves them toward our value. We would be wrong if cap rates compress further on institutional demand for defensive assets, or if the market sustains a structural premium for Tier A assets (see Investment Risks).</w:t>
+            </w:r>
+          </w:p>
+          <w:p>
+            <w:pPr>
+              <w:spacing w:after="60" w:before="0" w:line="228" w:lineRule="auto"/>
+              <w:jc w:val="both"/>
+            </w:pPr>
+            <w:r>
+              <w:rPr>
+                <w:rFonts w:ascii="Arial" w:cs="Arial" w:eastAsia="Arial" w:hAnsi="Arial"/>
+                <w:color w:val="1A1A1A"/>
+                <w:sz w:val="16"/>
+                <w:szCs w:val="16"/>
+              </w:rPr>
+              <w:t xml:space="preserve">What we will watch: the Note 11 appraisal at each reporting date (the real discount rate is the bridge between our value and book), the spread of the company's UF bonds over their 3.6% coupon (at the latest issue's 4.33% effective rate, the WACC would rise 12 bp and the target would fall to CLP 2,042), the cut in corporate tax to 23% (+3.9% on the target, not yet included) and the AAA rating, which would likely come under pressure at 3.5x net debt/EBITDA. In short, the operating story is sound; it is the price of that story that no longer adds up.</w:t>
             </w:r>
           </w:p>
         </w:tc>
@@ -897,7 +970,7 @@
                 <w:sz w:val="14"/>
                 <w:szCs w:val="14"/>
               </w:rPr>
-              <w:t xml:space="preserve">Figure 30: </w:t>
+              <w:t xml:space="preserve">Figure 31: </w:t>
             </w:r>
             <w:r>
               <w:rPr>
@@ -916,91 +989,7 @@
             <w:r>
               <w:drawing>
                 <wp:inline distT="0" distB="0" distL="0" distR="0">
-                  <wp:extent cx="2257425" cy="2238375"/>
-                  <wp:effectExtent t="0" r="0" b="0" l="0"/>
-                  <wp:docPr id="1" name="" descr="" title=""/>
-                  <wp:cNvGraphicFramePr>
-                    <a:graphicFrameLocks xmlns:a="http://schemas.openxmlformats.org/drawingml/2006/main" noChangeAspect="1"/>
-                  </wp:cNvGraphicFramePr>
-                  <a:graphic xmlns:a="http://schemas.openxmlformats.org/drawingml/2006/main">
-                    <a:graphicData uri="http://schemas.openxmlformats.org/drawingml/2006/picture">
-                      <pic:pic xmlns:pic="http://schemas.openxmlformats.org/drawingml/2006/picture">
-                        <pic:nvPicPr>
-                          <pic:cNvPr id="0" name="" descr=""/>
-                          <pic:cNvPicPr>
-                            <a:picLocks noChangeAspect="1" noChangeArrowheads="1"/>
-                          </pic:cNvPicPr>
-                        </pic:nvPicPr>
-                        <pic:blipFill>
-                          <a:blip r:embed="rId14" cstate="none"/>
-                          <a:srcRect/>
-                          <a:stretch>
-                            <a:fillRect/>
-                          </a:stretch>
-                        </pic:blipFill>
-                        <pic:spPr bwMode="auto">
-                          <a:xfrm>
-                            <a:off x="0" y="0"/>
-                            <a:ext cx="2257425" cy="2238375"/>
-                          </a:xfrm>
-                          <a:prstGeom prst="rect">
-                            <a:avLst/>
-                          </a:prstGeom>
-                        </pic:spPr>
-                      </pic:pic>
-                    </a:graphicData>
-                  </a:graphic>
-                </wp:inline>
-              </w:drawing>
-            </w:r>
-          </w:p>
-          <w:p>
-            <w:pPr>
-              <w:spacing w:after="0" w:before="10" w:line="216" w:lineRule="auto"/>
-            </w:pPr>
-            <w:r>
-              <w:rPr>
-                <w:rFonts w:ascii="Arial" w:cs="Arial" w:eastAsia="Arial" w:hAnsi="Arial"/>
-                <w:color w:val="5F5F5F"/>
-                <w:sz w:val="11"/>
-                <w:szCs w:val="11"/>
-              </w:rPr>
-              <w:t xml:space="preserve">Real bond: 10Y UF (Central Bank of Chile) and NTN-B 2035 (8.08%) at 30-Jun-26. Spread = cap rate (1 / EV/EBITDA) − real bond. IRSA omitted (IAS 29). Source: Bloomberg; Central Bank of Chile; Team analysis.</w:t>
-            </w:r>
-          </w:p>
-          <w:p>
-            <w:pPr>
-              <w:spacing w:after="30" w:before="90" w:line="228" w:lineRule="auto"/>
-            </w:pPr>
-            <w:r>
-              <w:rPr>
-                <w:rFonts w:ascii="Arial" w:cs="Arial" w:eastAsia="Arial" w:hAnsi="Arial"/>
-                <w:b/>
-                <w:bCs/>
-                <w:color w:val="14284B"/>
-                <w:sz w:val="14"/>
-                <w:szCs w:val="14"/>
-              </w:rPr>
-              <w:t xml:space="preserve">Figure 31: </w:t>
-            </w:r>
-            <w:r>
-              <w:rPr>
-                <w:rFonts w:ascii="Arial" w:cs="Arial" w:eastAsia="Arial" w:hAnsi="Arial"/>
-                <w:color w:val="14284B"/>
-                <w:sz w:val="14"/>
-                <w:szCs w:val="14"/>
-              </w:rPr>
-              <w:t xml:space="preserve">Value implied by each peer's multiple vs DCF and price (CLP per share)</w:t>
-            </w:r>
-          </w:p>
-          <w:p>
-            <w:pPr>
-              <w:spacing w:after="20" w:before="0" w:line="240" w:lineRule="auto"/>
-            </w:pPr>
-            <w:r>
-              <w:drawing>
-                <wp:inline distT="0" distB="0" distL="0" distR="0">
-                  <wp:extent cx="2257425" cy="1962150"/>
+                  <wp:extent cx="2257425" cy="2057400"/>
                   <wp:effectExtent t="0" r="0" b="0" l="0"/>
                   <wp:docPr id="1" name="" descr="" title=""/>
                   <wp:cNvGraphicFramePr>
@@ -1025,7 +1014,7 @@
                         <pic:spPr bwMode="auto">
                           <a:xfrm>
                             <a:off x="0" y="0"/>
-                            <a:ext cx="2257425" cy="1962150"/>
+                            <a:ext cx="2257425" cy="2057400"/>
                           </a:xfrm>
                           <a:prstGeom prst="rect">
                             <a:avLst/>
@@ -1049,166 +1038,12 @@
                 <w:sz w:val="11"/>
                 <w:szCs w:val="11"/>
               </w:rPr>
-              <w:t xml:space="preserve">Target = 80% DCF + 20% EV/EBITDA LTM. P/E excluded (includes revaluation). Source: Bloomberg (30-Sep-26); Team analysis.</w:t>
-            </w:r>
-          </w:p>
-        </w:tc>
-      </w:tr>
-      <w:tr>
-        <w:trPr>
-          <w:cantSplit/>
-        </w:trPr>
-        <w:tc>
-          <w:tcPr>
-            <w:tcW w:type="dxa" w:w="6900"/>
-            <w:tcBorders>
-              <w:top w:val="none" w:color="FFFFFF" w:sz="0"/>
-              <w:left w:val="none" w:color="FFFFFF" w:sz="0"/>
-              <w:bottom w:val="none" w:color="FFFFFF" w:sz="0"/>
-              <w:right w:val="none" w:color="FFFFFF" w:sz="0"/>
-            </w:tcBorders>
-            <w:tcMar>
-              <w:top w:type="dxa" w:w="0"/>
-              <w:left w:type="dxa" w:w="0"/>
-              <w:bottom w:type="dxa" w:w="0"/>
-              <w:right w:type="dxa" w:w="0"/>
-            </w:tcMar>
-            <w:vAlign w:val="top"/>
-          </w:tcPr>
-          <w:p>
-            <w:pPr>
-              <w:pBdr>
-                <w:bottom w:val="single" w:color="E9004B" w:sz="8" w:space="1"/>
-              </w:pBdr>
-              <w:spacing w:after="50" w:before="90"/>
-            </w:pPr>
-            <w:r>
-              <w:rPr>
-                <w:rFonts w:ascii="Arial" w:cs="Arial" w:eastAsia="Arial" w:hAnsi="Arial"/>
-                <w:b/>
-                <w:bCs/>
-                <w:color w:val="14284B"/>
-                <w:sz w:val="16"/>
-                <w:szCs w:val="16"/>
-              </w:rPr>
-              <w:t xml:space="preserve">WHAT THE MARKET WOULD HAVE TO BELIEVE</w:t>
-            </w:r>
-          </w:p>
-          <w:p>
-            <w:pPr>
-              <w:spacing w:after="60" w:before="0" w:line="228" w:lineRule="auto"/>
-              <w:jc w:val="both"/>
-            </w:pPr>
-            <w:r>
-              <w:rPr>
-                <w:rFonts w:ascii="Arial" w:cs="Arial" w:eastAsia="Arial" w:hAnsi="Arial"/>
-                <w:color w:val="1A1A1A"/>
-                <w:sz w:val="16"/>
-                <w:szCs w:val="16"/>
-              </w:rPr>
-              <w:t xml:space="preserve">The price implies an EV of CLP 9.12 trillion, 69% above ours, and a 6.0% cap rate, against 10.1% in our DCF, 6.4% for Chilean peers and 7.5% at book value (Figure 32). The market pays 1.61x an equity base already at fair value, appraised at a ~5.55% real rate (Note 11): it pays more than the appraisers themselves. To justify CLP 3,555, the WACC would have to be 285 bp lower (Figure 33); even at the appraisers' rate, the DCF would be CLP 2,660.</w:t>
-            </w:r>
-          </w:p>
-          <w:p>
-            <w:pPr>
-              <w:spacing w:after="60" w:before="0" w:line="228" w:lineRule="auto"/>
-              <w:jc w:val="both"/>
-            </w:pPr>
-            <w:r>
-              <w:rPr>
-                <w:rFonts w:ascii="Arial" w:cs="Arial" w:eastAsia="Arial" w:hAnsi="Arial"/>
-                <w:color w:val="1A1A1A"/>
-                <w:sz w:val="16"/>
-                <w:szCs w:val="16"/>
-              </w:rPr>
-              <w:t xml:space="preserve">We pushed the thesis to its extremes. In a bear case (WACC +100 bp and the 75.8% historical-low margin) the target falls to CLP 1,712; in a bull case combining WACC −100 bp, g of 2.5%, the 81.3% peak margin and the cut in corporate tax to 23%, it rises to CLP 2,595, still 27% below the price. APV (CLP 1,894), a peso-bond Rf (~CLP 2,439) and other debt targets (DCF of CLP 1,819 to 1,894) lead to the same conclusion (Appendix [F]).</w:t>
-            </w:r>
-          </w:p>
-          <w:p>
-            <w:pPr>
-              <w:spacing w:after="60" w:before="0" w:line="228" w:lineRule="auto"/>
-              <w:jc w:val="both"/>
-            </w:pPr>
-            <w:r>
-              <w:rPr>
-                <w:rFonts w:ascii="Arial" w:cs="Arial" w:eastAsia="Arial" w:hAnsi="Arial"/>
-                <w:color w:val="1A1A1A"/>
-                <w:sz w:val="16"/>
-                <w:szCs w:val="16"/>
-              </w:rPr>
-              <w:t xml:space="preserve">Calendar details do not change the outcome either. With an expected dividend of ~CLP 69 per share (2.0%), the expected total return is −39.7%. And since the DCF is dated 30-Jun-26 and the price 30-Sep-26, the comparison slightly favours the market: if the balance of the 2026 dividend (~CLP 27 per share) was already paid before that date, our value would be somewhat overstated, not understated.</w:t>
-            </w:r>
-          </w:p>
-          <w:p>
-            <w:pPr>
-              <w:spacing w:after="60" w:before="0" w:line="228" w:lineRule="auto"/>
-              <w:jc w:val="both"/>
-            </w:pPr>
-            <w:r>
-              <w:rPr>
-                <w:rFonts w:ascii="Arial" w:cs="Arial" w:eastAsia="Arial" w:hAnsi="Arial"/>
-                <w:color w:val="1A1A1A"/>
-                <w:sz w:val="16"/>
-                <w:szCs w:val="16"/>
-              </w:rPr>
-              <w:t xml:space="preserve">That brings us to CLP 2,076 (80% × 1,857 + 20% × 2,951): 10.8x EBITDA, a 9.3% cap rate and 0.94x book value. Rolling the DCF to 30-Sep-26 would lift it to ~CLP 2,118 without changing the call. The catalyst is the same force behind the thesis: with the 10Y UST at 5.22%, its highest since 2002, rates pressure cap rates, and each new appraisal moves them toward our value. We would be wrong if cap rates compress further on institutional demand for defensive assets, or if the market sustains a structural premium for Tier A assets (see Investment Risks).</w:t>
-            </w:r>
-          </w:p>
-          <w:p>
-            <w:pPr>
-              <w:spacing w:after="60" w:before="0" w:line="228" w:lineRule="auto"/>
-              <w:jc w:val="both"/>
-            </w:pPr>
-            <w:r>
-              <w:rPr>
-                <w:rFonts w:ascii="Arial" w:cs="Arial" w:eastAsia="Arial" w:hAnsi="Arial"/>
-                <w:color w:val="1A1A1A"/>
-                <w:sz w:val="16"/>
-                <w:szCs w:val="16"/>
-              </w:rPr>
-              <w:t xml:space="preserve">What we will watch: the Note 11 appraisal at each reporting date (the real discount rate is the bridge between our value and book), the spread of the company's UF bonds over their 3.6% coupon (at the latest issue's 4.33% effective rate, the WACC would rise 12 bp and the target would fall to CLP 2,042), the cut in corporate tax to 23% (+3.9% on the target, not yet included) and the AAA rating, which would likely come under pressure at 3.5x net debt/EBITDA. In short, the operating story is sound; it is the price of that story that no longer adds up.</w:t>
-            </w:r>
-          </w:p>
-        </w:tc>
-        <w:tc>
-          <w:tcPr>
-            <w:tcW w:type="dxa" w:w="216"/>
-            <w:tcBorders>
-              <w:top w:val="none" w:color="FFFFFF" w:sz="0"/>
-              <w:left w:val="none" w:color="FFFFFF" w:sz="0"/>
-              <w:bottom w:val="none" w:color="FFFFFF" w:sz="0"/>
-              <w:right w:val="none" w:color="FFFFFF" w:sz="0"/>
-            </w:tcBorders>
-            <w:tcMar>
-              <w:top w:type="dxa" w:w="0"/>
-              <w:left w:type="dxa" w:w="0"/>
-              <w:bottom w:type="dxa" w:w="0"/>
-              <w:right w:type="dxa" w:w="0"/>
-            </w:tcMar>
-            <w:vAlign w:val="top"/>
-          </w:tcPr>
-          <w:p/>
-        </w:tc>
-        <w:tc>
-          <w:tcPr>
-            <w:tcW w:type="dxa" w:w="3550"/>
-            <w:tcBorders>
-              <w:top w:val="none" w:color="FFFFFF" w:sz="0"/>
-              <w:left w:val="none" w:color="FFFFFF" w:sz="0"/>
-              <w:bottom w:val="none" w:color="FFFFFF" w:sz="0"/>
-              <w:right w:val="none" w:color="FFFFFF" w:sz="0"/>
-            </w:tcBorders>
-            <w:tcMar>
-              <w:top w:type="dxa" w:w="0"/>
-              <w:left w:type="dxa" w:w="0"/>
-              <w:bottom w:type="dxa" w:w="0"/>
-              <w:right w:type="dxa" w:w="0"/>
-            </w:tcMar>
-            <w:vAlign w:val="top"/>
-          </w:tcPr>
-          <w:p>
-            <w:pPr>
-              <w:spacing w:after="30" w:before="20" w:line="228" w:lineRule="auto"/>
+              <w:t xml:space="preserve">Real bond: 10Y UF (Central Bank of Chile) and NTN-B 2035 (8.08%) at 30-Jun-26. Spread = cap rate (1 / EV/EBITDA) − real bond. IRSA omitted (IAS 29). Source: Bloomberg; Central Bank of Chile; Team analysis.</w:t>
+            </w:r>
+          </w:p>
+          <w:p>
+            <w:pPr>
+              <w:spacing w:after="30" w:before="90" w:line="228" w:lineRule="auto"/>
             </w:pPr>
             <w:r>
               <w:rPr>
@@ -1228,7 +1063,7 @@
                 <w:sz w:val="14"/>
                 <w:szCs w:val="14"/>
               </w:rPr>
-              <w:t xml:space="preserve">The market pays 6.0%; our cash flows are worth 10.1%</w:t>
+              <w:t xml:space="preserve">Value implied by each peer's multiple vs DCF and price (CLP per share)</w:t>
             </w:r>
           </w:p>
           <w:p>
@@ -1238,7 +1073,7 @@
             <w:r>
               <w:drawing>
                 <wp:inline distT="0" distB="0" distL="0" distR="0">
-                  <wp:extent cx="2257425" cy="1600200"/>
+                  <wp:extent cx="2257425" cy="1781175"/>
                   <wp:effectExtent t="0" r="0" b="0" l="0"/>
                   <wp:docPr id="1" name="" descr="" title=""/>
                   <wp:cNvGraphicFramePr>
@@ -1263,7 +1098,7 @@
                         <pic:spPr bwMode="auto">
                           <a:xfrm>
                             <a:off x="0" y="0"/>
-                            <a:ext cx="2257425" cy="1600200"/>
+                            <a:ext cx="2257425" cy="1781175"/>
                           </a:xfrm>
                           <a:prstGeom prst="rect">
                             <a:avLst/>
@@ -1287,7 +1122,7 @@
                 <w:sz w:val="11"/>
                 <w:szCs w:val="11"/>
               </w:rPr>
-              <w:t xml:space="preserve">Gran Plaza: subsequent event, not in the model. Source: Mallplaza; Bloomberg; DF; Team analysis.</w:t>
+              <w:t xml:space="preserve">Target = 80% DCF + 20% EV/EBITDA LTM. P/E excluded (includes revaluation). Source: Bloomberg (30-Sep-26); Team analysis.</w:t>
             </w:r>
           </w:p>
           <w:p>
@@ -1312,7 +1147,7 @@
                 <w:sz w:val="14"/>
                 <w:szCs w:val="14"/>
               </w:rPr>
-              <w:t xml:space="preserve">The price requires a WACC 285 bp lower</w:t>
+              <w:t xml:space="preserve">The market pays 6.0%; our cash flows are worth 10.1%</w:t>
             </w:r>
           </w:p>
           <w:p>
@@ -1322,7 +1157,7 @@
             <w:r>
               <w:drawing>
                 <wp:inline distT="0" distB="0" distL="0" distR="0">
-                  <wp:extent cx="2257425" cy="1781175"/>
+                  <wp:extent cx="2257425" cy="1466850"/>
                   <wp:effectExtent t="0" r="0" b="0" l="0"/>
                   <wp:docPr id="1" name="" descr="" title=""/>
                   <wp:cNvGraphicFramePr>
@@ -1347,7 +1182,91 @@
                         <pic:spPr bwMode="auto">
                           <a:xfrm>
                             <a:off x="0" y="0"/>
-                            <a:ext cx="2257425" cy="1781175"/>
+                            <a:ext cx="2257425" cy="1466850"/>
+                          </a:xfrm>
+                          <a:prstGeom prst="rect">
+                            <a:avLst/>
+                          </a:prstGeom>
+                        </pic:spPr>
+                      </pic:pic>
+                    </a:graphicData>
+                  </a:graphic>
+                </wp:inline>
+              </w:drawing>
+            </w:r>
+          </w:p>
+          <w:p>
+            <w:pPr>
+              <w:spacing w:after="0" w:before="10" w:line="216" w:lineRule="auto"/>
+            </w:pPr>
+            <w:r>
+              <w:rPr>
+                <w:rFonts w:ascii="Arial" w:cs="Arial" w:eastAsia="Arial" w:hAnsi="Arial"/>
+                <w:color w:val="5F5F5F"/>
+                <w:sz w:val="11"/>
+                <w:szCs w:val="11"/>
+              </w:rPr>
+              <w:t xml:space="preserve">Gran Plaza: subsequent event, not in the model. Source: Mallplaza; Bloomberg; DF; Team analysis.</w:t>
+            </w:r>
+          </w:p>
+          <w:p>
+            <w:pPr>
+              <w:spacing w:after="30" w:before="90" w:line="228" w:lineRule="auto"/>
+            </w:pPr>
+            <w:r>
+              <w:rPr>
+                <w:rFonts w:ascii="Arial" w:cs="Arial" w:eastAsia="Arial" w:hAnsi="Arial"/>
+                <w:b/>
+                <w:bCs/>
+                <w:color w:val="14284B"/>
+                <w:sz w:val="14"/>
+                <w:szCs w:val="14"/>
+              </w:rPr>
+              <w:t xml:space="preserve">Figure 34: </w:t>
+            </w:r>
+            <w:r>
+              <w:rPr>
+                <w:rFonts w:ascii="Arial" w:cs="Arial" w:eastAsia="Arial" w:hAnsi="Arial"/>
+                <w:color w:val="14284B"/>
+                <w:sz w:val="14"/>
+                <w:szCs w:val="14"/>
+              </w:rPr>
+              <w:t xml:space="preserve">The price requires a WACC 285 bp lower</w:t>
+            </w:r>
+          </w:p>
+          <w:p>
+            <w:pPr>
+              <w:spacing w:after="20" w:before="0" w:line="240" w:lineRule="auto"/>
+            </w:pPr>
+            <w:r>
+              <w:drawing>
+                <wp:inline distT="0" distB="0" distL="0" distR="0">
+                  <wp:extent cx="2257425" cy="1600200"/>
+                  <wp:effectExtent t="0" r="0" b="0" l="0"/>
+                  <wp:docPr id="1" name="" descr="" title=""/>
+                  <wp:cNvGraphicFramePr>
+                    <a:graphicFrameLocks xmlns:a="http://schemas.openxmlformats.org/drawingml/2006/main" noChangeAspect="1"/>
+                  </wp:cNvGraphicFramePr>
+                  <a:graphic xmlns:a="http://schemas.openxmlformats.org/drawingml/2006/main">
+                    <a:graphicData uri="http://schemas.openxmlformats.org/drawingml/2006/picture">
+                      <pic:pic xmlns:pic="http://schemas.openxmlformats.org/drawingml/2006/picture">
+                        <pic:nvPicPr>
+                          <pic:cNvPr id="0" name="" descr=""/>
+                          <pic:cNvPicPr>
+                            <a:picLocks noChangeAspect="1" noChangeArrowheads="1"/>
+                          </pic:cNvPicPr>
+                        </pic:nvPicPr>
+                        <pic:blipFill>
+                          <a:blip r:embed="rId18" cstate="none"/>
+                          <a:srcRect/>
+                          <a:stretch>
+                            <a:fillRect/>
+                          </a:stretch>
+                        </pic:blipFill>
+                        <pic:spPr bwMode="auto">
+                          <a:xfrm>
+                            <a:off x="0" y="0"/>
+                            <a:ext cx="2257425" cy="1600200"/>
                           </a:xfrm>
                           <a:prstGeom prst="rect">
                             <a:avLst/>
@@ -8790,7 +8709,7 @@
                           </pic:cNvPicPr>
                         </pic:nvPicPr>
                         <pic:blipFill>
-                          <a:blip r:embed="rId18" cstate="none"/>
+                          <a:blip r:embed="rId19" cstate="none"/>
                           <a:srcRect/>
                           <a:stretch>
                             <a:fillRect/>

</xml_diff>